<commit_message>
Auto-deploy: 2026-09-27 03:40:12 - VISORD & NEXORD Web sync
</commit_message>
<xml_diff>
--- a/assets/MANIFIESTO_CIENTIFICO_NEXORD_ZENODO_2026.docx
+++ b/assets/MANIFIESTO_CIENTIFICO_NEXORD_ZENODO_2026.docx
@@ -69,7 +69,7 @@
         <w:rPr>
           <w:shd w:fill="FFFFFF" w:val="clear"/>
         </w:rPr>
-        <w:t>SOCIOMETRÍA ORDINAL COMPUTACIONAL Y DIAGNÓSTICO DE LA DINÁMICA GRUPAL (PLATAFORMA NEXORD)</w:t>
+        <w:t>SOCIOMETRÍA ORDINAL COMPUTACIONAL Y DIAGNÓSTICO SOCIO-TERMODINÁMICO (PLATAFORMA NEXORD)</w:t>
       </w:r>
     </w:p>
     <w:p>
@@ -85,20 +85,50 @@
         <w:rPr>
           <w:shd w:fill="FFFFFF" w:val="clear"/>
         </w:rPr>
-        <w:t>Manifiesto Científico, Fundamentación Teórico-Metodológica y Guía de Gobernanza en Ciencia Abierta</w:t>
+        <w:t>Manifiesto Científico, Fundamentación Teórico-Metodológica y Propuesta de Gobernanza en Ciencia Abierta</w:t>
       </w:r>
     </w:p>
     <w:p>
       <w:pPr>
         <w:pStyle w:val="Heading3"/>
         <w:bidi w:val="0"/>
-        <w:jc w:val="start"/>
-        <w:rPr>
-          <w:shd w:fill="FFFFFF" w:val="clear"/>
-        </w:rPr>
-      </w:pPr>
-      <w:r>
-        <w:rPr>
+        <w:spacing w:before="90" w:after="60"/>
+        <w:ind w:hanging="0" w:start="0" w:end="0"/>
+        <w:jc w:val="center"/>
+        <w:rPr/>
+      </w:pPr>
+      <w:r>
+        <w:rPr>
+          <w:rStyle w:val="Emphasis"/>
+          <w:b/>
+          <w:i/>
+          <w:color w:val="4A5568"/>
+          <w:shd w:fill="FFFFFF" w:val="clear"/>
+        </w:rPr>
+        <w:t>«Hacia una Física de lo Grupal_JMC»</w:t>
+      </w:r>
+    </w:p>
+    <w:p>
+      <w:pPr>
+        <w:pStyle w:val="Heading4"/>
+        <w:bidi w:val="0"/>
+        <w:spacing w:before="60" w:after="330"/>
+        <w:ind w:hanging="0" w:start="0" w:end="0"/>
+        <w:jc w:val="center"/>
+        <w:rPr>
+          <w:rFonts w:ascii="Inter;sans-serif" w:hAnsi="Inter;sans-serif"/>
+          <w:b/>
+          <w:color w:val="2B6CB0"/>
+          <w:sz w:val="20"/>
+          <w:shd w:fill="FFFFFF" w:val="clear"/>
+        </w:rPr>
+      </w:pPr>
+      <w:r>
+        <w:rPr>
+          <w:rFonts w:ascii="Inter;sans-serif" w:hAnsi="Inter;sans-serif"/>
+          <w:b/>
+          <w:color w:val="2B6CB0"/>
+          <w:sz w:val="20"/>
           <w:shd w:fill="FFFFFF" w:val="clear"/>
         </w:rPr>
         <w:t>Edición Canónica Homologada v8.0 (2026)</w:t>
@@ -161,7 +191,7 @@
         <w:rPr>
           <w:shd w:fill="FFFFFF" w:val="clear"/>
         </w:rPr>
-        <w:t xml:space="preserve"> Creador de la Plataforma NEXORD y Promotor del Banco Sociométrico (BSOC)</w:t>
+        <w:t xml:space="preserve"> Creador de la Plataforma NEXORD y Promotor Científico de la iniciativa del Banco Sociométrico (BSOC)</w:t>
       </w:r>
     </w:p>
     <w:p>
@@ -262,13 +292,13 @@
           <w:rStyle w:val="Strong"/>
           <w:shd w:fill="FFFFFF" w:val="clear"/>
         </w:rPr>
-        <w:t>Ecosistema:</w:t>
-      </w:r>
-      <w:r>
-        <w:rPr>
-          <w:shd w:fill="FFFFFF" w:val="clear"/>
-        </w:rPr>
-        <w:t xml:space="preserve"> VISORD (Visualizador Sociométrico Ordinal)</w:t>
+        <w:t>Ecosistema Maestro:</w:t>
+      </w:r>
+      <w:r>
+        <w:rPr>
+          <w:shd w:fill="FFFFFF" w:val="clear"/>
+        </w:rPr>
+        <w:t xml:space="preserve"> VISORD 3D/4D (Visualizador Sociométrico Ordinal)</w:t>
       </w:r>
     </w:p>
     <w:p>
@@ -282,7 +312,7 @@
           <w:rStyle w:val="Strong"/>
           <w:shd w:fill="FFFFFF" w:val="clear"/>
         </w:rPr>
-        <w:t>Idiomas de la Plataforma:</w:t>
+        <w:t>Idiomas Soportados por la Plataforma NEXORD:</w:t>
       </w:r>
       <w:r>
         <w:rPr>
@@ -10531,6 +10561,7 @@
     <w:lvl w:ilvl="3">
       <w:start w:val="1"/>
       <w:numFmt w:val="none"/>
+      <w:pStyle w:val="Heading4"/>
       <w:suff w:val="nothing"/>
       <w:lvlText w:val=""/>
       <w:lvlJc w:val="start"/>
@@ -10803,6 +10834,23 @@
       <w:szCs w:val="21"/>
     </w:rPr>
   </w:style>
+  <w:style w:type="paragraph" w:styleId="Heading4">
+    <w:name w:val="heading 4"/>
+    <w:basedOn w:val="Ttulo"/>
+    <w:next w:val="BodyText"/>
+    <w:qFormat/>
+    <w:pPr>
+      <w:spacing w:before="120" w:after="120"/>
+      <w:outlineLvl w:val="3"/>
+    </w:pPr>
+    <w:rPr>
+      <w:rFonts w:ascii="Liberation Serif" w:hAnsi="Liberation Serif" w:eastAsia="Songti SC" w:cs="Arial Unicode MS"/>
+      <w:b/>
+      <w:bCs/>
+      <w:sz w:val="24"/>
+      <w:szCs w:val="24"/>
+    </w:rPr>
+  </w:style>
   <w:style w:type="character" w:styleId="EndnoteReference">
     <w:name w:val="endnote reference"/>
     <w:rPr>
@@ -10841,20 +10889,20 @@
       <w:shd w:fill="EDF2F7" w:val="clear"/>
     </w:rPr>
   </w:style>
+  <w:style w:type="character" w:styleId="Emphasis">
+    <w:name w:val="Emphasis"/>
+    <w:qFormat/>
+    <w:rPr>
+      <w:i/>
+      <w:iCs/>
+    </w:rPr>
+  </w:style>
   <w:style w:type="character" w:styleId="Strong">
     <w:name w:val="Strong"/>
     <w:qFormat/>
     <w:rPr>
       <w:b/>
       <w:bCs/>
-    </w:rPr>
-  </w:style>
-  <w:style w:type="character" w:styleId="Emphasis">
-    <w:name w:val="Emphasis"/>
-    <w:qFormat/>
-    <w:rPr>
-      <w:i/>
-      <w:iCs/>
     </w:rPr>
   </w:style>
   <w:style w:type="character" w:styleId="Bolos">

</xml_diff>

<commit_message>
docs(manifiesto): sincronizar RESUMEN abreviado y limpio
</commit_message>
<xml_diff>
--- a/assets/MANIFIESTO_CIENTIFICO_NEXORD_ZENODO_2026.docx
+++ b/assets/MANIFIESTO_CIENTIFICO_NEXORD_ZENODO_2026.docx
@@ -476,7 +476,7 @@
         <w:rPr>
           <w:shd w:fill="FFFFFF" w:val="clear"/>
         </w:rPr>
-        <w:t>La Sociometría Ordinal Computacional es, en lo esencial, una extensión actualizada de las intuiciones de Jacob Levy Moreno, creador de la Sociometría, y de Kurt Lewin, de la Teoría del Campo, dos grandes de la Psicología Social. Históricamente, la investigación en Psicología de los grupos ha estado condicionada por las limitaciones metodológicas y técnicas propias de la época en las que surgieron. Este Manifiesto parte de:</w:t>
+        <w:t>La Sociometría Ordinal Computacional constituye una actualización formal de las intuiciones fundacionales de Jacob Levy Moreno (Sociometría) y Kurt Lewin (Teoría del Campo), superando mediante el cómputo contemporáneo las restricciones metodológicas de su época. Este Manifiesto articula el modelo a través de siete pilares:</w:t>
       </w:r>
     </w:p>
     <w:p>
@@ -496,7 +496,7 @@
         <w:rPr>
           <w:shd w:fill="FFFFFF" w:val="clear"/>
         </w:rPr>
-        <w:t xml:space="preserve"> La consideración del ‘vínculo relacional’, producto de la interacción humana, como núcleo que constituye la realidad existencial de los grupos. ‘Dar y Recibir’ son los pares de fuerza indisociables que mantienen el necesario intercambio dialéctico de afectos, ideas, intenciones, recursos y acciones para el logro de objetivos comunes. Del equilibrio homeostático permanente que se establece entre los intercambios interpersonales de aceptación y/o conflicto depende la salud personal y grupal, su bienestar, éxito y viabilidad, a corto y medio plazo.</w:t>
+        <w:t xml:space="preserve"> La consideración del vínculo relacional como núcleo constitutivo de la realidad existencial de los grupos. «Dar y Recibir» conforman los polos indisociables de un circuito interactivo continuo, donde la salud, el bienestar y la viabilidad del colectivo dependen del equilibrio homeostático entre los intercambios interpersonales de aceptación y conflicto.</w:t>
       </w:r>
     </w:p>
     <w:p>
@@ -516,49 +516,7 @@
         <w:rPr>
           <w:shd w:fill="FFFFFF" w:val="clear"/>
         </w:rPr>
-        <w:t xml:space="preserve"> La cuantificación más precisa del orden relacional preferencial, con la aplicación de la función inversa al rango (</w:t>
-      </w:r>
-      <w:r>
-        <w:rPr>
-          <w:rStyle w:val="Emphasis"/>
-          <w:shd w:fill="FFFFFF" w:val="clear"/>
-        </w:rPr>
-        <w:t>W</w:t>
-      </w:r>
-      <w:r>
-        <w:rPr>
-          <w:position w:val="-2"/>
-          <w:sz w:val="16"/>
-          <w:shd w:fill="FFFFFF" w:val="clear"/>
-        </w:rPr>
-        <w:t>ij</w:t>
-      </w:r>
-      <w:r>
-        <w:rPr>
-          <w:shd w:fill="FFFFFF" w:val="clear"/>
-        </w:rPr>
-        <w:t xml:space="preserve"> = 1 / </w:t>
-      </w:r>
-      <w:r>
-        <w:rPr>
-          <w:rStyle w:val="Emphasis"/>
-          <w:shd w:fill="FFFFFF" w:val="clear"/>
-        </w:rPr>
-        <w:t>r</w:t>
-      </w:r>
-      <w:r>
-        <w:rPr>
-          <w:position w:val="-2"/>
-          <w:sz w:val="16"/>
-          <w:shd w:fill="FFFFFF" w:val="clear"/>
-        </w:rPr>
-        <w:t>ijk</w:t>
-      </w:r>
-      <w:r>
-        <w:rPr>
-          <w:shd w:fill="FFFFFF" w:val="clear"/>
-        </w:rPr>
-        <w:t>) y los desarrollos teóricos, metodológicos y tecnológicos actuales están en la génesis de NEXORD, como plataforma general de investigación psicosocial sociométrica, con el propósito de intentar formalizar las intuiciones que Moreno y Lewin no pudieron desarrollar en su época.</w:t>
+        <w:t xml:space="preserve"> La cuantificación rigurosa del orden jerárquico de elección mediante la función inversa al rango, formalizando que la mente humana prioriza y elige de manera ordinal sin necesidad de imponer escalas cardinales artificiales.</w:t>
       </w:r>
     </w:p>
     <w:p>
@@ -578,112 +536,7 @@
         <w:rPr>
           <w:shd w:fill="FFFFFF" w:val="clear"/>
         </w:rPr>
-        <w:t xml:space="preserve"> La métrica continua, fruto de esta cuantificación, se articula formalmente, mediante álgebra matricial y tensorial, en el tetragrama de raíz moreniana (</w:t>
-      </w:r>
-      <w:r>
-        <w:rPr>
-          <w:rStyle w:val="Emphasis"/>
-          <w:shd w:fill="FFFFFF" w:val="clear"/>
-        </w:rPr>
-        <w:t>E</w:t>
-      </w:r>
-      <w:r>
-        <w:rPr>
-          <w:shd w:fill="FFFFFF" w:val="clear"/>
-        </w:rPr>
-        <w:t xml:space="preserve">, </w:t>
-      </w:r>
-      <w:r>
-        <w:rPr>
-          <w:rStyle w:val="Emphasis"/>
-          <w:shd w:fill="FFFFFF" w:val="clear"/>
-        </w:rPr>
-        <w:t>R</w:t>
-      </w:r>
-      <w:r>
-        <w:rPr>
-          <w:shd w:fill="FFFFFF" w:val="clear"/>
-        </w:rPr>
-        <w:t xml:space="preserve">, pE, pR; </w:t>
-      </w:r>
-      <w:r>
-        <w:rPr>
-          <w:rStyle w:val="Emphasis"/>
-          <w:shd w:fill="FFFFFF" w:val="clear"/>
-        </w:rPr>
-        <w:t>p</w:t>
-      </w:r>
-      <w:r>
-        <w:rPr>
-          <w:shd w:fill="FFFFFF" w:val="clear"/>
-        </w:rPr>
-        <w:t>: percepciones/expectativas), que definen 3</w:t>
-      </w:r>
-      <w:r>
-        <w:rPr>
-          <w:position w:val="6"/>
-          <w:sz w:val="16"/>
-          <w:shd w:fill="FFFFFF" w:val="clear"/>
-        </w:rPr>
-        <w:t>4</w:t>
-      </w:r>
-      <w:r>
-        <w:rPr>
-          <w:shd w:fill="FFFFFF" w:val="clear"/>
-        </w:rPr>
-        <w:t xml:space="preserve"> = 81 (Q81) figuras de relación diádica; a las que se han añadido dos metapercepciones triádicas (α </w:t>
-      </w:r>
-      <w:r>
-        <w:rPr>
-          <w:rStyle w:val="Emphasis"/>
-          <w:shd w:fill="FFFFFF" w:val="clear"/>
-        </w:rPr>
-        <w:t>E</w:t>
-      </w:r>
-      <w:r>
-        <w:rPr>
-          <w:shd w:fill="FFFFFF" w:val="clear"/>
-        </w:rPr>
-        <w:t xml:space="preserve">, ω </w:t>
-      </w:r>
-      <w:r>
-        <w:rPr>
-          <w:rStyle w:val="Emphasis"/>
-          <w:shd w:fill="FFFFFF" w:val="clear"/>
-        </w:rPr>
-        <w:t>E</w:t>
-      </w:r>
-      <w:r>
-        <w:rPr>
-          <w:shd w:fill="FFFFFF" w:val="clear"/>
-        </w:rPr>
-        <w:t>) sobre la idea que se hace el emisor de las preferencias que realmente expresarán su primer elegido y la persona más rechazada. Estos datos transforman las micro-interacciones (</w:t>
-      </w:r>
-      <w:r>
-        <w:rPr>
-          <w:rStyle w:val="Emphasis"/>
-          <w:shd w:fill="FFFFFF" w:val="clear"/>
-        </w:rPr>
-        <w:t>N</w:t>
-      </w:r>
-      <w:r>
-        <w:rPr>
-          <w:shd w:fill="FFFFFF" w:val="clear"/>
-        </w:rPr>
-        <w:t xml:space="preserve"> × </w:t>
-      </w:r>
-      <w:r>
-        <w:rPr>
-          <w:rStyle w:val="Emphasis"/>
-          <w:shd w:fill="FFFFFF" w:val="clear"/>
-        </w:rPr>
-        <w:t>N</w:t>
-      </w:r>
-      <w:r>
-        <w:rPr>
-          <w:shd w:fill="FFFFFF" w:val="clear"/>
-        </w:rPr>
-        <w:t>) en topologías computables.</w:t>
+        <w:t xml:space="preserve"> La métrica continua, fruto de esta cuantificación del orden preferencial, articulada formalmente en el álgebra del tetragrama relacional y en metapercepciones de reciprocidad, transformando las micro-interacciones interpersonales en una topología plenamente computable.</w:t>
       </w:r>
     </w:p>
     <w:p>
@@ -703,7 +556,7 @@
         <w:rPr>
           <w:shd w:fill="FFFFFF" w:val="clear"/>
         </w:rPr>
-        <w:t xml:space="preserve"> La articulación en 4 densidades elementales (pDA, DA, RC, pRC) y su expansión combinatoria en 14 densidades derivadas (espacio 18D) cuantifican con precisión la masa y el flujo de los intercambios entre los componentes del grupo. Este gradiente permite modelar el conjunto como un sistema socio-termodinámico regido por estados de equilibrio y fricción relacional (Φ), donde la discrepancia dialéctica actúa como condición necesaria de salud y adaptabilidad frente a la entropía del pensamiento grupal (</w:t>
+        <w:t xml:space="preserve"> El modelado socio-termodinámico del colectivo a través de gradientes de densidad y fricción relacional (Φ), donde la discrepancia dialéctica moderada y la plasticidad interna actúan como condiciones necesarias para el aprendizaje y la adaptación frente a la entropía del pensamiento grupal (</w:t>
       </w:r>
       <w:r>
         <w:rPr>
@@ -736,75 +589,7 @@
         <w:rPr>
           <w:shd w:fill="FFFFFF" w:val="clear"/>
         </w:rPr>
-        <w:t xml:space="preserve"> La proyección simultánea en espacios factoriales duales de los actores (como emisores de preferencias al grupo y a la vez receptores de las preferencias grupales) que emergen, no como puntos estáticos, sino como dipolos cinemáticos (DA ⇔ RECIBE) cuyos centroides equilibran analíticamente la emisión y la recepción. Esta formulación revela la dominancia gravitatoria de los ejes principales (</w:t>
-      </w:r>
-      <w:r>
-        <w:rPr>
-          <w:rStyle w:val="Emphasis"/>
-          <w:shd w:fill="FFFFFF" w:val="clear"/>
-        </w:rPr>
-        <w:t>F</w:t>
-      </w:r>
-      <w:r>
-        <w:rPr>
-          <w:position w:val="-2"/>
-          <w:sz w:val="16"/>
-          <w:shd w:fill="FFFFFF" w:val="clear"/>
-        </w:rPr>
-        <w:t>1</w:t>
-      </w:r>
-      <w:r>
-        <w:rPr>
-          <w:shd w:fill="FFFFFF" w:val="clear"/>
-        </w:rPr>
-        <w:t xml:space="preserve"> y </w:t>
-      </w:r>
-      <w:r>
-        <w:rPr>
-          <w:rStyle w:val="Emphasis"/>
-          <w:shd w:fill="FFFFFF" w:val="clear"/>
-        </w:rPr>
-        <w:t>F</w:t>
-      </w:r>
-      <w:r>
-        <w:rPr>
-          <w:position w:val="-2"/>
-          <w:sz w:val="16"/>
-          <w:shd w:fill="FFFFFF" w:val="clear"/>
-        </w:rPr>
-        <w:t>2</w:t>
-      </w:r>
-      <w:r>
-        <w:rPr>
-          <w:shd w:fill="FFFFFF" w:val="clear"/>
-        </w:rPr>
-        <w:t>) y permite la comparación geométrica de estructuras grupales en las variedades de Grassmann Gr(</w:t>
-      </w:r>
-      <w:r>
-        <w:rPr>
-          <w:rStyle w:val="Emphasis"/>
-          <w:shd w:fill="FFFFFF" w:val="clear"/>
-        </w:rPr>
-        <w:t>k</w:t>
-      </w:r>
-      <w:r>
-        <w:rPr>
-          <w:shd w:fill="FFFFFF" w:val="clear"/>
-        </w:rPr>
-        <w:t xml:space="preserve">, </w:t>
-      </w:r>
-      <w:r>
-        <w:rPr>
-          <w:rStyle w:val="Emphasis"/>
-          <w:shd w:fill="FFFFFF" w:val="clear"/>
-        </w:rPr>
-        <w:t>N</w:t>
-      </w:r>
-      <w:r>
-        <w:rPr>
-          <w:shd w:fill="FFFFFF" w:val="clear"/>
-        </w:rPr>
-        <w:t>).</w:t>
+        <w:t xml:space="preserve"> La proyección simultánea en planos factoriales duales, donde los actores se representan a la vez como emisores y receptores de preferencias en equilibrio baricéntrico, permitiendo la comparación geométrica de estructuras grupales mediante variedades topológicas.</w:t>
       </w:r>
     </w:p>
     <w:p>
@@ -824,7 +609,7 @@
         <w:rPr>
           <w:shd w:fill="FFFFFF" w:val="clear"/>
         </w:rPr>
-        <w:t xml:space="preserve"> La versatilidad del diseño multidimensional (G × T × C), permite realizar comparaciones simultáneas intra/inter grupales: transversales, longitudinales y de criterio de preferencia. Esta arquitectura matemática de relaciones abstractas se hace más comprensible, para los no expertos, con los módulos de visualización interactiva VISORD, que facilitan la monitorización y seguimiento de los resultados.</w:t>
+        <w:t xml:space="preserve"> La versatilidad del diseño multidimensional (G × T × C), que integra análisis transversales, longitudinales y de criterios plurales de tarea y afecto, complementado con las herramientas de visualización interactiva de la plataforma VISORD.</w:t>
       </w:r>
     </w:p>
     <w:p>
@@ -844,20 +629,20 @@
         <w:rPr>
           <w:shd w:fill="FFFFFF" w:val="clear"/>
         </w:rPr>
-        <w:t xml:space="preserve"> En su aplicación a estudios de campo con personas reales, NEXORD garantiza un uso exclusivamente formativo, no punitivo, de los datos. Esta exigencia salvaguarda la privacidad por diseño (</w:t>
-      </w:r>
-      <w:r>
-        <w:rPr>
-          <w:rStyle w:val="Emphasis"/>
-          <w:shd w:fill="FFFFFF" w:val="clear"/>
-        </w:rPr>
-        <w:t>Privacy by Design</w:t>
-      </w:r>
-      <w:r>
-        <w:rPr>
-          <w:shd w:fill="FFFFFF" w:val="clear"/>
-        </w:rPr>
-        <w:t>) y exige la acreditación profesional e institucional así como el compromiso explícito del Investigador Principal (IP) conforme a los principios de la Ciencia Abierta, de no dañar jamás con sus informes la autoestima personal ni la reputación social de los participantes, dando por características intrínsecas de la personalidad individual lo que son fenómenos termodinámicos estrictamente grupales.</w:t>
+        <w:t xml:space="preserve"> El compromiso de gobernanza bajo principios de Ética por Diseño (</w:t>
+      </w:r>
+      <w:r>
+        <w:rPr>
+          <w:rStyle w:val="Emphasis"/>
+          <w:shd w:fill="FFFFFF" w:val="clear"/>
+        </w:rPr>
+        <w:t>Ethics by Design</w:t>
+      </w:r>
+      <w:r>
+        <w:rPr>
+          <w:shd w:fill="FFFFFF" w:val="clear"/>
+        </w:rPr>
+        <w:t>) y Ciencia Abierta, garantizando un uso exclusivamente formativo y no punitivo de los datos, orientado a proteger la dignidad de los participantes y a preservar el patrimonio empírico mediante el Banco Sociométrico (BSOC).</w:t>
       </w:r>
     </w:p>
     <w:p>

</xml_diff>

<commit_message>
docs(manifesto): sincronizar versión v9.0 con concordancia estricta de figuras (1-9) y tablas
</commit_message>
<xml_diff>
--- a/assets/MANIFIESTO_CIENTIFICO_NEXORD_ZENODO_2026.docx
+++ b/assets/MANIFIESTO_CIENTIFICO_NEXORD_ZENODO_2026.docx
@@ -2625,7 +2625,7 @@
         <w:rPr>
           <w:shd w:fill="FFFFFF" w:val="clear"/>
         </w:rPr>
-        <w:t>Esta invariancia algebraica constituye el fundamento que hace posible la transposición bidireccional y exacta entre la sociomatriz clásica de Moreno y la sociomatriz ORBIT, así como la posterior derivación de los tetragramas relacionales (Figuras 3–5):</w:t>
+        <w:t>Esta invariancia algebraica constituye el fundamento que hace posible la transposición bidireccional y exacta entre la sociomatriz clásica de Moreno y la sociomatriz ORBIT, así como la posterior derivación de los tetragramas relacionales:</w:t>
       </w:r>
     </w:p>
     <w:p>
@@ -2649,13 +2649,13 @@
           <w:rStyle w:val="Strong"/>
           <w:shd w:fill="FFFFFF" w:val="clear"/>
         </w:rPr>
-        <w:t>Figura 3.</w:t>
-      </w:r>
-      <w:r>
-        <w:rPr>
-          <w:shd w:fill="FFFFFF" w:val="clear"/>
-        </w:rPr>
-        <w:t xml:space="preserve"> Sociomatriz clásica de Moreno (</w:t>
+        <w:t>Matriz clásica de Moreno:</w:t>
+      </w:r>
+      <w:r>
+        <w:rPr>
+          <w:shd w:fill="FFFFFF" w:val="clear"/>
+        </w:rPr>
+        <w:t xml:space="preserve"> Sociomatriz (</w:t>
       </w:r>
       <w:r>
         <w:rPr>
@@ -2681,7 +2681,7 @@
         <w:rPr>
           <w:shd w:fill="FFFFFF" w:val="clear"/>
         </w:rPr>
-        <w:t xml:space="preserve">, pE, pR) en formato Excel para </w:t>
+        <w:t xml:space="preserve">, pE, pR) en formato de entrada para </w:t>
       </w:r>
       <w:r>
         <w:rPr>
@@ -2796,13 +2796,13 @@
           <w:rStyle w:val="Strong"/>
           <w:shd w:fill="FFFFFF" w:val="clear"/>
         </w:rPr>
-        <w:t>Figura 4.</w:t>
-      </w:r>
-      <w:r>
-        <w:rPr>
-          <w:shd w:fill="FFFFFF" w:val="clear"/>
-        </w:rPr>
-        <w:t xml:space="preserve"> Sociomatriz ORBIT A(</w:t>
+        <w:t>Sociomatriz ORBIT:</w:t>
+      </w:r>
+      <w:r>
+        <w:rPr>
+          <w:shd w:fill="FFFFFF" w:val="clear"/>
+        </w:rPr>
+        <w:t xml:space="preserve"> Formato A(</w:t>
       </w:r>
       <w:r>
         <w:rPr>
@@ -2942,7 +2942,7 @@
           <w:rStyle w:val="Strong"/>
           <w:shd w:fill="FFFFFF" w:val="clear"/>
         </w:rPr>
-        <w:t>Figura 5.</w:t>
+        <w:t>Matrices SMI:</w:t>
       </w:r>
       <w:r>
         <w:rPr>
@@ -4843,7 +4843,7 @@
           <w:sz w:val="20"/>
           <w:shd w:fill="FFFFFF" w:val="clear"/>
         </w:rPr>
-        <w:t>Tabla 1: Sintaxis — los 12 símbolos del alfabeto relacional NEXORD</w:t>
+        <w:t>Tabla 1. Sintaxis — los 12 símbolos del alfabeto relacional NEXORD</w:t>
       </w:r>
     </w:p>
     <w:tbl>
@@ -6774,7 +6774,7 @@
           <w:sz w:val="20"/>
           <w:shd w:fill="FFFFFF" w:val="clear"/>
         </w:rPr>
-        <w:t>Tabla 3. Retícula Q81 (9 × 9): clasificación de las 81 figuras relacionales diádicas posibles, indexadas por antidiagonales de valencia creciente (1 = [Rr] … 41 = i¿?! … 81 = &lt;Ee&gt;).</w:t>
+        <w:t>Tabla 3a. Retícula Q81 (9 × 9): clasificación de las 81 figuras relacionales diádicas posibles, indexadas por antidiagonales de valencia creciente (1 = [Rr] … 41 = i¿?! … 81 = &lt;Ee&gt;).</w:t>
       </w:r>
     </w:p>
     <w:p>
@@ -14865,7 +14865,7 @@
           <w:sz w:val="20"/>
           <w:shd w:fill="FFFFFF" w:val="clear"/>
         </w:rPr>
-        <w:t>4.4.2. Los 3 Prismas Duales y el Pentagrama 10D (Figuras 8b y 8)</w:t>
+        <w:t>4.4.2. Los 3 Prismas Duales y el Pentagrama 10D (Figuras 3 y 4)</w:t>
       </w:r>
     </w:p>
     <w:p>
@@ -14975,7 +14975,7 @@
         <w:rPr>
           <w:shd w:fill="FFFFFF" w:val="clear"/>
         </w:rPr>
-        <w:t xml:space="preserve"> (Figura 8b): el </w:t>
+        <w:t xml:space="preserve"> (Figura 3): el </w:t>
       </w:r>
       <w:r>
         <w:rPr>
@@ -15033,7 +15033,7 @@
           <wp:inline distT="0" distB="0" distL="0" distR="0">
             <wp:extent cx="720090" cy="29718000"/>
             <wp:effectExtent l="0" t="0" r="0" b="0"/>
-            <wp:docPr id="3" name="Imagen3" title="Figura 8b: Arquitectura Canónica del Espacio Relacional 18D y los 3 Prismas Duales"/>
+            <wp:docPr id="3" name="Imagen3" title="Figura 3: Arquitectura Canónica del Espacio Relacional 18D y los 3 Prismas Duales"/>
             <wp:cNvGraphicFramePr>
               <a:graphicFrameLocks xmlns:a="http://schemas.openxmlformats.org/drawingml/2006/main" noChangeAspect="1"/>
             </wp:cNvGraphicFramePr>
@@ -15041,7 +15041,7 @@
               <a:graphicData uri="http://schemas.openxmlformats.org/drawingml/2006/picture">
                 <pic:pic xmlns:pic="http://schemas.openxmlformats.org/drawingml/2006/picture">
                   <pic:nvPicPr>
-                    <pic:cNvPr id="3" name="Imagen3" title="Figura 8b: Arquitectura Canónica del Espacio Relacional 18D y los 3 Prismas Duales"/>
+                    <pic:cNvPr id="3" name="Imagen3" title="Figura 3: Arquitectura Canónica del Espacio Relacional 18D y los 3 Prismas Duales"/>
                     <pic:cNvPicPr>
                       <a:picLocks noChangeAspect="1" noChangeArrowheads="1"/>
                     </pic:cNvPicPr>
@@ -15072,7 +15072,7 @@
         <w:rPr>
           <w:shd w:fill="FFFFFF" w:val="clear"/>
         </w:rPr>
-        <w:t xml:space="preserve">Figura 8b. Arquitectura Canónica del Espacio Relacional 18D y los 3 Prismas Duales: Estructuración del tetragrama en 4 densidades elementales (D1–D4), saldos globales invariantes (SDR, BDR) y descomposición en los tres ejes fundamentales: Operativo (10D), Ontológico (14D) y Dialéctico (18D). </w:t>
+        <w:t xml:space="preserve">Figura 3. Arquitectura Canónica del Espacio Relacional 18D y los 3 Prismas Duales: Estructuración del tetragrama en 4 densidades elementales (D1–D4), saldos globales invariantes (SDR, BDR) y descomposición en los tres ejes fundamentales: Operativo (10D), Ontológico (14D) y Dialéctico (18D). </w:t>
       </w:r>
     </w:p>
     <w:p>
@@ -15098,7 +15098,7 @@
         <w:rPr>
           <w:shd w:fill="FFFFFF" w:val="clear"/>
         </w:rPr>
-        <w:t xml:space="preserve"> (Figura 8) articula las diez densidades canónicas desacoplando la emisión activa (SDA, BDA) del estatus receptivo (SRC, BRC), culminando en los invariantes globales SDR y BDR. La discrepancia analítica entre la energía total movilizada y el flujo neto resultante define formalmente la </w:t>
+        <w:t xml:space="preserve"> (Figura 4) articula las diez densidades canónicas desacoplando la emisión activa (SDA, BDA) del estatus receptivo (SRC, BRC), culminando en los invariantes globales SDR y BDR. La discrepancia analítica entre la energía total movilizada y el flujo neto resultante define formalmente la </w:t>
       </w:r>
       <w:r>
         <w:rPr>
@@ -15130,7 +15130,7 @@
           <wp:inline distT="0" distB="0" distL="0" distR="0">
             <wp:extent cx="720090" cy="30003750"/>
             <wp:effectExtent l="0" t="0" r="0" b="0"/>
-            <wp:docPr id="4" name="Imagen4" title="Figura 8: Pentagrama Socio-Termodinámico (10D)"/>
+            <wp:docPr id="4" name="Imagen4" title="Figura 4: Pentagrama Socio-Termodinámico (10D)"/>
             <wp:cNvGraphicFramePr>
               <a:graphicFrameLocks xmlns:a="http://schemas.openxmlformats.org/drawingml/2006/main" noChangeAspect="1"/>
             </wp:cNvGraphicFramePr>
@@ -15138,7 +15138,7 @@
               <a:graphicData uri="http://schemas.openxmlformats.org/drawingml/2006/picture">
                 <pic:pic xmlns:pic="http://schemas.openxmlformats.org/drawingml/2006/picture">
                   <pic:nvPicPr>
-                    <pic:cNvPr id="4" name="Imagen4" title="Figura 8: Pentagrama Socio-Termodinámico (10D)"/>
+                    <pic:cNvPr id="4" name="Imagen4" title="Figura 4: Pentagrama Socio-Termodinámico (10D)"/>
                     <pic:cNvPicPr>
                       <a:picLocks noChangeAspect="1" noChangeArrowheads="1"/>
                     </pic:cNvPicPr>
@@ -15169,7 +15169,7 @@
         <w:rPr>
           <w:shd w:fill="FFFFFF" w:val="clear"/>
         </w:rPr>
-        <w:t xml:space="preserve">Figura 8. Pentagrama Socio-Termodinámico con las 10 densidades canónicas: desacoplamiento emisión/recepción y transición al continuo termodinámico; la brecha I_desgaste = BDR − SDR cuantifica la energía disipada en fricción. </w:t>
+        <w:t xml:space="preserve">Figura 4. Pentagrama Socio-Termodinámico con las 10 densidades canónicas: desacoplamiento emisión/recepción y transición al continuo termodinámico; la brecha I_desgaste = BDR − SDR cuantifica la energía disipada en fricción. </w:t>
       </w:r>
     </w:p>
     <w:p>
@@ -15580,39 +15580,99 @@
           <w:rStyle w:val="Strong"/>
           <w:shd w:fill="FFFFFF" w:val="clear"/>
         </w:rPr>
-        <w:t>Sociogramas Continuos Tridimensionales (VISORD 3D/4D):</w:t>
-      </w:r>
-      <w:r>
-        <w:rPr>
-          <w:shd w:fill="FFFFFF" w:val="clear"/>
-        </w:rPr>
-        <w:t xml:space="preserve"> Visualización en el espacio continuo de cuencas de atracción (</w:t>
-      </w:r>
-      <w:r>
-        <w:rPr>
-          <w:rStyle w:val="Textooriginal"/>
-          <w:shd w:fill="FFFFFF" w:val="clear"/>
-        </w:rPr>
-        <w:t>&lt;Ee&gt;</w:t>
-      </w:r>
-      <w:r>
-        <w:rPr>
-          <w:shd w:fill="FFFFFF" w:val="clear"/>
-        </w:rPr>
-        <w:t>), zonas intermedias de oposición y filamentos de ruptura o fricción (</w:t>
-      </w:r>
-      <w:r>
-        <w:rPr>
-          <w:rStyle w:val="Textooriginal"/>
-          <w:shd w:fill="FFFFFF" w:val="clear"/>
-        </w:rPr>
-        <w:t>[Rr]</w:t>
-      </w:r>
-      <w:r>
-        <w:rPr>
-          <w:shd w:fill="FFFFFF" w:val="clear"/>
-        </w:rPr>
-        <w:t xml:space="preserve">), con navegación temporal diacrónica (Figura 11). </w:t>
+        <w:t xml:space="preserve">Planos Factoriales Duales Paralelos (Biplot MESO </w:t>
+      </w:r>
+      <w:r>
+        <w:rPr>
+          <w:rStyle w:val="Emphasis"/>
+          <w:shd w:fill="FFFFFF" w:val="clear"/>
+        </w:rPr>
+        <w:t>F</w:t>
+      </w:r>
+      <w:r>
+        <w:rPr>
+          <w:rStyle w:val="Strong"/>
+          <w:position w:val="-2"/>
+          <w:sz w:val="16"/>
+          <w:shd w:fill="FFFFFF" w:val="clear"/>
+        </w:rPr>
+        <w:t>1</w:t>
+      </w:r>
+      <w:r>
+        <w:rPr>
+          <w:rStyle w:val="Strong"/>
+          <w:shd w:fill="FFFFFF" w:val="clear"/>
+        </w:rPr>
+        <w:t xml:space="preserve"> × </w:t>
+      </w:r>
+      <w:r>
+        <w:rPr>
+          <w:rStyle w:val="Emphasis"/>
+          <w:shd w:fill="FFFFFF" w:val="clear"/>
+        </w:rPr>
+        <w:t>F</w:t>
+      </w:r>
+      <w:r>
+        <w:rPr>
+          <w:rStyle w:val="Strong"/>
+          <w:position w:val="-2"/>
+          <w:sz w:val="16"/>
+          <w:shd w:fill="FFFFFF" w:val="clear"/>
+        </w:rPr>
+        <w:t>2</w:t>
+      </w:r>
+      <w:r>
+        <w:rPr>
+          <w:rStyle w:val="Strong"/>
+          <w:shd w:fill="FFFFFF" w:val="clear"/>
+        </w:rPr>
+        <w:t>, espacio dual AFC ∥ PCA):</w:t>
+      </w:r>
+      <w:r>
+        <w:rPr>
+          <w:shd w:fill="FFFFFF" w:val="clear"/>
+        </w:rPr>
+        <w:t xml:space="preserve"> Proyección simultánea donde el vector diádico DA → RC vertebra la posición de cada sujeto con baricentro en el origen (Δ = 0.000). En el AFC, sobre la tabla de contingencia de recuentos enteros \mathbb{</w:t>
+      </w:r>
+      <w:r>
+        <w:rPr>
+          <w:rStyle w:val="Emphasis"/>
+          <w:shd w:fill="FFFFFF" w:val="clear"/>
+        </w:rPr>
+        <w:t>N</w:t>
+      </w:r>
+      <w:r>
+        <w:rPr>
+          <w:shd w:fill="FFFFFF" w:val="clear"/>
+        </w:rPr>
+        <w:t>}_0 bajo la métrica \chi</w:t>
+      </w:r>
+      <w:r>
+        <w:rPr>
+          <w:position w:val="6"/>
+          <w:sz w:val="16"/>
+          <w:shd w:fill="FFFFFF" w:val="clear"/>
+        </w:rPr>
+        <w:t>2</w:t>
+      </w:r>
+      <w:r>
+        <w:rPr>
+          <w:shd w:fill="FFFFFF" w:val="clear"/>
+        </w:rPr>
+        <w:t>; en el PCA, sobre la matriz de densidades continuas \pm \mathbb{</w:t>
+      </w:r>
+      <w:r>
+        <w:rPr>
+          <w:rStyle w:val="Emphasis"/>
+          <w:shd w:fill="FFFFFF" w:val="clear"/>
+        </w:rPr>
+        <w:t>R</w:t>
+      </w:r>
+      <w:r>
+        <w:rPr>
+          <w:shd w:fill="FFFFFF" w:val="clear"/>
+        </w:rPr>
+        <w:t xml:space="preserve">} estandarizadas. El contraste evidencia la aportación sustantiva de la socio-termodinámica relacional (Figura 5). </w:t>
       </w:r>
     </w:p>
     <w:p>
@@ -15636,99 +15696,13 @@
           <w:rStyle w:val="Strong"/>
           <w:shd w:fill="FFFFFF" w:val="clear"/>
         </w:rPr>
-        <w:t xml:space="preserve">Planos Factoriales Duales Paralelos (Biplot MESO </w:t>
-      </w:r>
-      <w:r>
-        <w:rPr>
-          <w:rStyle w:val="Emphasis"/>
-          <w:shd w:fill="FFFFFF" w:val="clear"/>
-        </w:rPr>
-        <w:t>F</w:t>
-      </w:r>
-      <w:r>
-        <w:rPr>
-          <w:rStyle w:val="Strong"/>
-          <w:position w:val="-2"/>
-          <w:sz w:val="16"/>
-          <w:shd w:fill="FFFFFF" w:val="clear"/>
-        </w:rPr>
-        <w:t>1</w:t>
-      </w:r>
-      <w:r>
-        <w:rPr>
-          <w:rStyle w:val="Strong"/>
-          <w:shd w:fill="FFFFFF" w:val="clear"/>
-        </w:rPr>
-        <w:t xml:space="preserve"> × </w:t>
-      </w:r>
-      <w:r>
-        <w:rPr>
-          <w:rStyle w:val="Emphasis"/>
-          <w:shd w:fill="FFFFFF" w:val="clear"/>
-        </w:rPr>
-        <w:t>F</w:t>
-      </w:r>
-      <w:r>
-        <w:rPr>
-          <w:rStyle w:val="Strong"/>
-          <w:position w:val="-2"/>
-          <w:sz w:val="16"/>
-          <w:shd w:fill="FFFFFF" w:val="clear"/>
-        </w:rPr>
-        <w:t>2</w:t>
-      </w:r>
-      <w:r>
-        <w:rPr>
-          <w:rStyle w:val="Strong"/>
-          <w:shd w:fill="FFFFFF" w:val="clear"/>
-        </w:rPr>
-        <w:t>, espacio dual AFC ∥ PCA):</w:t>
-      </w:r>
-      <w:r>
-        <w:rPr>
-          <w:shd w:fill="FFFFFF" w:val="clear"/>
-        </w:rPr>
-        <w:t xml:space="preserve"> Proyección simultánea donde el vector diádico DA → RC vertebra la posición de cada sujeto con baricentro en el origen (Δ = 0.000). En el AFC, sobre la tabla de contingencia de recuentos enteros \mathbb{</w:t>
-      </w:r>
-      <w:r>
-        <w:rPr>
-          <w:rStyle w:val="Emphasis"/>
-          <w:shd w:fill="FFFFFF" w:val="clear"/>
-        </w:rPr>
-        <w:t>N</w:t>
-      </w:r>
-      <w:r>
-        <w:rPr>
-          <w:shd w:fill="FFFFFF" w:val="clear"/>
-        </w:rPr>
-        <w:t>}_0 bajo la métrica \chi</w:t>
-      </w:r>
-      <w:r>
-        <w:rPr>
-          <w:position w:val="6"/>
-          <w:sz w:val="16"/>
-          <w:shd w:fill="FFFFFF" w:val="clear"/>
-        </w:rPr>
-        <w:t>2</w:t>
-      </w:r>
-      <w:r>
-        <w:rPr>
-          <w:shd w:fill="FFFFFF" w:val="clear"/>
-        </w:rPr>
-        <w:t>; en el PCA, sobre la matriz de densidades continuas \pm \mathbb{</w:t>
-      </w:r>
-      <w:r>
-        <w:rPr>
-          <w:rStyle w:val="Emphasis"/>
-          <w:shd w:fill="FFFFFF" w:val="clear"/>
-        </w:rPr>
-        <w:t>R</w:t>
-      </w:r>
-      <w:r>
-        <w:rPr>
-          <w:shd w:fill="FFFFFF" w:val="clear"/>
-        </w:rPr>
-        <w:t xml:space="preserve">} estandarizadas. El contraste evidencia la aportación sustantiva de la socio-termodinámica relacional (Figura 9). </w:t>
+        <w:t>Ejes Slender Verticales 1D:</w:t>
+      </w:r>
+      <w:r>
+        <w:rPr>
+          <w:shd w:fill="FFFFFF" w:val="clear"/>
+        </w:rPr>
+        <w:t xml:space="preserve"> Proyecciones derivadas de la descomposición espectral y el análisis de correspondencias (Figura 6). </w:t>
       </w:r>
     </w:p>
     <w:p>
@@ -15752,13 +15726,39 @@
           <w:rStyle w:val="Strong"/>
           <w:shd w:fill="FFFFFF" w:val="clear"/>
         </w:rPr>
-        <w:t>Ejes Slender Verticales 1D:</w:t>
-      </w:r>
-      <w:r>
-        <w:rPr>
-          <w:shd w:fill="FFFFFF" w:val="clear"/>
-        </w:rPr>
-        <w:t xml:space="preserve"> Proyecciones derivadas de la descomposición espectral y el análisis de correspondencias (Figura 10). </w:t>
+        <w:t>Sociogramas Continuos Tridimensionales (VISORD 3D/4D):</w:t>
+      </w:r>
+      <w:r>
+        <w:rPr>
+          <w:shd w:fill="FFFFFF" w:val="clear"/>
+        </w:rPr>
+        <w:t xml:space="preserve"> Visualización en el espacio continuo de cuencas de atracción (</w:t>
+      </w:r>
+      <w:r>
+        <w:rPr>
+          <w:rStyle w:val="Textooriginal"/>
+          <w:shd w:fill="FFFFFF" w:val="clear"/>
+        </w:rPr>
+        <w:t>&lt;Ee&gt;</w:t>
+      </w:r>
+      <w:r>
+        <w:rPr>
+          <w:shd w:fill="FFFFFF" w:val="clear"/>
+        </w:rPr>
+        <w:t>), zonas intermedias de oposición y filamentos de ruptura o fricción (</w:t>
+      </w:r>
+      <w:r>
+        <w:rPr>
+          <w:rStyle w:val="Textooriginal"/>
+          <w:shd w:fill="FFFFFF" w:val="clear"/>
+        </w:rPr>
+        <w:t>[Rr]</w:t>
+      </w:r>
+      <w:r>
+        <w:rPr>
+          <w:shd w:fill="FFFFFF" w:val="clear"/>
+        </w:rPr>
+        <w:t xml:space="preserve">), con navegación temporal diacrónica (Figura 7). </w:t>
       </w:r>
     </w:p>
     <w:p>
@@ -15836,7 +15836,7 @@
           <wp:inline distT="0" distB="0" distL="0" distR="0">
             <wp:extent cx="720090" cy="21431250"/>
             <wp:effectExtent l="0" t="0" r="0" b="0"/>
-            <wp:docPr id="5" name="Imagen5" title="Figura 9: Planos Duales en Paralelo (Biplot MESO F1 × F2, AFC ∥ PCA)"/>
+            <wp:docPr id="5" name="Imagen5" title="Figura 5: Planos Duales en Paralelo (Biplot MESO F1 × F2, AFC ∥ PCA)"/>
             <wp:cNvGraphicFramePr>
               <a:graphicFrameLocks xmlns:a="http://schemas.openxmlformats.org/drawingml/2006/main" noChangeAspect="1"/>
             </wp:cNvGraphicFramePr>
@@ -15844,7 +15844,7 @@
               <a:graphicData uri="http://schemas.openxmlformats.org/drawingml/2006/picture">
                 <pic:pic xmlns:pic="http://schemas.openxmlformats.org/drawingml/2006/picture">
                   <pic:nvPicPr>
-                    <pic:cNvPr id="5" name="Imagen5" title="Figura 9: Planos Duales en Paralelo (Biplot MESO F1 × F2, AFC ∥ PCA)"/>
+                    <pic:cNvPr id="5" name="Imagen5" title="Figura 5: Planos Duales en Paralelo (Biplot MESO F1 × F2, AFC ∥ PCA)"/>
                     <pic:cNvPicPr>
                       <a:picLocks noChangeAspect="1" noChangeArrowheads="1"/>
                     </pic:cNvPicPr>
@@ -15875,7 +15875,7 @@
         <w:rPr>
           <w:shd w:fill="FFFFFF" w:val="clear"/>
         </w:rPr>
-        <w:t xml:space="preserve">Figura 9. PLANOS DUALES EN PARALELO (Biplot MESO F1 × F2, espacio dual AFC ∥ PCA): el vector diádico DA ⟶ RC con baricentro en el origen (Δ = 0.000). (A) AFC sobre frecuencias de las figuras Q81 en emisores y receptores (contingencia ℕ₀, métrica χ²); (B) PCA sobre las 10 densidades en los mismos sujetos (continuo ±ℝ). El contraste evidencia la aportación sustantiva de la termodinámica relacional. </w:t>
+        <w:t xml:space="preserve">Figura 5. PLANOS DUALES EN PARALELO (Biplot MESO F1 × F2, espacio dual AFC ∥ PCA): el vector diádico DA ⟶ RC con baricentro en el origen (Δ = 0.000). (A) AFC sobre frecuencias de las figuras Q81 en emisores y receptores (contingencia ℕ₀, métrica χ²); (B) PCA sobre las 10 densidades en los mismos sujetos (continuo ±ℝ). El contraste evidencia la aportación sustantiva de la termodinámica relacional. </w:t>
       </w:r>
       <w:r>
         <w:rPr>
@@ -15885,7 +15885,7 @@
           <wp:inline distT="0" distB="0" distL="0" distR="0">
             <wp:extent cx="720090" cy="31432500"/>
             <wp:effectExtent l="0" t="0" r="0" b="0"/>
-            <wp:docPr id="6" name="Imagen6" title="Figura 10: Ejes verticales factoriales 1D (COR–CTA–CTR)"/>
+            <wp:docPr id="6" name="Imagen6" title="Figura 6: Ejes verticales factoriales 1D (COR–CTA–CTR)"/>
             <wp:cNvGraphicFramePr>
               <a:graphicFrameLocks xmlns:a="http://schemas.openxmlformats.org/drawingml/2006/main" noChangeAspect="1"/>
             </wp:cNvGraphicFramePr>
@@ -15893,7 +15893,7 @@
               <a:graphicData uri="http://schemas.openxmlformats.org/drawingml/2006/picture">
                 <pic:pic xmlns:pic="http://schemas.openxmlformats.org/drawingml/2006/picture">
                   <pic:nvPicPr>
-                    <pic:cNvPr id="6" name="Imagen6" title="Figura 10: Ejes verticales factoriales 1D (COR–CTA–CTR)"/>
+                    <pic:cNvPr id="6" name="Imagen6" title="Figura 6: Ejes verticales factoriales 1D (COR–CTA–CTR)"/>
                     <pic:cNvPicPr>
                       <a:picLocks noChangeAspect="1" noChangeArrowheads="1"/>
                     </pic:cNvPicPr>
@@ -15924,7 +15924,7 @@
         <w:rPr>
           <w:shd w:fill="FFFFFF" w:val="clear"/>
         </w:rPr>
-        <w:t xml:space="preserve">Figura 10. Ejes verticales factoriales 1D (Ejes 1 y 2, matriz SDR): calidad métrica bilateral COR–CTA–CTR de sujetos y figuras Q81, evitando la saturación de los diagramas 2D. </w:t>
+        <w:t xml:space="preserve">Figura 6. Ejes verticales factoriales 1D (Ejes 1 y 2, matriz SDR): calidad métrica bilateral COR–CTA–CTR de sujetos y figuras Q81, evitando la saturación de los diagramas 2D. </w:t>
       </w:r>
       <w:r>
         <w:rPr>
@@ -15934,7 +15934,7 @@
           <wp:inline distT="0" distB="0" distL="0" distR="0">
             <wp:extent cx="720090" cy="10668000"/>
             <wp:effectExtent l="0" t="0" r="0" b="0"/>
-            <wp:docPr id="7" name="Imagen7" title="Figura 11: Navegación 3D interactiva en VISORD Engine"/>
+            <wp:docPr id="7" name="Imagen7" title="Figura 7: Navegación 3D interactiva en VISORD Engine"/>
             <wp:cNvGraphicFramePr>
               <a:graphicFrameLocks xmlns:a="http://schemas.openxmlformats.org/drawingml/2006/main" noChangeAspect="1"/>
             </wp:cNvGraphicFramePr>
@@ -15942,7 +15942,7 @@
               <a:graphicData uri="http://schemas.openxmlformats.org/drawingml/2006/picture">
                 <pic:pic xmlns:pic="http://schemas.openxmlformats.org/drawingml/2006/picture">
                   <pic:nvPicPr>
-                    <pic:cNvPr id="7" name="Imagen7" title="Figura 11: Navegación 3D interactiva en VISORD Engine"/>
+                    <pic:cNvPr id="7" name="Imagen7" title="Figura 7: Navegación 3D interactiva en VISORD Engine"/>
                     <pic:cNvPicPr>
                       <a:picLocks noChangeAspect="1" noChangeArrowheads="1"/>
                     </pic:cNvPicPr>
@@ -15973,7 +15973,7 @@
         <w:rPr>
           <w:shd w:fill="FFFFFF" w:val="clear"/>
         </w:rPr>
-        <w:t xml:space="preserve">Figura 11. VISORD_demo 3D: fases en la formación interactiva de grupos y resultados termodinámicos numéricos y gráficos en tiempo real; fuerzas de atracción y repulsión en acción. </w:t>
+        <w:t xml:space="preserve">Figura 7. VISORD_demo 3D: fases en la formación interactiva de grupos y resultados termodinámicos numéricos y gráficos en tiempo real; fuerzas de atracción y repulsión en acción. </w:t>
       </w:r>
     </w:p>
     <w:p>
@@ -17304,7 +17304,7 @@
         <w:rPr>
           <w:shd w:fill="FFFFFF" w:val="clear"/>
         </w:rPr>
-        <w:t>Esta métrica determina rigurosamente (Figura 12) si dos grupos comparten la misma morfología relacional con independencia de las diferencias en sus tamaños muestrales. Aunque el acuerdo entre observadores es un componente apreciable de confiabilidad de los hallazgos de estructuras invariantes, es la persistencia y constancia temporal de estas configuraciones en el espacio geométrico lo que permite contrastar la solidez de las estructuras relacionales frente a variaciones coyunturales o fluctuaciones aleatorias.</w:t>
+        <w:t>Esta métrica determina rigurosamente (Figura 8) si dos grupos comparten la misma morfología relacional con independencia de las diferencias en sus tamaños muestrales. Aunque el acuerdo entre observadores es un componente apreciable de confiabilidad de los hallazgos de estructuras invariantes, es la persistencia y constancia temporal de estas configuraciones en el espacio geométrico lo que permite contrastar la solidez de las estructuras relacionales frente a variaciones coyunturales o fluctuaciones aleatorias.</w:t>
       </w:r>
     </w:p>
     <w:p>
@@ -17323,7 +17323,7 @@
           <wp:inline distT="0" distB="0" distL="0" distR="0">
             <wp:extent cx="720090" cy="24288750"/>
             <wp:effectExtent l="0" t="0" r="0" b="0"/>
-            <wp:docPr id="10" name="Imagen10" title="Figura 12: Plano factorial comparativo intergrupal (G1 vs G2)"/>
+            <wp:docPr id="10" name="Imagen10" title="Figura 8: Plano factorial comparativo intergrupal (G1 vs G2)"/>
             <wp:cNvGraphicFramePr>
               <a:graphicFrameLocks xmlns:a="http://schemas.openxmlformats.org/drawingml/2006/main" noChangeAspect="1"/>
             </wp:cNvGraphicFramePr>
@@ -17331,7 +17331,7 @@
               <a:graphicData uri="http://schemas.openxmlformats.org/drawingml/2006/picture">
                 <pic:pic xmlns:pic="http://schemas.openxmlformats.org/drawingml/2006/picture">
                   <pic:nvPicPr>
-                    <pic:cNvPr id="10" name="Imagen10" title="Figura 12: Plano factorial comparativo intergrupal (G1 vs G2)"/>
+                    <pic:cNvPr id="10" name="Imagen10" title="Figura 8: Plano factorial comparativo intergrupal (G1 vs G2)"/>
                     <pic:cNvPicPr>
                       <a:picLocks noChangeAspect="1" noChangeArrowheads="1"/>
                     </pic:cNvPicPr>
@@ -17362,7 +17362,7 @@
         <w:rPr>
           <w:shd w:fill="FFFFFF" w:val="clear"/>
         </w:rPr>
-        <w:t xml:space="preserve">Figura 12. Plano factorial comparativo intergrupal (G1 vs G2) y structrogramas diacrónicos; la distancia geodésica en Gr(k, N) cuantifica la morfología relacional compartida. </w:t>
+        <w:t xml:space="preserve">Figura 8. Plano factorial comparativo intergrupal (G1 vs G2) y structrogramas diacrónicos; la distancia geodésica en Gr(k, N) cuantifica la morfología relacional compartida. </w:t>
       </w:r>
     </w:p>
     <w:p>
@@ -17680,7 +17680,7 @@
         <w:rPr>
           <w:shd w:fill="FFFFFF" w:val="clear"/>
         </w:rPr>
-        <w:t xml:space="preserve"> &lt; 30) por la saturación de los sociogramas clásicos (Figura 13).</w:t>
+        <w:t xml:space="preserve"> &lt; 30) por la saturación de los sociogramas clásicos (Figura 9).</w:t>
       </w:r>
     </w:p>
     <w:p>
@@ -17699,7 +17699,7 @@
           <wp:inline distT="0" distB="0" distL="0" distR="0">
             <wp:extent cx="720090" cy="13811250"/>
             <wp:effectExtent l="0" t="0" r="0" b="0"/>
-            <wp:docPr id="12" name="Imagen12" title="Figura 13: Campo continuo de interacción y modelo del iceberg (N = 50)"/>
+            <wp:docPr id="12" name="Imagen12" title="Figura 9: Campo continuo de interacción y modelo del iceberg (N = 50)"/>
             <wp:cNvGraphicFramePr>
               <a:graphicFrameLocks xmlns:a="http://schemas.openxmlformats.org/drawingml/2006/main" noChangeAspect="1"/>
             </wp:cNvGraphicFramePr>
@@ -17707,7 +17707,7 @@
               <a:graphicData uri="http://schemas.openxmlformats.org/drawingml/2006/picture">
                 <pic:pic xmlns:pic="http://schemas.openxmlformats.org/drawingml/2006/picture">
                   <pic:nvPicPr>
-                    <pic:cNvPr id="12" name="Imagen12" title="Figura 13: Campo continuo de interacción y modelo del iceberg (N = 50)"/>
+                    <pic:cNvPr id="12" name="Imagen12" title="Figura 9: Campo continuo de interacción y modelo del iceberg (N = 50)"/>
                     <pic:cNvPicPr>
                       <a:picLocks noChangeAspect="1" noChangeArrowheads="1"/>
                     </pic:cNvPicPr>
@@ -17738,7 +17738,7 @@
         <w:rPr>
           <w:shd w:fill="FFFFFF" w:val="clear"/>
         </w:rPr>
-        <w:t xml:space="preserve">Figura 13. Campo continuo de interacción y modelo del iceberg en un colectivo de N = 50 sujetos: la base relacional sumergida hecha visible. </w:t>
+        <w:t xml:space="preserve">Figura 9. Campo continuo de interacción y modelo del iceberg en un colectivo de N = 50 sujetos: la base relacional sumergida hecha visible. </w:t>
       </w:r>
     </w:p>
     <w:p>

</xml_diff>

<commit_message>
docs(manifesto): sincronizar versión v9.0 pulida estilísticamente y saneada en fórmulas
</commit_message>
<xml_diff>
--- a/assets/MANIFIESTO_CIENTIFICO_NEXORD_ZENODO_2026.docx
+++ b/assets/MANIFIESTO_CIENTIFICO_NEXORD_ZENODO_2026.docx
@@ -1309,7 +1309,7 @@
         <w:rPr>
           <w:shd w:fill="FFFFFF" w:val="clear"/>
         </w:rPr>
-        <w:t xml:space="preserve"> para Kurt Lewin (1936–1951) (Figuras 1 y 2). Estas cartas declaran, con intención explícita, el estatuto epistémico del proyecto: En ningún momento NEXORD ha pretendido sustituir a sus inspiradores, sino completar algorítmicamente sus geniales intuiciones, adaptándolas a las posibilidades técnicas del cómputo contemporáneo. La continuidad con la tradición fundacional no es únicamente cartográfica: NEXORD opera indistintamente con protocolos de captura MORENO y ORBIT (protocolos muy similares, dual-stack, pues ambos comparten un orden de elección/rechazo manifiesto; aunque ORBIT no se pronuncia directamente sobre las expectativas recíprocas, un algoritmo de conversión MORENO ⇔ ORBIT permite una estimación probabilística que completa ambas formas sociométricas). El tetragrama diádico (pDA \cdot DA \cdot REC \cdot pREC) es una elaboración totalmente moreniana y constituye la base sólida sobre la que se ha construido la Plataforma NEXORD.</w:t>
+        <w:t xml:space="preserve"> para Kurt Lewin (1936–1951) (Figuras 1 y 2). Estas cartas declaran, con intención explícita, el estatuto epistémico del proyecto: En ningún momento NEXORD ha pretendido sustituir a sus inspiradores, sino completar algorítmicamente sus intuiciones fundacionales, adaptándolas a las posibilidades técnicas del cómputo contemporáneo. La continuidad con la tradición fundacional no es únicamente cartográfica: NEXORD opera indistintamente con protocolos de captura MORENO y ORBIT (protocolos muy similares, dual-stack, pues ambos comparten un orden de elección/rechazo manifiesto; aunque ORBIT no se pronuncia directamente sobre las expectativas recíprocas, un algoritmo de conversión MORENO ⇔ ORBIT permite una estimación probabilística que completa ambas formas sociométricas). El tetragrama diádico (pDA \cdot DA \cdot REC \cdot pREC) es una elaboración totalmente moreniana y constituye la base sólida sobre la que se ha construido la Plataforma NEXORD.</w:t>
       </w:r>
     </w:p>
     <w:p>
@@ -1339,7 +1339,7 @@
         <w:rPr>
           <w:shd w:fill="FFFFFF" w:val="clear"/>
         </w:rPr>
-        <w:t>Sin un orden canónico explícito, la sociometría histórica acumuló mediciones aisladas e inconmensurables entre sí: hermosas melodías que nadie podía leer en una misma partitura. NEXORD ofrece ese pentagrama común donde el orden no impone la música, sino que la hace legible y comparable.</w:t>
+        <w:t>Sin un marco ordinal estandarizado, los registros sociométricos clásicos resultaban difíciles de comparar entre sí. NEXORD aporta una estructura de referencia compartida donde la ordenación secuencial permite formalizar, integrar y comparar sistemáticamente las configuraciones grupales.</w:t>
       </w:r>
     </w:p>
     <w:p>
@@ -2475,7 +2475,7 @@
     </w:p>
     <w:tbl>
       <w:tblPr>
-        <w:tblW w:w="9342" w:type="dxa"/>
+        <w:tblW w:w="6035" w:type="dxa"/>
         <w:jc w:val="start"/>
         <w:tblInd w:w="0" w:type="dxa"/>
         <w:shd w:fill="F8FAFC" w:val="clear"/>
@@ -2488,13 +2488,13 @@
         </w:tblCellMar>
       </w:tblPr>
       <w:tblGrid>
-        <w:gridCol w:w="9342"/>
+        <w:gridCol w:w="6035"/>
       </w:tblGrid>
       <w:tr>
         <w:trPr/>
         <w:tc>
           <w:tcPr>
-            <w:tcW w:w="9342" w:type="dxa"/>
+            <w:tcW w:w="6035" w:type="dxa"/>
             <w:tcBorders/>
             <w:shd w:fill="F8FAFC" w:val="clear"/>
             <w:vAlign w:val="center"/>
@@ -3604,7 +3604,7 @@
         <w:rPr>
           <w:shd w:fill="FFFFFF" w:val="clear"/>
         </w:rPr>
-        <w:t xml:space="preserve"> Evalúa la fricción estructural inducida por la pugna por el liderazgo cuando múltiples participantes reclaman el primer rango de preferencia para sí mismos: ITA = \max≤ft(0, \sum_{</w:t>
+        <w:t xml:space="preserve"> Evalúa la fricción estructural inducida por la pugna por el liderazgo cuando múltiples participantes reclaman el primer rango de preferencia para sí mismos: ITA = \max(0, \sum_{</w:t>
       </w:r>
       <w:r>
         <w:rPr>
@@ -3653,7 +3653,7 @@
         <w:rPr>
           <w:shd w:fill="FFFFFF" w:val="clear"/>
         </w:rPr>
-        <w:t xml:space="preserve"> = 1)\right) - 1. </w:t>
+        <w:t xml:space="preserve">=1) - 1). </w:t>
       </w:r>
     </w:p>
     <w:p>
@@ -4747,7 +4747,7 @@
         <w:rPr>
           <w:shd w:fill="FFFFFF" w:val="clear"/>
         </w:rPr>
-        <w:t>En síntesis: la salud y la productividad de un grupo no son una cuestión moral ni de buena voluntad, sino de aerodinámica e hidrostática relacional. Un grupo productivo es aquel cuyo elipsoide vuela horizontal, cuyos saldos de energía están en balance homeostático, y donde nadie tiene que ahogarse en el fondo del abismo para que otros puedan tomar el sol a cielo abierto.</w:t>
+        <w:t>En síntesis: la viabilidad y el bienestar del colectivo no dependen de voluntarismos individuales, sino del equilibrio estructural de sus intercambios. Un grupo funcional mantiene flujos recíprocos sostenibles, minimiza la fricción disipativa y evita asimetrías extremas donde la sobrecarga o el aislamiento se concentren de forma crónica en miembros particulares.</w:t>
       </w:r>
     </w:p>
     <w:p>
@@ -4848,7 +4848,7 @@
     </w:p>
     <w:tbl>
       <w:tblPr>
-        <w:tblW w:w="9483" w:type="dxa"/>
+        <w:tblW w:w="6035" w:type="dxa"/>
         <w:jc w:val="start"/>
         <w:tblInd w:w="0" w:type="dxa"/>
         <w:tblLayout w:type="fixed"/>
@@ -4860,18 +4860,18 @@
         </w:tblCellMar>
       </w:tblPr>
       <w:tblGrid>
-        <w:gridCol w:w="1259"/>
-        <w:gridCol w:w="1620"/>
-        <w:gridCol w:w="1290"/>
-        <w:gridCol w:w="1684"/>
-        <w:gridCol w:w="2009"/>
-        <w:gridCol w:w="1621"/>
+        <w:gridCol w:w="1116"/>
+        <w:gridCol w:w="764"/>
+        <w:gridCol w:w="670"/>
+        <w:gridCol w:w="1063"/>
+        <w:gridCol w:w="1135"/>
+        <w:gridCol w:w="1287"/>
       </w:tblGrid>
       <w:tr>
         <w:trPr/>
         <w:tc>
           <w:tcPr>
-            <w:tcW w:w="1259" w:type="dxa"/>
+            <w:tcW w:w="1116" w:type="dxa"/>
             <w:tcBorders>
               <w:top w:val="single" w:sz="2" w:space="0" w:color="CBD5E0"/>
               <w:start w:val="single" w:sz="2" w:space="0" w:color="CBD5E0"/>
@@ -4906,7 +4906,7 @@
         </w:tc>
         <w:tc>
           <w:tcPr>
-            <w:tcW w:w="1620" w:type="dxa"/>
+            <w:tcW w:w="764" w:type="dxa"/>
             <w:tcBorders>
               <w:top w:val="single" w:sz="2" w:space="0" w:color="CBD5E0"/>
               <w:start w:val="single" w:sz="2" w:space="0" w:color="CBD5E0"/>
@@ -4954,7 +4954,7 @@
         </w:tc>
         <w:tc>
           <w:tcPr>
-            <w:tcW w:w="1290" w:type="dxa"/>
+            <w:tcW w:w="670" w:type="dxa"/>
             <w:tcBorders>
               <w:top w:val="single" w:sz="2" w:space="0" w:color="CBD5E0"/>
               <w:start w:val="single" w:sz="2" w:space="0" w:color="CBD5E0"/>
@@ -4989,7 +4989,7 @@
         </w:tc>
         <w:tc>
           <w:tcPr>
-            <w:tcW w:w="1684" w:type="dxa"/>
+            <w:tcW w:w="1063" w:type="dxa"/>
             <w:tcBorders>
               <w:top w:val="single" w:sz="2" w:space="0" w:color="CBD5E0"/>
               <w:start w:val="single" w:sz="2" w:space="0" w:color="CBD5E0"/>
@@ -5024,7 +5024,7 @@
         </w:tc>
         <w:tc>
           <w:tcPr>
-            <w:tcW w:w="2009" w:type="dxa"/>
+            <w:tcW w:w="1135" w:type="dxa"/>
             <w:tcBorders>
               <w:top w:val="single" w:sz="2" w:space="0" w:color="CBD5E0"/>
               <w:start w:val="single" w:sz="2" w:space="0" w:color="CBD5E0"/>
@@ -5072,7 +5072,7 @@
         </w:tc>
         <w:tc>
           <w:tcPr>
-            <w:tcW w:w="1621" w:type="dxa"/>
+            <w:tcW w:w="1287" w:type="dxa"/>
             <w:tcBorders>
               <w:top w:val="single" w:sz="2" w:space="0" w:color="CBD5E0"/>
               <w:start w:val="single" w:sz="2" w:space="0" w:color="CBD5E0"/>
@@ -5110,7 +5110,7 @@
         <w:trPr/>
         <w:tc>
           <w:tcPr>
-            <w:tcW w:w="1259" w:type="dxa"/>
+            <w:tcW w:w="1116" w:type="dxa"/>
             <w:tcBorders>
               <w:top w:val="single" w:sz="2" w:space="0" w:color="CBD5E0"/>
               <w:start w:val="single" w:sz="2" w:space="0" w:color="CBD5E0"/>
@@ -5139,7 +5139,7 @@
         </w:tc>
         <w:tc>
           <w:tcPr>
-            <w:tcW w:w="1620" w:type="dxa"/>
+            <w:tcW w:w="764" w:type="dxa"/>
             <w:tcBorders>
               <w:top w:val="single" w:sz="2" w:space="0" w:color="CBD5E0"/>
               <w:start w:val="single" w:sz="2" w:space="0" w:color="CBD5E0"/>
@@ -5168,7 +5168,7 @@
         </w:tc>
         <w:tc>
           <w:tcPr>
-            <w:tcW w:w="1290" w:type="dxa"/>
+            <w:tcW w:w="670" w:type="dxa"/>
             <w:tcBorders>
               <w:top w:val="single" w:sz="2" w:space="0" w:color="CBD5E0"/>
               <w:start w:val="single" w:sz="2" w:space="0" w:color="CBD5E0"/>
@@ -5197,7 +5197,7 @@
         </w:tc>
         <w:tc>
           <w:tcPr>
-            <w:tcW w:w="1684" w:type="dxa"/>
+            <w:tcW w:w="1063" w:type="dxa"/>
             <w:tcBorders>
               <w:top w:val="single" w:sz="2" w:space="0" w:color="CBD5E0"/>
               <w:start w:val="single" w:sz="2" w:space="0" w:color="CBD5E0"/>
@@ -5226,7 +5226,7 @@
         </w:tc>
         <w:tc>
           <w:tcPr>
-            <w:tcW w:w="2009" w:type="dxa"/>
+            <w:tcW w:w="1135" w:type="dxa"/>
             <w:tcBorders>
               <w:top w:val="single" w:sz="2" w:space="0" w:color="CBD5E0"/>
               <w:start w:val="single" w:sz="2" w:space="0" w:color="CBD5E0"/>
@@ -5255,7 +5255,7 @@
         </w:tc>
         <w:tc>
           <w:tcPr>
-            <w:tcW w:w="1621" w:type="dxa"/>
+            <w:tcW w:w="1287" w:type="dxa"/>
             <w:tcBorders>
               <w:top w:val="single" w:sz="2" w:space="0" w:color="CBD5E0"/>
               <w:start w:val="single" w:sz="2" w:space="0" w:color="CBD5E0"/>
@@ -5287,7 +5287,7 @@
         <w:trPr/>
         <w:tc>
           <w:tcPr>
-            <w:tcW w:w="1259" w:type="dxa"/>
+            <w:tcW w:w="1116" w:type="dxa"/>
             <w:tcBorders>
               <w:top w:val="single" w:sz="2" w:space="0" w:color="CBD5E0"/>
               <w:start w:val="single" w:sz="2" w:space="0" w:color="CBD5E0"/>
@@ -5316,7 +5316,7 @@
         </w:tc>
         <w:tc>
           <w:tcPr>
-            <w:tcW w:w="1620" w:type="dxa"/>
+            <w:tcW w:w="764" w:type="dxa"/>
             <w:tcBorders>
               <w:top w:val="single" w:sz="2" w:space="0" w:color="CBD5E0"/>
               <w:start w:val="single" w:sz="2" w:space="0" w:color="CBD5E0"/>
@@ -5345,7 +5345,7 @@
         </w:tc>
         <w:tc>
           <w:tcPr>
-            <w:tcW w:w="1290" w:type="dxa"/>
+            <w:tcW w:w="670" w:type="dxa"/>
             <w:tcBorders>
               <w:top w:val="single" w:sz="2" w:space="0" w:color="CBD5E0"/>
               <w:start w:val="single" w:sz="2" w:space="0" w:color="CBD5E0"/>
@@ -5374,7 +5374,7 @@
         </w:tc>
         <w:tc>
           <w:tcPr>
-            <w:tcW w:w="1684" w:type="dxa"/>
+            <w:tcW w:w="1063" w:type="dxa"/>
             <w:tcBorders>
               <w:top w:val="single" w:sz="2" w:space="0" w:color="CBD5E0"/>
               <w:start w:val="single" w:sz="2" w:space="0" w:color="CBD5E0"/>
@@ -5403,7 +5403,7 @@
         </w:tc>
         <w:tc>
           <w:tcPr>
-            <w:tcW w:w="2009" w:type="dxa"/>
+            <w:tcW w:w="1135" w:type="dxa"/>
             <w:tcBorders>
               <w:top w:val="single" w:sz="2" w:space="0" w:color="CBD5E0"/>
               <w:start w:val="single" w:sz="2" w:space="0" w:color="CBD5E0"/>
@@ -5432,7 +5432,7 @@
         </w:tc>
         <w:tc>
           <w:tcPr>
-            <w:tcW w:w="1621" w:type="dxa"/>
+            <w:tcW w:w="1287" w:type="dxa"/>
             <w:tcBorders>
               <w:top w:val="single" w:sz="2" w:space="0" w:color="CBD5E0"/>
               <w:start w:val="single" w:sz="2" w:space="0" w:color="CBD5E0"/>
@@ -5464,7 +5464,7 @@
         <w:trPr/>
         <w:tc>
           <w:tcPr>
-            <w:tcW w:w="1259" w:type="dxa"/>
+            <w:tcW w:w="1116" w:type="dxa"/>
             <w:tcBorders>
               <w:top w:val="single" w:sz="2" w:space="0" w:color="CBD5E0"/>
               <w:start w:val="single" w:sz="2" w:space="0" w:color="CBD5E0"/>
@@ -5493,7 +5493,7 @@
         </w:tc>
         <w:tc>
           <w:tcPr>
-            <w:tcW w:w="1620" w:type="dxa"/>
+            <w:tcW w:w="764" w:type="dxa"/>
             <w:tcBorders>
               <w:top w:val="single" w:sz="2" w:space="0" w:color="CBD5E0"/>
               <w:start w:val="single" w:sz="2" w:space="0" w:color="CBD5E0"/>
@@ -5522,7 +5522,7 @@
         </w:tc>
         <w:tc>
           <w:tcPr>
-            <w:tcW w:w="1290" w:type="dxa"/>
+            <w:tcW w:w="670" w:type="dxa"/>
             <w:tcBorders>
               <w:top w:val="single" w:sz="2" w:space="0" w:color="CBD5E0"/>
               <w:start w:val="single" w:sz="2" w:space="0" w:color="CBD5E0"/>
@@ -5551,7 +5551,7 @@
         </w:tc>
         <w:tc>
           <w:tcPr>
-            <w:tcW w:w="1684" w:type="dxa"/>
+            <w:tcW w:w="1063" w:type="dxa"/>
             <w:tcBorders>
               <w:top w:val="single" w:sz="2" w:space="0" w:color="CBD5E0"/>
               <w:start w:val="single" w:sz="2" w:space="0" w:color="CBD5E0"/>
@@ -5580,7 +5580,7 @@
         </w:tc>
         <w:tc>
           <w:tcPr>
-            <w:tcW w:w="2009" w:type="dxa"/>
+            <w:tcW w:w="1135" w:type="dxa"/>
             <w:tcBorders>
               <w:top w:val="single" w:sz="2" w:space="0" w:color="CBD5E0"/>
               <w:start w:val="single" w:sz="2" w:space="0" w:color="CBD5E0"/>
@@ -5609,7 +5609,7 @@
         </w:tc>
         <w:tc>
           <w:tcPr>
-            <w:tcW w:w="1621" w:type="dxa"/>
+            <w:tcW w:w="1287" w:type="dxa"/>
             <w:tcBorders>
               <w:top w:val="single" w:sz="2" w:space="0" w:color="CBD5E0"/>
               <w:start w:val="single" w:sz="2" w:space="0" w:color="CBD5E0"/>
@@ -5795,7 +5795,7 @@
     </w:p>
     <w:tbl>
       <w:tblPr>
-        <w:tblW w:w="7591" w:type="dxa"/>
+        <w:tblW w:w="6035" w:type="dxa"/>
         <w:jc w:val="start"/>
         <w:tblInd w:w="0" w:type="dxa"/>
         <w:tblLayout w:type="fixed"/>
@@ -5807,15 +5807,15 @@
         </w:tblCellMar>
       </w:tblPr>
       <w:tblGrid>
-        <w:gridCol w:w="2997"/>
-        <w:gridCol w:w="1587"/>
-        <w:gridCol w:w="3007"/>
+        <w:gridCol w:w="2313"/>
+        <w:gridCol w:w="1397"/>
+        <w:gridCol w:w="2325"/>
       </w:tblGrid>
       <w:tr>
         <w:trPr/>
         <w:tc>
           <w:tcPr>
-            <w:tcW w:w="2997" w:type="dxa"/>
+            <w:tcW w:w="2313" w:type="dxa"/>
             <w:tcBorders>
               <w:top w:val="single" w:sz="2" w:space="0" w:color="CBD5E0"/>
               <w:start w:val="single" w:sz="2" w:space="0" w:color="CBD5E0"/>
@@ -5847,7 +5847,7 @@
         </w:tc>
         <w:tc>
           <w:tcPr>
-            <w:tcW w:w="1587" w:type="dxa"/>
+            <w:tcW w:w="1397" w:type="dxa"/>
             <w:tcBorders>
               <w:top w:val="single" w:sz="2" w:space="0" w:color="CBD5E0"/>
               <w:start w:val="single" w:sz="2" w:space="0" w:color="CBD5E0"/>
@@ -5879,7 +5879,7 @@
         </w:tc>
         <w:tc>
           <w:tcPr>
-            <w:tcW w:w="3007" w:type="dxa"/>
+            <w:tcW w:w="2325" w:type="dxa"/>
             <w:tcBorders>
               <w:top w:val="single" w:sz="2" w:space="0" w:color="CBD5E0"/>
               <w:start w:val="single" w:sz="2" w:space="0" w:color="CBD5E0"/>
@@ -5913,7 +5913,7 @@
         <w:trPr/>
         <w:tc>
           <w:tcPr>
-            <w:tcW w:w="2997" w:type="dxa"/>
+            <w:tcW w:w="2313" w:type="dxa"/>
             <w:tcBorders>
               <w:top w:val="single" w:sz="2" w:space="0" w:color="CBD5E0"/>
               <w:start w:val="single" w:sz="2" w:space="0" w:color="CBD5E0"/>
@@ -5943,7 +5943,7 @@
         </w:tc>
         <w:tc>
           <w:tcPr>
-            <w:tcW w:w="1587" w:type="dxa"/>
+            <w:tcW w:w="1397" w:type="dxa"/>
             <w:tcBorders>
               <w:top w:val="single" w:sz="2" w:space="0" w:color="CBD5E0"/>
               <w:start w:val="single" w:sz="2" w:space="0" w:color="CBD5E0"/>
@@ -5973,7 +5973,7 @@
         </w:tc>
         <w:tc>
           <w:tcPr>
-            <w:tcW w:w="3007" w:type="dxa"/>
+            <w:tcW w:w="2325" w:type="dxa"/>
             <w:tcBorders>
               <w:top w:val="single" w:sz="2" w:space="0" w:color="CBD5E0"/>
               <w:start w:val="single" w:sz="2" w:space="0" w:color="CBD5E0"/>
@@ -7713,7 +7713,7 @@
     </w:p>
     <w:tbl>
       <w:tblPr>
-        <w:tblW w:w="9483" w:type="dxa"/>
+        <w:tblW w:w="6035" w:type="dxa"/>
         <w:jc w:val="start"/>
         <w:tblInd w:w="0" w:type="dxa"/>
         <w:tblLayout w:type="fixed"/>
@@ -7725,16 +7725,16 @@
         </w:tblCellMar>
       </w:tblPr>
       <w:tblGrid>
-        <w:gridCol w:w="1588"/>
-        <w:gridCol w:w="2157"/>
-        <w:gridCol w:w="1654"/>
-        <w:gridCol w:w="4084"/>
+        <w:gridCol w:w="1264"/>
+        <w:gridCol w:w="1510"/>
+        <w:gridCol w:w="1193"/>
+        <w:gridCol w:w="2068"/>
       </w:tblGrid>
       <w:tr>
         <w:trPr/>
         <w:tc>
           <w:tcPr>
-            <w:tcW w:w="1588" w:type="dxa"/>
+            <w:tcW w:w="1264" w:type="dxa"/>
             <w:tcBorders>
               <w:top w:val="single" w:sz="2" w:space="0" w:color="CBD5E0"/>
               <w:start w:val="single" w:sz="2" w:space="0" w:color="CBD5E0"/>
@@ -7769,7 +7769,7 @@
         </w:tc>
         <w:tc>
           <w:tcPr>
-            <w:tcW w:w="2157" w:type="dxa"/>
+            <w:tcW w:w="1510" w:type="dxa"/>
             <w:tcBorders>
               <w:top w:val="single" w:sz="2" w:space="0" w:color="CBD5E0"/>
               <w:start w:val="single" w:sz="2" w:space="0" w:color="CBD5E0"/>
@@ -7804,7 +7804,7 @@
         </w:tc>
         <w:tc>
           <w:tcPr>
-            <w:tcW w:w="1654" w:type="dxa"/>
+            <w:tcW w:w="1193" w:type="dxa"/>
             <w:tcBorders>
               <w:top w:val="single" w:sz="2" w:space="0" w:color="CBD5E0"/>
               <w:start w:val="single" w:sz="2" w:space="0" w:color="CBD5E0"/>
@@ -7839,7 +7839,7 @@
         </w:tc>
         <w:tc>
           <w:tcPr>
-            <w:tcW w:w="4084" w:type="dxa"/>
+            <w:tcW w:w="2068" w:type="dxa"/>
             <w:tcBorders>
               <w:top w:val="single" w:sz="2" w:space="0" w:color="CBD5E0"/>
               <w:start w:val="single" w:sz="2" w:space="0" w:color="CBD5E0"/>
@@ -7877,7 +7877,7 @@
         <w:trPr/>
         <w:tc>
           <w:tcPr>
-            <w:tcW w:w="1588" w:type="dxa"/>
+            <w:tcW w:w="1264" w:type="dxa"/>
             <w:tcBorders>
               <w:top w:val="single" w:sz="2" w:space="0" w:color="CBD5E0"/>
               <w:start w:val="single" w:sz="2" w:space="0" w:color="CBD5E0"/>
@@ -7921,7 +7921,7 @@
         </w:tc>
         <w:tc>
           <w:tcPr>
-            <w:tcW w:w="2157" w:type="dxa"/>
+            <w:tcW w:w="1510" w:type="dxa"/>
             <w:tcBorders>
               <w:top w:val="single" w:sz="2" w:space="0" w:color="CBD5E0"/>
               <w:start w:val="single" w:sz="2" w:space="0" w:color="CBD5E0"/>
@@ -7951,7 +7951,7 @@
         </w:tc>
         <w:tc>
           <w:tcPr>
-            <w:tcW w:w="1654" w:type="dxa"/>
+            <w:tcW w:w="1193" w:type="dxa"/>
             <w:tcBorders>
               <w:top w:val="single" w:sz="2" w:space="0" w:color="CBD5E0"/>
               <w:start w:val="single" w:sz="2" w:space="0" w:color="CBD5E0"/>
@@ -7981,7 +7981,7 @@
         </w:tc>
         <w:tc>
           <w:tcPr>
-            <w:tcW w:w="4084" w:type="dxa"/>
+            <w:tcW w:w="2068" w:type="dxa"/>
             <w:tcBorders>
               <w:top w:val="single" w:sz="2" w:space="0" w:color="CBD5E0"/>
               <w:start w:val="single" w:sz="2" w:space="0" w:color="CBD5E0"/>
@@ -8025,7 +8025,7 @@
         <w:trPr/>
         <w:tc>
           <w:tcPr>
-            <w:tcW w:w="1588" w:type="dxa"/>
+            <w:tcW w:w="1264" w:type="dxa"/>
             <w:tcBorders>
               <w:top w:val="single" w:sz="2" w:space="0" w:color="CBD5E0"/>
               <w:start w:val="single" w:sz="2" w:space="0" w:color="CBD5E0"/>
@@ -8054,7 +8054,7 @@
         </w:tc>
         <w:tc>
           <w:tcPr>
-            <w:tcW w:w="2157" w:type="dxa"/>
+            <w:tcW w:w="1510" w:type="dxa"/>
             <w:tcBorders>
               <w:top w:val="single" w:sz="2" w:space="0" w:color="CBD5E0"/>
               <w:start w:val="single" w:sz="2" w:space="0" w:color="CBD5E0"/>
@@ -8121,7 +8121,7 @@
         </w:tc>
         <w:tc>
           <w:tcPr>
-            <w:tcW w:w="1654" w:type="dxa"/>
+            <w:tcW w:w="1193" w:type="dxa"/>
             <w:tcBorders>
               <w:top w:val="single" w:sz="2" w:space="0" w:color="CBD5E0"/>
               <w:start w:val="single" w:sz="2" w:space="0" w:color="CBD5E0"/>
@@ -8150,7 +8150,7 @@
         </w:tc>
         <w:tc>
           <w:tcPr>
-            <w:tcW w:w="4084" w:type="dxa"/>
+            <w:tcW w:w="2068" w:type="dxa"/>
             <w:tcBorders>
               <w:top w:val="single" w:sz="2" w:space="0" w:color="CBD5E0"/>
               <w:start w:val="single" w:sz="2" w:space="0" w:color="CBD5E0"/>
@@ -8183,7 +8183,7 @@
         <w:trPr/>
         <w:tc>
           <w:tcPr>
-            <w:tcW w:w="1588" w:type="dxa"/>
+            <w:tcW w:w="1264" w:type="dxa"/>
             <w:tcBorders>
               <w:top w:val="single" w:sz="2" w:space="0" w:color="CBD5E0"/>
               <w:start w:val="single" w:sz="2" w:space="0" w:color="CBD5E0"/>
@@ -8212,7 +8212,7 @@
         </w:tc>
         <w:tc>
           <w:tcPr>
-            <w:tcW w:w="2157" w:type="dxa"/>
+            <w:tcW w:w="1510" w:type="dxa"/>
             <w:tcBorders>
               <w:top w:val="single" w:sz="2" w:space="0" w:color="CBD5E0"/>
               <w:start w:val="single" w:sz="2" w:space="0" w:color="CBD5E0"/>
@@ -8266,7 +8266,7 @@
         </w:tc>
         <w:tc>
           <w:tcPr>
-            <w:tcW w:w="1654" w:type="dxa"/>
+            <w:tcW w:w="1193" w:type="dxa"/>
             <w:tcBorders>
               <w:top w:val="single" w:sz="2" w:space="0" w:color="CBD5E0"/>
               <w:start w:val="single" w:sz="2" w:space="0" w:color="CBD5E0"/>
@@ -8295,7 +8295,7 @@
         </w:tc>
         <w:tc>
           <w:tcPr>
-            <w:tcW w:w="4084" w:type="dxa"/>
+            <w:tcW w:w="2068" w:type="dxa"/>
             <w:tcBorders>
               <w:top w:val="single" w:sz="2" w:space="0" w:color="CBD5E0"/>
               <w:start w:val="single" w:sz="2" w:space="0" w:color="CBD5E0"/>
@@ -8319,7 +8319,7 @@
               <w:rPr>
                 <w:sz w:val="17"/>
               </w:rPr>
-              <w:t>Premio termodinámico a la lucidez mental, la sintonía empática y la salud estructural de la red.</w:t>
+              <w:t>Bonificación por concordancia entre la percepción subjetiva y la elección efectiva observada.</w:t>
             </w:r>
           </w:p>
         </w:tc>
@@ -8328,7 +8328,7 @@
         <w:trPr/>
         <w:tc>
           <w:tcPr>
-            <w:tcW w:w="1588" w:type="dxa"/>
+            <w:tcW w:w="1264" w:type="dxa"/>
             <w:tcBorders>
               <w:top w:val="single" w:sz="2" w:space="0" w:color="CBD5E0"/>
               <w:start w:val="single" w:sz="2" w:space="0" w:color="CBD5E0"/>
@@ -8357,7 +8357,7 @@
         </w:tc>
         <w:tc>
           <w:tcPr>
-            <w:tcW w:w="2157" w:type="dxa"/>
+            <w:tcW w:w="1510" w:type="dxa"/>
             <w:tcBorders>
               <w:top w:val="single" w:sz="2" w:space="0" w:color="CBD5E0"/>
               <w:start w:val="single" w:sz="2" w:space="0" w:color="CBD5E0"/>
@@ -8424,7 +8424,7 @@
         </w:tc>
         <w:tc>
           <w:tcPr>
-            <w:tcW w:w="1654" w:type="dxa"/>
+            <w:tcW w:w="1193" w:type="dxa"/>
             <w:tcBorders>
               <w:top w:val="single" w:sz="2" w:space="0" w:color="CBD5E0"/>
               <w:start w:val="single" w:sz="2" w:space="0" w:color="CBD5E0"/>
@@ -8475,7 +8475,40 @@
         </w:tc>
         <w:tc>
           <w:tcPr>
-            <w:tcW w:w="4084" w:type="dxa"/>
+            <w:tcW w:w="2068" w:type="dxa"/>
+            <w:tcBorders>
+              <w:top w:val="single" w:sz="2" w:space="0" w:color="CBD5E0"/>
+              <w:start w:val="single" w:sz="2" w:space="0" w:color="CBD5E0"/>
+              <w:bottom w:val="single" w:sz="2" w:space="0" w:color="CBD5E0"/>
+              <w:end w:val="single" w:sz="2" w:space="0" w:color="CBD5E0"/>
+            </w:tcBorders>
+            <w:vAlign w:val="center"/>
+          </w:tcPr>
+          <w:p>
+            <w:pPr>
+              <w:pStyle w:val="Contenidodelatabla"/>
+              <w:bidi w:val="0"/>
+              <w:spacing w:before="0" w:after="210"/>
+              <w:ind w:hanging="0" w:start="0" w:end="0"/>
+              <w:jc w:val="center"/>
+              <w:rPr>
+                <w:sz w:val="17"/>
+              </w:rPr>
+            </w:pPr>
+            <w:r>
+              <w:rPr>
+                <w:sz w:val="17"/>
+              </w:rPr>
+              <w:t>Ponderación negativa proporcional a la centralidad del emisor: las discrepancias de nodos centrales ejercen mayor impacto sobre la red.</w:t>
+            </w:r>
+          </w:p>
+        </w:tc>
+      </w:tr>
+      <w:tr>
+        <w:trPr/>
+        <w:tc>
+          <w:tcPr>
+            <w:tcW w:w="1264" w:type="dxa"/>
             <w:tcBorders>
               <w:top w:val="single" w:sz="2" w:space="0" w:color="CBD5E0"/>
               <w:start w:val="single" w:sz="2" w:space="0" w:color="CBD5E0"/>
@@ -8495,39 +8528,46 @@
             </w:pPr>
             <w:r>
               <w:rPr>
-                <w:sz w:val="17"/>
-              </w:rPr>
-              <w:t>Penalización destructiva proporcional al estatus (</w:t>
-            </w:r>
-            <w:r>
-              <w:rPr>
-                <w:rStyle w:val="Emphasis"/>
-                <w:sz w:val="17"/>
-              </w:rPr>
-              <w:t>P</w:t>
-            </w:r>
-            <w:r>
-              <w:rPr>
-                <w:rStyle w:val="Emphasis"/>
-                <w:position w:val="-1"/>
-                <w:sz w:val="17"/>
-              </w:rPr>
-              <w:t>i</w:t>
-            </w:r>
-            <w:r>
-              <w:rPr>
-                <w:sz w:val="17"/>
-              </w:rPr>
-              <w:t>). La toxicidad de un líder daña la red más que la de un nodo periférico.</w:t>
+                <w:rStyle w:val="Strong"/>
+                <w:sz w:val="17"/>
+              </w:rPr>
+              <w:t>5. Esfuerzo Perceptivo</w:t>
             </w:r>
           </w:p>
         </w:tc>
-      </w:tr>
-      <w:tr>
-        <w:trPr/>
         <w:tc>
           <w:tcPr>
-            <w:tcW w:w="1588" w:type="dxa"/>
+            <w:tcW w:w="1510" w:type="dxa"/>
+            <w:tcBorders>
+              <w:top w:val="single" w:sz="2" w:space="0" w:color="CBD5E0"/>
+              <w:start w:val="single" w:sz="2" w:space="0" w:color="CBD5E0"/>
+              <w:bottom w:val="single" w:sz="2" w:space="0" w:color="CBD5E0"/>
+              <w:end w:val="single" w:sz="2" w:space="0" w:color="CBD5E0"/>
+            </w:tcBorders>
+            <w:vAlign w:val="center"/>
+          </w:tcPr>
+          <w:p>
+            <w:pPr>
+              <w:pStyle w:val="Contenidodelatabla"/>
+              <w:bidi w:val="0"/>
+              <w:spacing w:before="0" w:after="210"/>
+              <w:ind w:hanging="0" w:start="0" w:end="0"/>
+              <w:jc w:val="center"/>
+              <w:rPr>
+                <w:sz w:val="17"/>
+              </w:rPr>
+            </w:pPr>
+            <w:r>
+              <w:rPr>
+                <w:sz w:val="17"/>
+              </w:rPr>
+              <w:t>Presencia activa de meta-percepción (pDA, pRC)</w:t>
+            </w:r>
+          </w:p>
+        </w:tc>
+        <w:tc>
+          <w:tcPr>
+            <w:tcW w:w="1193" w:type="dxa"/>
             <w:tcBorders>
               <w:top w:val="single" w:sz="2" w:space="0" w:color="CBD5E0"/>
               <w:start w:val="single" w:sz="2" w:space="0" w:color="CBD5E0"/>
@@ -8550,13 +8590,13 @@
                 <w:rStyle w:val="Strong"/>
                 <w:sz w:val="17"/>
               </w:rPr>
-              <w:t>5. Esfuerzo Perceptivo</w:t>
+              <w:t>1.2×</w:t>
             </w:r>
           </w:p>
         </w:tc>
         <w:tc>
           <w:tcPr>
-            <w:tcW w:w="2157" w:type="dxa"/>
+            <w:tcW w:w="2068" w:type="dxa"/>
             <w:tcBorders>
               <w:top w:val="single" w:sz="2" w:space="0" w:color="CBD5E0"/>
               <w:start w:val="single" w:sz="2" w:space="0" w:color="CBD5E0"/>
@@ -8580,13 +8620,16 @@
               <w:rPr>
                 <w:sz w:val="17"/>
               </w:rPr>
-              <w:t>Presencia activa de meta-percepción (pDA, pRC)</w:t>
+              <w:t>Ponderación atribuida al registro de expectativas relacionales frente a la ausencia de metapercepción.</w:t>
             </w:r>
           </w:p>
         </w:tc>
+      </w:tr>
+      <w:tr>
+        <w:trPr/>
         <w:tc>
           <w:tcPr>
-            <w:tcW w:w="1654" w:type="dxa"/>
+            <w:tcW w:w="1264" w:type="dxa"/>
             <w:tcBorders>
               <w:top w:val="single" w:sz="2" w:space="0" w:color="CBD5E0"/>
               <w:start w:val="single" w:sz="2" w:space="0" w:color="CBD5E0"/>
@@ -8609,13 +8652,65 @@
                 <w:rStyle w:val="Strong"/>
                 <w:sz w:val="17"/>
               </w:rPr>
-              <w:t>1.2×</w:t>
+              <w:t>6. Prestigio del Emisor (</w:t>
+            </w:r>
+            <w:r>
+              <w:rPr>
+                <w:rStyle w:val="Emphasis"/>
+                <w:sz w:val="17"/>
+              </w:rPr>
+              <w:t>P</w:t>
+            </w:r>
+            <w:r>
+              <w:rPr>
+                <w:rStyle w:val="Emphasis"/>
+                <w:position w:val="-1"/>
+                <w:sz w:val="17"/>
+              </w:rPr>
+              <w:t>i</w:t>
+            </w:r>
+            <w:r>
+              <w:rPr>
+                <w:rStyle w:val="Strong"/>
+                <w:sz w:val="17"/>
+              </w:rPr>
+              <w:t>)</w:t>
             </w:r>
           </w:p>
         </w:tc>
         <w:tc>
           <w:tcPr>
-            <w:tcW w:w="4084" w:type="dxa"/>
+            <w:tcW w:w="1510" w:type="dxa"/>
+            <w:tcBorders>
+              <w:top w:val="single" w:sz="2" w:space="0" w:color="CBD5E0"/>
+              <w:start w:val="single" w:sz="2" w:space="0" w:color="CBD5E0"/>
+              <w:bottom w:val="single" w:sz="2" w:space="0" w:color="CBD5E0"/>
+              <w:end w:val="single" w:sz="2" w:space="0" w:color="CBD5E0"/>
+            </w:tcBorders>
+            <w:vAlign w:val="center"/>
+          </w:tcPr>
+          <w:p>
+            <w:pPr>
+              <w:pStyle w:val="Contenidodelatabla"/>
+              <w:bidi w:val="0"/>
+              <w:spacing w:before="0" w:after="210"/>
+              <w:ind w:hanging="0" w:start="0" w:end="0"/>
+              <w:jc w:val="center"/>
+              <w:rPr>
+                <w:sz w:val="17"/>
+              </w:rPr>
+            </w:pPr>
+            <w:r>
+              <w:rPr>
+                <w:sz w:val="17"/>
+              </w:rPr>
+              <w:t>Centralidad Jerárquica del Sujeto en la Red</w:t>
+            </w:r>
+          </w:p>
+        </w:tc>
+        <w:tc>
+          <w:tcPr>
+            <w:tcW w:w="1193" w:type="dxa"/>
             <w:tcBorders>
               <w:top w:val="single" w:sz="2" w:space="0" w:color="CBD5E0"/>
               <w:start w:val="single" w:sz="2" w:space="0" w:color="CBD5E0"/>
@@ -8635,147 +8730,22 @@
             </w:pPr>
             <w:r>
               <w:rPr>
-                <w:sz w:val="17"/>
-              </w:rPr>
-              <w:t xml:space="preserve">Reconocimiento del coste cognitivo de anticipación. </w:t>
-            </w:r>
-            <w:r>
-              <w:rPr>
                 <w:rStyle w:val="Strong"/>
                 <w:sz w:val="17"/>
               </w:rPr>
-              <w:t>Bono estrictamente anulado a 1.0× si existe ceguera estructural</w:t>
-            </w:r>
-            <w:r>
-              <w:rPr>
-                <w:sz w:val="17"/>
-              </w:rPr>
-              <w:t>.</w:t>
-            </w:r>
-          </w:p>
-        </w:tc>
-      </w:tr>
-      <w:tr>
-        <w:trPr/>
-        <w:tc>
-          <w:tcPr>
-            <w:tcW w:w="1588" w:type="dxa"/>
-            <w:tcBorders>
-              <w:top w:val="single" w:sz="2" w:space="0" w:color="CBD5E0"/>
-              <w:start w:val="single" w:sz="2" w:space="0" w:color="CBD5E0"/>
-              <w:bottom w:val="single" w:sz="2" w:space="0" w:color="CBD5E0"/>
-              <w:end w:val="single" w:sz="2" w:space="0" w:color="CBD5E0"/>
-            </w:tcBorders>
-            <w:vAlign w:val="center"/>
-          </w:tcPr>
-          <w:p>
-            <w:pPr>
-              <w:pStyle w:val="Contenidodelatabla"/>
-              <w:bidi w:val="0"/>
-              <w:spacing w:before="0" w:after="210"/>
-              <w:ind w:hanging="0" w:start="0" w:end="0"/>
-              <w:jc w:val="center"/>
-              <w:rPr/>
-            </w:pPr>
-            <w:r>
-              <w:rPr>
-                <w:rStyle w:val="Strong"/>
-                <w:sz w:val="17"/>
-              </w:rPr>
-              <w:t>6. Prestigio del Emisor (</w:t>
-            </w:r>
-            <w:r>
-              <w:rPr>
-                <w:rStyle w:val="Emphasis"/>
-                <w:sz w:val="17"/>
-              </w:rPr>
-              <w:t>P</w:t>
-            </w:r>
-            <w:r>
-              <w:rPr>
-                <w:rStyle w:val="Emphasis"/>
-                <w:position w:val="-1"/>
-                <w:sz w:val="17"/>
-              </w:rPr>
-              <w:t>i</w:t>
-            </w:r>
-            <w:r>
-              <w:rPr>
-                <w:rStyle w:val="Strong"/>
-                <w:sz w:val="17"/>
-              </w:rPr>
-              <w:t>)</w:t>
+              <w:t>Variable</w:t>
+            </w:r>
+            <w:r>
+              <w:rPr>
+                <w:sz w:val="17"/>
+              </w:rPr>
+              <w:t xml:space="preserve"> (0.5 a 1.5)</w:t>
             </w:r>
           </w:p>
         </w:tc>
         <w:tc>
           <w:tcPr>
-            <w:tcW w:w="2157" w:type="dxa"/>
-            <w:tcBorders>
-              <w:top w:val="single" w:sz="2" w:space="0" w:color="CBD5E0"/>
-              <w:start w:val="single" w:sz="2" w:space="0" w:color="CBD5E0"/>
-              <w:bottom w:val="single" w:sz="2" w:space="0" w:color="CBD5E0"/>
-              <w:end w:val="single" w:sz="2" w:space="0" w:color="CBD5E0"/>
-            </w:tcBorders>
-            <w:vAlign w:val="center"/>
-          </w:tcPr>
-          <w:p>
-            <w:pPr>
-              <w:pStyle w:val="Contenidodelatabla"/>
-              <w:bidi w:val="0"/>
-              <w:spacing w:before="0" w:after="210"/>
-              <w:ind w:hanging="0" w:start="0" w:end="0"/>
-              <w:jc w:val="center"/>
-              <w:rPr>
-                <w:sz w:val="17"/>
-              </w:rPr>
-            </w:pPr>
-            <w:r>
-              <w:rPr>
-                <w:sz w:val="17"/>
-              </w:rPr>
-              <w:t>Centralidad Jerárquica del Sujeto en la Red</w:t>
-            </w:r>
-          </w:p>
-        </w:tc>
-        <w:tc>
-          <w:tcPr>
-            <w:tcW w:w="1654" w:type="dxa"/>
-            <w:tcBorders>
-              <w:top w:val="single" w:sz="2" w:space="0" w:color="CBD5E0"/>
-              <w:start w:val="single" w:sz="2" w:space="0" w:color="CBD5E0"/>
-              <w:bottom w:val="single" w:sz="2" w:space="0" w:color="CBD5E0"/>
-              <w:end w:val="single" w:sz="2" w:space="0" w:color="CBD5E0"/>
-            </w:tcBorders>
-            <w:vAlign w:val="center"/>
-          </w:tcPr>
-          <w:p>
-            <w:pPr>
-              <w:pStyle w:val="Contenidodelatabla"/>
-              <w:bidi w:val="0"/>
-              <w:spacing w:before="0" w:after="210"/>
-              <w:ind w:hanging="0" w:start="0" w:end="0"/>
-              <w:jc w:val="center"/>
-              <w:rPr/>
-            </w:pPr>
-            <w:r>
-              <w:rPr>
-                <w:rStyle w:val="Strong"/>
-                <w:sz w:val="17"/>
-              </w:rPr>
-              <w:t>Variable</w:t>
-            </w:r>
-            <w:r>
-              <w:rPr>
-                <w:sz w:val="17"/>
-              </w:rPr>
-              <w:t xml:space="preserve"> (0.5 a 1.5)</w:t>
-            </w:r>
-          </w:p>
-        </w:tc>
-        <w:tc>
-          <w:tcPr>
-            <w:tcW w:w="4084" w:type="dxa"/>
+            <w:tcW w:w="2068" w:type="dxa"/>
             <w:tcBorders>
               <w:top w:val="single" w:sz="2" w:space="0" w:color="CBD5E0"/>
               <w:start w:val="single" w:sz="2" w:space="0" w:color="CBD5E0"/>
@@ -8896,7 +8866,7 @@
     </w:p>
     <w:tbl>
       <w:tblPr>
-        <w:tblW w:w="9483" w:type="dxa"/>
+        <w:tblW w:w="6035" w:type="dxa"/>
         <w:jc w:val="start"/>
         <w:tblInd w:w="0" w:type="dxa"/>
         <w:tblLayout w:type="fixed"/>
@@ -8913,11 +8883,7 @@
         <w:gridCol w:w="943"/>
         <w:gridCol w:w="815"/>
         <w:gridCol w:w="759"/>
-        <w:gridCol w:w="1759"/>
-        <w:gridCol w:w="585"/>
-        <w:gridCol w:w="951"/>
-        <w:gridCol w:w="585"/>
-        <w:gridCol w:w="1342"/>
+        <w:gridCol w:w="1774"/>
       </w:tblGrid>
       <w:tr>
         <w:trPr/>
@@ -9098,7 +9064,7 @@
         </w:tc>
         <w:tc>
           <w:tcPr>
-            <w:tcW w:w="1759" w:type="dxa"/>
+            <w:tcW w:w="1774" w:type="dxa"/>
             <w:tcBorders>
               <w:top w:val="single" w:sz="2" w:space="0" w:color="CBD5E0"/>
               <w:start w:val="single" w:sz="2" w:space="0" w:color="CBD5E0"/>
@@ -9128,134 +9094,6 @@
                 <w:sz w:val="17"/>
               </w:rPr>
               <w:t>Significado Socio-Termodinámico</w:t>
-            </w:r>
-          </w:p>
-        </w:tc>
-        <w:tc>
-          <w:tcPr>
-            <w:tcW w:w="585" w:type="dxa"/>
-            <w:tcBorders>
-              <w:top w:val="single" w:sz="6" w:space="0" w:color="808080"/>
-              <w:start w:val="single" w:sz="2" w:space="0" w:color="808080"/>
-              <w:bottom w:val="single" w:sz="2" w:space="0" w:color="808080"/>
-              <w:end w:val="single" w:sz="6" w:space="0" w:color="808080"/>
-            </w:tcBorders>
-            <w:tcMar>
-              <w:start w:w="90" w:type="dxa"/>
-              <w:end w:w="90" w:type="dxa"/>
-            </w:tcMar>
-          </w:tcPr>
-          <w:p>
-            <w:pPr>
-              <w:pStyle w:val="Contenidodelatabla"/>
-              <w:bidi w:val="0"/>
-              <w:spacing w:before="0" w:after="210"/>
-              <w:rPr>
-                <w:sz w:val="4"/>
-                <w:szCs w:val="4"/>
-              </w:rPr>
-            </w:pPr>
-            <w:r>
-              <w:rPr>
-                <w:sz w:val="4"/>
-                <w:szCs w:val="4"/>
-              </w:rPr>
-            </w:r>
-          </w:p>
-        </w:tc>
-        <w:tc>
-          <w:tcPr>
-            <w:tcW w:w="951" w:type="dxa"/>
-            <w:tcBorders>
-              <w:top w:val="single" w:sz="6" w:space="0" w:color="808080"/>
-              <w:start w:val="single" w:sz="2" w:space="0" w:color="808080"/>
-              <w:bottom w:val="single" w:sz="2" w:space="0" w:color="808080"/>
-              <w:end w:val="single" w:sz="6" w:space="0" w:color="808080"/>
-            </w:tcBorders>
-            <w:tcMar>
-              <w:start w:w="90" w:type="dxa"/>
-              <w:end w:w="90" w:type="dxa"/>
-            </w:tcMar>
-          </w:tcPr>
-          <w:p>
-            <w:pPr>
-              <w:pStyle w:val="Contenidodelatabla"/>
-              <w:bidi w:val="0"/>
-              <w:spacing w:before="0" w:after="210"/>
-              <w:rPr>
-                <w:sz w:val="4"/>
-                <w:szCs w:val="4"/>
-              </w:rPr>
-            </w:pPr>
-            <w:r>
-              <w:rPr>
-                <w:sz w:val="4"/>
-                <w:szCs w:val="4"/>
-              </w:rPr>
-            </w:r>
-          </w:p>
-        </w:tc>
-        <w:tc>
-          <w:tcPr>
-            <w:tcW w:w="585" w:type="dxa"/>
-            <w:tcBorders>
-              <w:top w:val="single" w:sz="6" w:space="0" w:color="808080"/>
-              <w:start w:val="single" w:sz="2" w:space="0" w:color="808080"/>
-              <w:bottom w:val="single" w:sz="2" w:space="0" w:color="808080"/>
-              <w:end w:val="single" w:sz="6" w:space="0" w:color="808080"/>
-            </w:tcBorders>
-            <w:tcMar>
-              <w:start w:w="90" w:type="dxa"/>
-              <w:end w:w="90" w:type="dxa"/>
-            </w:tcMar>
-          </w:tcPr>
-          <w:p>
-            <w:pPr>
-              <w:pStyle w:val="Contenidodelatabla"/>
-              <w:bidi w:val="0"/>
-              <w:spacing w:before="0" w:after="210"/>
-              <w:rPr>
-                <w:sz w:val="4"/>
-                <w:szCs w:val="4"/>
-              </w:rPr>
-            </w:pPr>
-            <w:r>
-              <w:rPr>
-                <w:sz w:val="4"/>
-                <w:szCs w:val="4"/>
-              </w:rPr>
-            </w:r>
-          </w:p>
-        </w:tc>
-        <w:tc>
-          <w:tcPr>
-            <w:tcW w:w="1342" w:type="dxa"/>
-            <w:tcBorders>
-              <w:top w:val="single" w:sz="6" w:space="0" w:color="808080"/>
-              <w:start w:val="single" w:sz="2" w:space="0" w:color="808080"/>
-              <w:bottom w:val="single" w:sz="2" w:space="0" w:color="808080"/>
-              <w:end w:val="single" w:sz="6" w:space="0" w:color="808080"/>
-            </w:tcBorders>
-            <w:tcMar>
-              <w:start w:w="90" w:type="dxa"/>
-              <w:end w:w="90" w:type="dxa"/>
-            </w:tcMar>
-          </w:tcPr>
-          <w:p>
-            <w:pPr>
-              <w:pStyle w:val="Contenidodelatabla"/>
-              <w:bidi w:val="0"/>
-              <w:spacing w:before="0" w:after="210"/>
-              <w:rPr>
-                <w:sz w:val="4"/>
-                <w:szCs w:val="4"/>
-              </w:rPr>
-            </w:pPr>
-            <w:r>
-              <w:rPr>
-                <w:sz w:val="4"/>
-                <w:szCs w:val="4"/>
-              </w:rPr>
             </w:r>
           </w:p>
         </w:tc>
@@ -9502,7 +9340,7 @@
         </w:tc>
         <w:tc>
           <w:tcPr>
-            <w:tcW w:w="1759" w:type="dxa"/>
+            <w:tcW w:w="1774" w:type="dxa"/>
             <w:tcBorders>
               <w:top w:val="single" w:sz="2" w:space="0" w:color="CBD5E0"/>
               <w:start w:val="single" w:sz="2" w:space="0" w:color="CBD5E0"/>
@@ -9527,130 +9365,6 @@
                 <w:sz w:val="17"/>
               </w:rPr>
               <w:t>Expectativa previa y confianza anticipatoria emitida hacia el grupo.</w:t>
-            </w:r>
-          </w:p>
-        </w:tc>
-        <w:tc>
-          <w:tcPr>
-            <w:tcW w:w="585" w:type="dxa"/>
-            <w:tcBorders>
-              <w:start w:val="single" w:sz="2" w:space="0" w:color="808080"/>
-              <w:bottom w:val="single" w:sz="2" w:space="0" w:color="808080"/>
-              <w:end w:val="single" w:sz="6" w:space="0" w:color="808080"/>
-            </w:tcBorders>
-            <w:tcMar>
-              <w:start w:w="90" w:type="dxa"/>
-              <w:end w:w="90" w:type="dxa"/>
-            </w:tcMar>
-          </w:tcPr>
-          <w:p>
-            <w:pPr>
-              <w:pStyle w:val="Contenidodelatabla"/>
-              <w:bidi w:val="0"/>
-              <w:spacing w:before="0" w:after="210"/>
-              <w:rPr>
-                <w:sz w:val="4"/>
-                <w:szCs w:val="4"/>
-              </w:rPr>
-            </w:pPr>
-            <w:r>
-              <w:rPr>
-                <w:sz w:val="4"/>
-                <w:szCs w:val="4"/>
-              </w:rPr>
-            </w:r>
-          </w:p>
-        </w:tc>
-        <w:tc>
-          <w:tcPr>
-            <w:tcW w:w="951" w:type="dxa"/>
-            <w:tcBorders>
-              <w:start w:val="single" w:sz="2" w:space="0" w:color="808080"/>
-              <w:bottom w:val="single" w:sz="2" w:space="0" w:color="808080"/>
-              <w:end w:val="single" w:sz="6" w:space="0" w:color="808080"/>
-            </w:tcBorders>
-            <w:tcMar>
-              <w:start w:w="90" w:type="dxa"/>
-              <w:end w:w="90" w:type="dxa"/>
-            </w:tcMar>
-          </w:tcPr>
-          <w:p>
-            <w:pPr>
-              <w:pStyle w:val="Contenidodelatabla"/>
-              <w:bidi w:val="0"/>
-              <w:spacing w:before="0" w:after="210"/>
-              <w:rPr>
-                <w:sz w:val="4"/>
-                <w:szCs w:val="4"/>
-              </w:rPr>
-            </w:pPr>
-            <w:r>
-              <w:rPr>
-                <w:sz w:val="4"/>
-                <w:szCs w:val="4"/>
-              </w:rPr>
-            </w:r>
-          </w:p>
-        </w:tc>
-        <w:tc>
-          <w:tcPr>
-            <w:tcW w:w="585" w:type="dxa"/>
-            <w:tcBorders>
-              <w:start w:val="single" w:sz="2" w:space="0" w:color="808080"/>
-              <w:bottom w:val="single" w:sz="2" w:space="0" w:color="808080"/>
-              <w:end w:val="single" w:sz="6" w:space="0" w:color="808080"/>
-            </w:tcBorders>
-            <w:tcMar>
-              <w:start w:w="90" w:type="dxa"/>
-              <w:end w:w="90" w:type="dxa"/>
-            </w:tcMar>
-          </w:tcPr>
-          <w:p>
-            <w:pPr>
-              <w:pStyle w:val="Contenidodelatabla"/>
-              <w:bidi w:val="0"/>
-              <w:spacing w:before="0" w:after="210"/>
-              <w:rPr>
-                <w:sz w:val="4"/>
-                <w:szCs w:val="4"/>
-              </w:rPr>
-            </w:pPr>
-            <w:r>
-              <w:rPr>
-                <w:sz w:val="4"/>
-                <w:szCs w:val="4"/>
-              </w:rPr>
-            </w:r>
-          </w:p>
-        </w:tc>
-        <w:tc>
-          <w:tcPr>
-            <w:tcW w:w="1342" w:type="dxa"/>
-            <w:tcBorders>
-              <w:start w:val="single" w:sz="2" w:space="0" w:color="808080"/>
-              <w:bottom w:val="single" w:sz="2" w:space="0" w:color="808080"/>
-              <w:end w:val="single" w:sz="6" w:space="0" w:color="808080"/>
-            </w:tcBorders>
-            <w:tcMar>
-              <w:start w:w="90" w:type="dxa"/>
-              <w:end w:w="90" w:type="dxa"/>
-            </w:tcMar>
-          </w:tcPr>
-          <w:p>
-            <w:pPr>
-              <w:pStyle w:val="Contenidodelatabla"/>
-              <w:bidi w:val="0"/>
-              <w:spacing w:before="0" w:after="210"/>
-              <w:rPr>
-                <w:sz w:val="4"/>
-                <w:szCs w:val="4"/>
-              </w:rPr>
-            </w:pPr>
-            <w:r>
-              <w:rPr>
-                <w:sz w:val="4"/>
-                <w:szCs w:val="4"/>
-              </w:rPr>
             </w:r>
           </w:p>
         </w:tc>
@@ -9897,7 +9611,7 @@
         </w:tc>
         <w:tc>
           <w:tcPr>
-            <w:tcW w:w="1759" w:type="dxa"/>
+            <w:tcW w:w="1774" w:type="dxa"/>
             <w:tcBorders>
               <w:top w:val="single" w:sz="2" w:space="0" w:color="CBD5E0"/>
               <w:start w:val="single" w:sz="2" w:space="0" w:color="CBD5E0"/>
@@ -9922,130 +9636,6 @@
                 <w:sz w:val="17"/>
               </w:rPr>
               <w:t>Flujo cinético y acción preferencial efectiva emitida por el sujeto.</w:t>
-            </w:r>
-          </w:p>
-        </w:tc>
-        <w:tc>
-          <w:tcPr>
-            <w:tcW w:w="585" w:type="dxa"/>
-            <w:tcBorders>
-              <w:start w:val="single" w:sz="2" w:space="0" w:color="808080"/>
-              <w:bottom w:val="single" w:sz="2" w:space="0" w:color="808080"/>
-              <w:end w:val="single" w:sz="6" w:space="0" w:color="808080"/>
-            </w:tcBorders>
-            <w:tcMar>
-              <w:start w:w="90" w:type="dxa"/>
-              <w:end w:w="90" w:type="dxa"/>
-            </w:tcMar>
-          </w:tcPr>
-          <w:p>
-            <w:pPr>
-              <w:pStyle w:val="Contenidodelatabla"/>
-              <w:bidi w:val="0"/>
-              <w:spacing w:before="0" w:after="210"/>
-              <w:rPr>
-                <w:sz w:val="4"/>
-                <w:szCs w:val="4"/>
-              </w:rPr>
-            </w:pPr>
-            <w:r>
-              <w:rPr>
-                <w:sz w:val="4"/>
-                <w:szCs w:val="4"/>
-              </w:rPr>
-            </w:r>
-          </w:p>
-        </w:tc>
-        <w:tc>
-          <w:tcPr>
-            <w:tcW w:w="951" w:type="dxa"/>
-            <w:tcBorders>
-              <w:start w:val="single" w:sz="2" w:space="0" w:color="808080"/>
-              <w:bottom w:val="single" w:sz="2" w:space="0" w:color="808080"/>
-              <w:end w:val="single" w:sz="6" w:space="0" w:color="808080"/>
-            </w:tcBorders>
-            <w:tcMar>
-              <w:start w:w="90" w:type="dxa"/>
-              <w:end w:w="90" w:type="dxa"/>
-            </w:tcMar>
-          </w:tcPr>
-          <w:p>
-            <w:pPr>
-              <w:pStyle w:val="Contenidodelatabla"/>
-              <w:bidi w:val="0"/>
-              <w:spacing w:before="0" w:after="210"/>
-              <w:rPr>
-                <w:sz w:val="4"/>
-                <w:szCs w:val="4"/>
-              </w:rPr>
-            </w:pPr>
-            <w:r>
-              <w:rPr>
-                <w:sz w:val="4"/>
-                <w:szCs w:val="4"/>
-              </w:rPr>
-            </w:r>
-          </w:p>
-        </w:tc>
-        <w:tc>
-          <w:tcPr>
-            <w:tcW w:w="585" w:type="dxa"/>
-            <w:tcBorders>
-              <w:start w:val="single" w:sz="2" w:space="0" w:color="808080"/>
-              <w:bottom w:val="single" w:sz="2" w:space="0" w:color="808080"/>
-              <w:end w:val="single" w:sz="6" w:space="0" w:color="808080"/>
-            </w:tcBorders>
-            <w:tcMar>
-              <w:start w:w="90" w:type="dxa"/>
-              <w:end w:w="90" w:type="dxa"/>
-            </w:tcMar>
-          </w:tcPr>
-          <w:p>
-            <w:pPr>
-              <w:pStyle w:val="Contenidodelatabla"/>
-              <w:bidi w:val="0"/>
-              <w:spacing w:before="0" w:after="210"/>
-              <w:rPr>
-                <w:sz w:val="4"/>
-                <w:szCs w:val="4"/>
-              </w:rPr>
-            </w:pPr>
-            <w:r>
-              <w:rPr>
-                <w:sz w:val="4"/>
-                <w:szCs w:val="4"/>
-              </w:rPr>
-            </w:r>
-          </w:p>
-        </w:tc>
-        <w:tc>
-          <w:tcPr>
-            <w:tcW w:w="1342" w:type="dxa"/>
-            <w:tcBorders>
-              <w:start w:val="single" w:sz="2" w:space="0" w:color="808080"/>
-              <w:bottom w:val="single" w:sz="2" w:space="0" w:color="808080"/>
-              <w:end w:val="single" w:sz="6" w:space="0" w:color="808080"/>
-            </w:tcBorders>
-            <w:tcMar>
-              <w:start w:w="90" w:type="dxa"/>
-              <w:end w:w="90" w:type="dxa"/>
-            </w:tcMar>
-          </w:tcPr>
-          <w:p>
-            <w:pPr>
-              <w:pStyle w:val="Contenidodelatabla"/>
-              <w:bidi w:val="0"/>
-              <w:spacing w:before="0" w:after="210"/>
-              <w:rPr>
-                <w:sz w:val="4"/>
-                <w:szCs w:val="4"/>
-              </w:rPr>
-            </w:pPr>
-            <w:r>
-              <w:rPr>
-                <w:sz w:val="4"/>
-                <w:szCs w:val="4"/>
-              </w:rPr>
             </w:r>
           </w:p>
         </w:tc>
@@ -10292,7 +9882,7 @@
         </w:tc>
         <w:tc>
           <w:tcPr>
-            <w:tcW w:w="1759" w:type="dxa"/>
+            <w:tcW w:w="1774" w:type="dxa"/>
             <w:tcBorders>
               <w:top w:val="single" w:sz="2" w:space="0" w:color="CBD5E0"/>
               <w:start w:val="single" w:sz="2" w:space="0" w:color="CBD5E0"/>
@@ -10317,130 +9907,6 @@
                 <w:sz w:val="17"/>
               </w:rPr>
               <w:t>Estatus e impacto real de atracción o rechazo recibido del colectivo.</w:t>
-            </w:r>
-          </w:p>
-        </w:tc>
-        <w:tc>
-          <w:tcPr>
-            <w:tcW w:w="585" w:type="dxa"/>
-            <w:tcBorders>
-              <w:start w:val="single" w:sz="2" w:space="0" w:color="808080"/>
-              <w:bottom w:val="single" w:sz="2" w:space="0" w:color="808080"/>
-              <w:end w:val="single" w:sz="6" w:space="0" w:color="808080"/>
-            </w:tcBorders>
-            <w:tcMar>
-              <w:start w:w="90" w:type="dxa"/>
-              <w:end w:w="90" w:type="dxa"/>
-            </w:tcMar>
-          </w:tcPr>
-          <w:p>
-            <w:pPr>
-              <w:pStyle w:val="Contenidodelatabla"/>
-              <w:bidi w:val="0"/>
-              <w:spacing w:before="0" w:after="210"/>
-              <w:rPr>
-                <w:sz w:val="4"/>
-                <w:szCs w:val="4"/>
-              </w:rPr>
-            </w:pPr>
-            <w:r>
-              <w:rPr>
-                <w:sz w:val="4"/>
-                <w:szCs w:val="4"/>
-              </w:rPr>
-            </w:r>
-          </w:p>
-        </w:tc>
-        <w:tc>
-          <w:tcPr>
-            <w:tcW w:w="951" w:type="dxa"/>
-            <w:tcBorders>
-              <w:start w:val="single" w:sz="2" w:space="0" w:color="808080"/>
-              <w:bottom w:val="single" w:sz="2" w:space="0" w:color="808080"/>
-              <w:end w:val="single" w:sz="6" w:space="0" w:color="808080"/>
-            </w:tcBorders>
-            <w:tcMar>
-              <w:start w:w="90" w:type="dxa"/>
-              <w:end w:w="90" w:type="dxa"/>
-            </w:tcMar>
-          </w:tcPr>
-          <w:p>
-            <w:pPr>
-              <w:pStyle w:val="Contenidodelatabla"/>
-              <w:bidi w:val="0"/>
-              <w:spacing w:before="0" w:after="210"/>
-              <w:rPr>
-                <w:sz w:val="4"/>
-                <w:szCs w:val="4"/>
-              </w:rPr>
-            </w:pPr>
-            <w:r>
-              <w:rPr>
-                <w:sz w:val="4"/>
-                <w:szCs w:val="4"/>
-              </w:rPr>
-            </w:r>
-          </w:p>
-        </w:tc>
-        <w:tc>
-          <w:tcPr>
-            <w:tcW w:w="585" w:type="dxa"/>
-            <w:tcBorders>
-              <w:start w:val="single" w:sz="2" w:space="0" w:color="808080"/>
-              <w:bottom w:val="single" w:sz="2" w:space="0" w:color="808080"/>
-              <w:end w:val="single" w:sz="6" w:space="0" w:color="808080"/>
-            </w:tcBorders>
-            <w:tcMar>
-              <w:start w:w="90" w:type="dxa"/>
-              <w:end w:w="90" w:type="dxa"/>
-            </w:tcMar>
-          </w:tcPr>
-          <w:p>
-            <w:pPr>
-              <w:pStyle w:val="Contenidodelatabla"/>
-              <w:bidi w:val="0"/>
-              <w:spacing w:before="0" w:after="210"/>
-              <w:rPr>
-                <w:sz w:val="4"/>
-                <w:szCs w:val="4"/>
-              </w:rPr>
-            </w:pPr>
-            <w:r>
-              <w:rPr>
-                <w:sz w:val="4"/>
-                <w:szCs w:val="4"/>
-              </w:rPr>
-            </w:r>
-          </w:p>
-        </w:tc>
-        <w:tc>
-          <w:tcPr>
-            <w:tcW w:w="1342" w:type="dxa"/>
-            <w:tcBorders>
-              <w:start w:val="single" w:sz="2" w:space="0" w:color="808080"/>
-              <w:bottom w:val="single" w:sz="2" w:space="0" w:color="808080"/>
-              <w:end w:val="single" w:sz="6" w:space="0" w:color="808080"/>
-            </w:tcBorders>
-            <w:tcMar>
-              <w:start w:w="90" w:type="dxa"/>
-              <w:end w:w="90" w:type="dxa"/>
-            </w:tcMar>
-          </w:tcPr>
-          <w:p>
-            <w:pPr>
-              <w:pStyle w:val="Contenidodelatabla"/>
-              <w:bidi w:val="0"/>
-              <w:spacing w:before="0" w:after="210"/>
-              <w:rPr>
-                <w:sz w:val="4"/>
-                <w:szCs w:val="4"/>
-              </w:rPr>
-            </w:pPr>
-            <w:r>
-              <w:rPr>
-                <w:sz w:val="4"/>
-                <w:szCs w:val="4"/>
-              </w:rPr>
             </w:r>
           </w:p>
         </w:tc>
@@ -10687,7 +10153,7 @@
         </w:tc>
         <w:tc>
           <w:tcPr>
-            <w:tcW w:w="1759" w:type="dxa"/>
+            <w:tcW w:w="1774" w:type="dxa"/>
             <w:tcBorders>
               <w:top w:val="single" w:sz="2" w:space="0" w:color="CBD5E0"/>
               <w:start w:val="single" w:sz="2" w:space="0" w:color="CBD5E0"/>
@@ -10712,130 +10178,6 @@
                 <w:sz w:val="17"/>
               </w:rPr>
               <w:t>Campo reflejo de presunción atribuido al sujeto por sus compañeros.</w:t>
-            </w:r>
-          </w:p>
-        </w:tc>
-        <w:tc>
-          <w:tcPr>
-            <w:tcW w:w="585" w:type="dxa"/>
-            <w:tcBorders>
-              <w:start w:val="single" w:sz="2" w:space="0" w:color="808080"/>
-              <w:bottom w:val="single" w:sz="2" w:space="0" w:color="808080"/>
-              <w:end w:val="single" w:sz="6" w:space="0" w:color="808080"/>
-            </w:tcBorders>
-            <w:tcMar>
-              <w:start w:w="90" w:type="dxa"/>
-              <w:end w:w="90" w:type="dxa"/>
-            </w:tcMar>
-          </w:tcPr>
-          <w:p>
-            <w:pPr>
-              <w:pStyle w:val="Contenidodelatabla"/>
-              <w:bidi w:val="0"/>
-              <w:spacing w:before="0" w:after="210"/>
-              <w:rPr>
-                <w:sz w:val="4"/>
-                <w:szCs w:val="4"/>
-              </w:rPr>
-            </w:pPr>
-            <w:r>
-              <w:rPr>
-                <w:sz w:val="4"/>
-                <w:szCs w:val="4"/>
-              </w:rPr>
-            </w:r>
-          </w:p>
-        </w:tc>
-        <w:tc>
-          <w:tcPr>
-            <w:tcW w:w="951" w:type="dxa"/>
-            <w:tcBorders>
-              <w:start w:val="single" w:sz="2" w:space="0" w:color="808080"/>
-              <w:bottom w:val="single" w:sz="2" w:space="0" w:color="808080"/>
-              <w:end w:val="single" w:sz="6" w:space="0" w:color="808080"/>
-            </w:tcBorders>
-            <w:tcMar>
-              <w:start w:w="90" w:type="dxa"/>
-              <w:end w:w="90" w:type="dxa"/>
-            </w:tcMar>
-          </w:tcPr>
-          <w:p>
-            <w:pPr>
-              <w:pStyle w:val="Contenidodelatabla"/>
-              <w:bidi w:val="0"/>
-              <w:spacing w:before="0" w:after="210"/>
-              <w:rPr>
-                <w:sz w:val="4"/>
-                <w:szCs w:val="4"/>
-              </w:rPr>
-            </w:pPr>
-            <w:r>
-              <w:rPr>
-                <w:sz w:val="4"/>
-                <w:szCs w:val="4"/>
-              </w:rPr>
-            </w:r>
-          </w:p>
-        </w:tc>
-        <w:tc>
-          <w:tcPr>
-            <w:tcW w:w="585" w:type="dxa"/>
-            <w:tcBorders>
-              <w:start w:val="single" w:sz="2" w:space="0" w:color="808080"/>
-              <w:bottom w:val="single" w:sz="2" w:space="0" w:color="808080"/>
-              <w:end w:val="single" w:sz="6" w:space="0" w:color="808080"/>
-            </w:tcBorders>
-            <w:tcMar>
-              <w:start w:w="90" w:type="dxa"/>
-              <w:end w:w="90" w:type="dxa"/>
-            </w:tcMar>
-          </w:tcPr>
-          <w:p>
-            <w:pPr>
-              <w:pStyle w:val="Contenidodelatabla"/>
-              <w:bidi w:val="0"/>
-              <w:spacing w:before="0" w:after="210"/>
-              <w:rPr>
-                <w:sz w:val="4"/>
-                <w:szCs w:val="4"/>
-              </w:rPr>
-            </w:pPr>
-            <w:r>
-              <w:rPr>
-                <w:sz w:val="4"/>
-                <w:szCs w:val="4"/>
-              </w:rPr>
-            </w:r>
-          </w:p>
-        </w:tc>
-        <w:tc>
-          <w:tcPr>
-            <w:tcW w:w="1342" w:type="dxa"/>
-            <w:tcBorders>
-              <w:start w:val="single" w:sz="2" w:space="0" w:color="808080"/>
-              <w:bottom w:val="single" w:sz="2" w:space="0" w:color="808080"/>
-              <w:end w:val="single" w:sz="6" w:space="0" w:color="808080"/>
-            </w:tcBorders>
-            <w:tcMar>
-              <w:start w:w="90" w:type="dxa"/>
-              <w:end w:w="90" w:type="dxa"/>
-            </w:tcMar>
-          </w:tcPr>
-          <w:p>
-            <w:pPr>
-              <w:pStyle w:val="Contenidodelatabla"/>
-              <w:bidi w:val="0"/>
-              <w:spacing w:before="0" w:after="210"/>
-              <w:rPr>
-                <w:sz w:val="4"/>
-                <w:szCs w:val="4"/>
-              </w:rPr>
-            </w:pPr>
-            <w:r>
-              <w:rPr>
-                <w:sz w:val="4"/>
-                <w:szCs w:val="4"/>
-              </w:rPr>
             </w:r>
           </w:p>
         </w:tc>
@@ -11031,7 +10373,7 @@
         </w:tc>
         <w:tc>
           <w:tcPr>
-            <w:tcW w:w="1759" w:type="dxa"/>
+            <w:tcW w:w="1774" w:type="dxa"/>
             <w:tcBorders>
               <w:top w:val="single" w:sz="2" w:space="0" w:color="CBD5E0"/>
               <w:start w:val="single" w:sz="2" w:space="0" w:color="CBD5E0"/>
@@ -11055,131 +10397,7 @@
               <w:rPr>
                 <w:sz w:val="17"/>
               </w:rPr>
-              <w:t>Potencial neto emisor: expansividad y manantial/sumidero de iniciativa.</w:t>
-            </w:r>
-          </w:p>
-        </w:tc>
-        <w:tc>
-          <w:tcPr>
-            <w:tcW w:w="585" w:type="dxa"/>
-            <w:tcBorders>
-              <w:start w:val="single" w:sz="2" w:space="0" w:color="808080"/>
-              <w:bottom w:val="single" w:sz="2" w:space="0" w:color="808080"/>
-              <w:end w:val="single" w:sz="6" w:space="0" w:color="808080"/>
-            </w:tcBorders>
-            <w:tcMar>
-              <w:start w:w="90" w:type="dxa"/>
-              <w:end w:w="90" w:type="dxa"/>
-            </w:tcMar>
-          </w:tcPr>
-          <w:p>
-            <w:pPr>
-              <w:pStyle w:val="Contenidodelatabla"/>
-              <w:bidi w:val="0"/>
-              <w:spacing w:before="0" w:after="210"/>
-              <w:rPr>
-                <w:sz w:val="4"/>
-                <w:szCs w:val="4"/>
-              </w:rPr>
-            </w:pPr>
-            <w:r>
-              <w:rPr>
-                <w:sz w:val="4"/>
-                <w:szCs w:val="4"/>
-              </w:rPr>
-            </w:r>
-          </w:p>
-        </w:tc>
-        <w:tc>
-          <w:tcPr>
-            <w:tcW w:w="951" w:type="dxa"/>
-            <w:tcBorders>
-              <w:start w:val="single" w:sz="2" w:space="0" w:color="808080"/>
-              <w:bottom w:val="single" w:sz="2" w:space="0" w:color="808080"/>
-              <w:end w:val="single" w:sz="6" w:space="0" w:color="808080"/>
-            </w:tcBorders>
-            <w:tcMar>
-              <w:start w:w="90" w:type="dxa"/>
-              <w:end w:w="90" w:type="dxa"/>
-            </w:tcMar>
-          </w:tcPr>
-          <w:p>
-            <w:pPr>
-              <w:pStyle w:val="Contenidodelatabla"/>
-              <w:bidi w:val="0"/>
-              <w:spacing w:before="0" w:after="210"/>
-              <w:rPr>
-                <w:sz w:val="4"/>
-                <w:szCs w:val="4"/>
-              </w:rPr>
-            </w:pPr>
-            <w:r>
-              <w:rPr>
-                <w:sz w:val="4"/>
-                <w:szCs w:val="4"/>
-              </w:rPr>
-            </w:r>
-          </w:p>
-        </w:tc>
-        <w:tc>
-          <w:tcPr>
-            <w:tcW w:w="585" w:type="dxa"/>
-            <w:tcBorders>
-              <w:start w:val="single" w:sz="2" w:space="0" w:color="808080"/>
-              <w:bottom w:val="single" w:sz="2" w:space="0" w:color="808080"/>
-              <w:end w:val="single" w:sz="6" w:space="0" w:color="808080"/>
-            </w:tcBorders>
-            <w:tcMar>
-              <w:start w:w="90" w:type="dxa"/>
-              <w:end w:w="90" w:type="dxa"/>
-            </w:tcMar>
-          </w:tcPr>
-          <w:p>
-            <w:pPr>
-              <w:pStyle w:val="Contenidodelatabla"/>
-              <w:bidi w:val="0"/>
-              <w:spacing w:before="0" w:after="210"/>
-              <w:rPr>
-                <w:sz w:val="4"/>
-                <w:szCs w:val="4"/>
-              </w:rPr>
-            </w:pPr>
-            <w:r>
-              <w:rPr>
-                <w:sz w:val="4"/>
-                <w:szCs w:val="4"/>
-              </w:rPr>
-            </w:r>
-          </w:p>
-        </w:tc>
-        <w:tc>
-          <w:tcPr>
-            <w:tcW w:w="1342" w:type="dxa"/>
-            <w:tcBorders>
-              <w:start w:val="single" w:sz="2" w:space="0" w:color="808080"/>
-              <w:bottom w:val="single" w:sz="2" w:space="0" w:color="808080"/>
-              <w:end w:val="single" w:sz="6" w:space="0" w:color="808080"/>
-            </w:tcBorders>
-            <w:tcMar>
-              <w:start w:w="90" w:type="dxa"/>
-              <w:end w:w="90" w:type="dxa"/>
-            </w:tcMar>
-          </w:tcPr>
-          <w:p>
-            <w:pPr>
-              <w:pStyle w:val="Contenidodelatabla"/>
-              <w:bidi w:val="0"/>
-              <w:spacing w:before="0" w:after="210"/>
-              <w:rPr>
-                <w:sz w:val="4"/>
-                <w:szCs w:val="4"/>
-              </w:rPr>
-            </w:pPr>
-            <w:r>
-              <w:rPr>
-                <w:sz w:val="4"/>
-                <w:szCs w:val="4"/>
-              </w:rPr>
+              <w:t>Potencial neto emisor: expansividad y flujo de iniciativa generada.</w:t>
             </w:r>
           </w:p>
         </w:tc>
@@ -11305,15 +10523,53 @@
               <w:spacing w:before="0" w:after="210"/>
               <w:ind w:hanging="0" w:start="0" w:end="0"/>
               <w:jc w:val="center"/>
-              <w:rPr>
-                <w:sz w:val="17"/>
-              </w:rPr>
+              <w:rPr/>
             </w:pPr>
             <w:r>
               <w:rPr>
                 <w:sz w:val="17"/>
               </w:rPr>
-              <w:t>\</w:t>
+              <w:t xml:space="preserve">| </w:t>
+            </w:r>
+            <w:r>
+              <w:rPr>
+                <w:rStyle w:val="Emphasis"/>
+                <w:sz w:val="17"/>
+              </w:rPr>
+              <w:t>D</w:t>
+            </w:r>
+            <w:r>
+              <w:rPr>
+                <w:position w:val="-1"/>
+                <w:sz w:val="17"/>
+              </w:rPr>
+              <w:t>1</w:t>
+            </w:r>
+            <w:r>
+              <w:rPr>
+                <w:sz w:val="17"/>
+              </w:rPr>
+              <w:t xml:space="preserve"> | + | </w:t>
+            </w:r>
+            <w:r>
+              <w:rPr>
+                <w:rStyle w:val="Emphasis"/>
+                <w:sz w:val="17"/>
+              </w:rPr>
+              <w:t>D</w:t>
+            </w:r>
+            <w:r>
+              <w:rPr>
+                <w:position w:val="-1"/>
+                <w:sz w:val="17"/>
+              </w:rPr>
+              <w:t>2</w:t>
+            </w:r>
+            <w:r>
+              <w:rPr>
+                <w:sz w:val="17"/>
+              </w:rPr>
+              <w:t xml:space="preserve"> |</w:t>
             </w:r>
           </w:p>
         </w:tc>
@@ -11343,133 +10599,13 @@
               <w:rPr>
                 <w:sz w:val="17"/>
               </w:rPr>
-              <w:t>D_1\</w:t>
+              <w:t>[0.00, +2.00]</w:t>
             </w:r>
           </w:p>
         </w:tc>
         <w:tc>
           <w:tcPr>
-            <w:tcW w:w="1759" w:type="dxa"/>
-            <w:tcBorders>
-              <w:top w:val="single" w:sz="2" w:space="0" w:color="CBD5E0"/>
-              <w:start w:val="single" w:sz="2" w:space="0" w:color="CBD5E0"/>
-              <w:bottom w:val="single" w:sz="2" w:space="0" w:color="CBD5E0"/>
-              <w:end w:val="single" w:sz="2" w:space="0" w:color="CBD5E0"/>
-            </w:tcBorders>
-            <w:vAlign w:val="center"/>
-          </w:tcPr>
-          <w:p>
-            <w:pPr>
-              <w:pStyle w:val="Contenidodelatabla"/>
-              <w:bidi w:val="0"/>
-              <w:spacing w:before="0" w:after="210"/>
-              <w:ind w:hanging="0" w:start="0" w:end="0"/>
-              <w:jc w:val="center"/>
-              <w:rPr>
-                <w:sz w:val="17"/>
-              </w:rPr>
-            </w:pPr>
-            <w:r>
-              <w:rPr>
-                <w:sz w:val="17"/>
-              </w:rPr>
-              <w:t>+ \</w:t>
-            </w:r>
-          </w:p>
-        </w:tc>
-        <w:tc>
-          <w:tcPr>
-            <w:tcW w:w="585" w:type="dxa"/>
-            <w:tcBorders>
-              <w:top w:val="single" w:sz="2" w:space="0" w:color="CBD5E0"/>
-              <w:start w:val="single" w:sz="2" w:space="0" w:color="CBD5E0"/>
-              <w:bottom w:val="single" w:sz="2" w:space="0" w:color="CBD5E0"/>
-              <w:end w:val="single" w:sz="2" w:space="0" w:color="CBD5E0"/>
-            </w:tcBorders>
-            <w:vAlign w:val="center"/>
-          </w:tcPr>
-          <w:p>
-            <w:pPr>
-              <w:pStyle w:val="Contenidodelatabla"/>
-              <w:bidi w:val="0"/>
-              <w:spacing w:before="0" w:after="210"/>
-              <w:ind w:hanging="0" w:start="0" w:end="0"/>
-              <w:jc w:val="center"/>
-              <w:rPr>
-                <w:sz w:val="17"/>
-              </w:rPr>
-            </w:pPr>
-            <w:r>
-              <w:rPr>
-                <w:sz w:val="17"/>
-              </w:rPr>
-              <w:t>D_2\</w:t>
-            </w:r>
-          </w:p>
-        </w:tc>
-        <w:tc>
-          <w:tcPr>
-            <w:tcW w:w="951" w:type="dxa"/>
-            <w:tcBorders>
-              <w:top w:val="single" w:sz="2" w:space="0" w:color="CBD5E0"/>
-              <w:start w:val="single" w:sz="2" w:space="0" w:color="CBD5E0"/>
-              <w:bottom w:val="single" w:sz="2" w:space="0" w:color="CBD5E0"/>
-              <w:end w:val="single" w:sz="2" w:space="0" w:color="CBD5E0"/>
-            </w:tcBorders>
-            <w:vAlign w:val="center"/>
-          </w:tcPr>
-          <w:p>
-            <w:pPr>
-              <w:pStyle w:val="Contenidodelatabla"/>
-              <w:bidi w:val="0"/>
-              <w:spacing w:before="0" w:after="210"/>
-              <w:ind w:hanging="0" w:start="0" w:end="0"/>
-              <w:rPr>
-                <w:sz w:val="4"/>
-                <w:szCs w:val="4"/>
-              </w:rPr>
-            </w:pPr>
-            <w:r>
-              <w:rPr>
-                <w:sz w:val="4"/>
-                <w:szCs w:val="4"/>
-              </w:rPr>
-            </w:r>
-          </w:p>
-        </w:tc>
-        <w:tc>
-          <w:tcPr>
-            <w:tcW w:w="585" w:type="dxa"/>
-            <w:tcBorders>
-              <w:top w:val="single" w:sz="2" w:space="0" w:color="CBD5E0"/>
-              <w:start w:val="single" w:sz="2" w:space="0" w:color="CBD5E0"/>
-              <w:bottom w:val="single" w:sz="2" w:space="0" w:color="CBD5E0"/>
-              <w:end w:val="single" w:sz="2" w:space="0" w:color="CBD5E0"/>
-            </w:tcBorders>
-            <w:vAlign w:val="center"/>
-          </w:tcPr>
-          <w:p>
-            <w:pPr>
-              <w:pStyle w:val="Contenidodelatabla"/>
-              <w:bidi w:val="0"/>
-              <w:spacing w:before="0" w:after="210"/>
-              <w:ind w:hanging="0" w:start="0" w:end="0"/>
-              <w:jc w:val="center"/>
-              <w:rPr>
-                <w:sz w:val="17"/>
-              </w:rPr>
-            </w:pPr>
-            <w:r>
-              <w:rPr>
-                <w:sz w:val="17"/>
-              </w:rPr>
-              <w:t>[0.00, +2.00]</w:t>
-            </w:r>
-          </w:p>
-        </w:tc>
-        <w:tc>
-          <w:tcPr>
-            <w:tcW w:w="1342" w:type="dxa"/>
+            <w:tcW w:w="1774" w:type="dxa"/>
             <w:tcBorders>
               <w:top w:val="single" w:sz="2" w:space="0" w:color="CBD5E0"/>
               <w:start w:val="single" w:sz="2" w:space="0" w:color="CBD5E0"/>
@@ -11689,7 +10825,7 @@
         </w:tc>
         <w:tc>
           <w:tcPr>
-            <w:tcW w:w="1759" w:type="dxa"/>
+            <w:tcW w:w="1774" w:type="dxa"/>
             <w:tcBorders>
               <w:top w:val="single" w:sz="2" w:space="0" w:color="CBD5E0"/>
               <w:start w:val="single" w:sz="2" w:space="0" w:color="CBD5E0"/>
@@ -11714,38 +10850,6 @@
                 <w:sz w:val="17"/>
               </w:rPr>
               <w:t>Potencial neto receptor: estatus global inducido por el entorno social.</w:t>
-            </w:r>
-          </w:p>
-        </w:tc>
-        <w:tc>
-          <w:tcPr>
-            <w:tcW w:w="3463" w:type="dxa"/>
-            <w:gridSpan w:val="4"/>
-            <w:tcBorders>
-              <w:start w:val="single" w:sz="2" w:space="0" w:color="808080"/>
-              <w:bottom w:val="single" w:sz="2" w:space="0" w:color="808080"/>
-              <w:end w:val="single" w:sz="6" w:space="0" w:color="808080"/>
-            </w:tcBorders>
-            <w:tcMar>
-              <w:start w:w="90" w:type="dxa"/>
-              <w:end w:w="90" w:type="dxa"/>
-            </w:tcMar>
-          </w:tcPr>
-          <w:p>
-            <w:pPr>
-              <w:pStyle w:val="Contenidodelatabla"/>
-              <w:bidi w:val="0"/>
-              <w:spacing w:before="0" w:after="210"/>
-              <w:rPr>
-                <w:sz w:val="4"/>
-                <w:szCs w:val="4"/>
-              </w:rPr>
-            </w:pPr>
-            <w:r>
-              <w:rPr>
-                <w:sz w:val="4"/>
-                <w:szCs w:val="4"/>
-              </w:rPr>
             </w:r>
           </w:p>
         </w:tc>
@@ -11871,15 +10975,53 @@
               <w:spacing w:before="0" w:after="210"/>
               <w:ind w:hanging="0" w:start="0" w:end="0"/>
               <w:jc w:val="center"/>
-              <w:rPr>
-                <w:sz w:val="17"/>
-              </w:rPr>
+              <w:rPr/>
             </w:pPr>
             <w:r>
               <w:rPr>
                 <w:sz w:val="17"/>
               </w:rPr>
-              <w:t>\</w:t>
+              <w:t xml:space="preserve">| </w:t>
+            </w:r>
+            <w:r>
+              <w:rPr>
+                <w:rStyle w:val="Emphasis"/>
+                <w:sz w:val="17"/>
+              </w:rPr>
+              <w:t>D</w:t>
+            </w:r>
+            <w:r>
+              <w:rPr>
+                <w:position w:val="-1"/>
+                <w:sz w:val="17"/>
+              </w:rPr>
+              <w:t>3</w:t>
+            </w:r>
+            <w:r>
+              <w:rPr>
+                <w:sz w:val="17"/>
+              </w:rPr>
+              <w:t xml:space="preserve"> | + | </w:t>
+            </w:r>
+            <w:r>
+              <w:rPr>
+                <w:rStyle w:val="Emphasis"/>
+                <w:sz w:val="17"/>
+              </w:rPr>
+              <w:t>D</w:t>
+            </w:r>
+            <w:r>
+              <w:rPr>
+                <w:position w:val="-1"/>
+                <w:sz w:val="17"/>
+              </w:rPr>
+              <w:t>4</w:t>
+            </w:r>
+            <w:r>
+              <w:rPr>
+                <w:sz w:val="17"/>
+              </w:rPr>
+              <w:t xml:space="preserve"> |</w:t>
             </w:r>
           </w:p>
         </w:tc>
@@ -11909,133 +11051,13 @@
               <w:rPr>
                 <w:sz w:val="17"/>
               </w:rPr>
-              <w:t>D_3\</w:t>
+              <w:t>[0.00, +2.00]</w:t>
             </w:r>
           </w:p>
         </w:tc>
         <w:tc>
           <w:tcPr>
-            <w:tcW w:w="1759" w:type="dxa"/>
-            <w:tcBorders>
-              <w:top w:val="single" w:sz="2" w:space="0" w:color="CBD5E0"/>
-              <w:start w:val="single" w:sz="2" w:space="0" w:color="CBD5E0"/>
-              <w:bottom w:val="single" w:sz="2" w:space="0" w:color="CBD5E0"/>
-              <w:end w:val="single" w:sz="2" w:space="0" w:color="CBD5E0"/>
-            </w:tcBorders>
-            <w:vAlign w:val="center"/>
-          </w:tcPr>
-          <w:p>
-            <w:pPr>
-              <w:pStyle w:val="Contenidodelatabla"/>
-              <w:bidi w:val="0"/>
-              <w:spacing w:before="0" w:after="210"/>
-              <w:ind w:hanging="0" w:start="0" w:end="0"/>
-              <w:jc w:val="center"/>
-              <w:rPr>
-                <w:sz w:val="17"/>
-              </w:rPr>
-            </w:pPr>
-            <w:r>
-              <w:rPr>
-                <w:sz w:val="17"/>
-              </w:rPr>
-              <w:t>+ \</w:t>
-            </w:r>
-          </w:p>
-        </w:tc>
-        <w:tc>
-          <w:tcPr>
-            <w:tcW w:w="585" w:type="dxa"/>
-            <w:tcBorders>
-              <w:top w:val="single" w:sz="2" w:space="0" w:color="CBD5E0"/>
-              <w:start w:val="single" w:sz="2" w:space="0" w:color="CBD5E0"/>
-              <w:bottom w:val="single" w:sz="2" w:space="0" w:color="CBD5E0"/>
-              <w:end w:val="single" w:sz="2" w:space="0" w:color="CBD5E0"/>
-            </w:tcBorders>
-            <w:vAlign w:val="center"/>
-          </w:tcPr>
-          <w:p>
-            <w:pPr>
-              <w:pStyle w:val="Contenidodelatabla"/>
-              <w:bidi w:val="0"/>
-              <w:spacing w:before="0" w:after="210"/>
-              <w:ind w:hanging="0" w:start="0" w:end="0"/>
-              <w:jc w:val="center"/>
-              <w:rPr>
-                <w:sz w:val="17"/>
-              </w:rPr>
-            </w:pPr>
-            <w:r>
-              <w:rPr>
-                <w:sz w:val="17"/>
-              </w:rPr>
-              <w:t>D_4\</w:t>
-            </w:r>
-          </w:p>
-        </w:tc>
-        <w:tc>
-          <w:tcPr>
-            <w:tcW w:w="951" w:type="dxa"/>
-            <w:tcBorders>
-              <w:top w:val="single" w:sz="2" w:space="0" w:color="CBD5E0"/>
-              <w:start w:val="single" w:sz="2" w:space="0" w:color="CBD5E0"/>
-              <w:bottom w:val="single" w:sz="2" w:space="0" w:color="CBD5E0"/>
-              <w:end w:val="single" w:sz="2" w:space="0" w:color="CBD5E0"/>
-            </w:tcBorders>
-            <w:vAlign w:val="center"/>
-          </w:tcPr>
-          <w:p>
-            <w:pPr>
-              <w:pStyle w:val="Contenidodelatabla"/>
-              <w:bidi w:val="0"/>
-              <w:spacing w:before="0" w:after="210"/>
-              <w:ind w:hanging="0" w:start="0" w:end="0"/>
-              <w:rPr>
-                <w:sz w:val="4"/>
-                <w:szCs w:val="4"/>
-              </w:rPr>
-            </w:pPr>
-            <w:r>
-              <w:rPr>
-                <w:sz w:val="4"/>
-                <w:szCs w:val="4"/>
-              </w:rPr>
-            </w:r>
-          </w:p>
-        </w:tc>
-        <w:tc>
-          <w:tcPr>
-            <w:tcW w:w="585" w:type="dxa"/>
-            <w:tcBorders>
-              <w:top w:val="single" w:sz="2" w:space="0" w:color="CBD5E0"/>
-              <w:start w:val="single" w:sz="2" w:space="0" w:color="CBD5E0"/>
-              <w:bottom w:val="single" w:sz="2" w:space="0" w:color="CBD5E0"/>
-              <w:end w:val="single" w:sz="2" w:space="0" w:color="CBD5E0"/>
-            </w:tcBorders>
-            <w:vAlign w:val="center"/>
-          </w:tcPr>
-          <w:p>
-            <w:pPr>
-              <w:pStyle w:val="Contenidodelatabla"/>
-              <w:bidi w:val="0"/>
-              <w:spacing w:before="0" w:after="210"/>
-              <w:ind w:hanging="0" w:start="0" w:end="0"/>
-              <w:jc w:val="center"/>
-              <w:rPr>
-                <w:sz w:val="17"/>
-              </w:rPr>
-            </w:pPr>
-            <w:r>
-              <w:rPr>
-                <w:sz w:val="17"/>
-              </w:rPr>
-              <w:t>[0.00, +2.00]</w:t>
-            </w:r>
-          </w:p>
-        </w:tc>
-        <w:tc>
-          <w:tcPr>
-            <w:tcW w:w="1342" w:type="dxa"/>
+            <w:tcW w:w="1774" w:type="dxa"/>
             <w:tcBorders>
               <w:top w:val="single" w:sz="2" w:space="0" w:color="CBD5E0"/>
               <w:start w:val="single" w:sz="2" w:space="0" w:color="CBD5E0"/>
@@ -12255,7 +11277,7 @@
         </w:tc>
         <w:tc>
           <w:tcPr>
-            <w:tcW w:w="1759" w:type="dxa"/>
+            <w:tcW w:w="1774" w:type="dxa"/>
             <w:tcBorders>
               <w:top w:val="single" w:sz="2" w:space="0" w:color="CBD5E0"/>
               <w:start w:val="single" w:sz="2" w:space="0" w:color="CBD5E0"/>
@@ -12280,38 +11302,6 @@
                 <w:sz w:val="17"/>
               </w:rPr>
               <w:t>Saldo cognitivo: clima de confianza y presunción compartida.</w:t>
-            </w:r>
-          </w:p>
-        </w:tc>
-        <w:tc>
-          <w:tcPr>
-            <w:tcW w:w="3463" w:type="dxa"/>
-            <w:gridSpan w:val="4"/>
-            <w:tcBorders>
-              <w:start w:val="single" w:sz="2" w:space="0" w:color="808080"/>
-              <w:bottom w:val="single" w:sz="2" w:space="0" w:color="808080"/>
-              <w:end w:val="single" w:sz="6" w:space="0" w:color="808080"/>
-            </w:tcBorders>
-            <w:tcMar>
-              <w:start w:w="90" w:type="dxa"/>
-              <w:end w:w="90" w:type="dxa"/>
-            </w:tcMar>
-          </w:tcPr>
-          <w:p>
-            <w:pPr>
-              <w:pStyle w:val="Contenidodelatabla"/>
-              <w:bidi w:val="0"/>
-              <w:spacing w:before="0" w:after="210"/>
-              <w:rPr>
-                <w:sz w:val="4"/>
-                <w:szCs w:val="4"/>
-              </w:rPr>
-            </w:pPr>
-            <w:r>
-              <w:rPr>
-                <w:sz w:val="4"/>
-                <w:szCs w:val="4"/>
-              </w:rPr>
             </w:r>
           </w:p>
         </w:tc>
@@ -12437,15 +11427,53 @@
               <w:spacing w:before="0" w:after="210"/>
               <w:ind w:hanging="0" w:start="0" w:end="0"/>
               <w:jc w:val="center"/>
-              <w:rPr>
-                <w:sz w:val="17"/>
-              </w:rPr>
+              <w:rPr/>
             </w:pPr>
             <w:r>
               <w:rPr>
                 <w:sz w:val="17"/>
               </w:rPr>
-              <w:t>\</w:t>
+              <w:t xml:space="preserve">| </w:t>
+            </w:r>
+            <w:r>
+              <w:rPr>
+                <w:rStyle w:val="Emphasis"/>
+                <w:sz w:val="17"/>
+              </w:rPr>
+              <w:t>D</w:t>
+            </w:r>
+            <w:r>
+              <w:rPr>
+                <w:position w:val="-1"/>
+                <w:sz w:val="17"/>
+              </w:rPr>
+              <w:t>1</w:t>
+            </w:r>
+            <w:r>
+              <w:rPr>
+                <w:sz w:val="17"/>
+              </w:rPr>
+              <w:t xml:space="preserve"> | + | </w:t>
+            </w:r>
+            <w:r>
+              <w:rPr>
+                <w:rStyle w:val="Emphasis"/>
+                <w:sz w:val="17"/>
+              </w:rPr>
+              <w:t>D</w:t>
+            </w:r>
+            <w:r>
+              <w:rPr>
+                <w:position w:val="-1"/>
+                <w:sz w:val="17"/>
+              </w:rPr>
+              <w:t>4</w:t>
+            </w:r>
+            <w:r>
+              <w:rPr>
+                <w:sz w:val="17"/>
+              </w:rPr>
+              <w:t xml:space="preserve"> |</w:t>
             </w:r>
           </w:p>
         </w:tc>
@@ -12475,13 +11503,13 @@
               <w:rPr>
                 <w:sz w:val="17"/>
               </w:rPr>
-              <w:t>D_1\</w:t>
+              <w:t>[0.00, +2.00]</w:t>
             </w:r>
           </w:p>
         </w:tc>
         <w:tc>
           <w:tcPr>
-            <w:tcW w:w="1759" w:type="dxa"/>
+            <w:tcW w:w="1774" w:type="dxa"/>
             <w:tcBorders>
               <w:top w:val="single" w:sz="2" w:space="0" w:color="CBD5E0"/>
               <w:start w:val="single" w:sz="2" w:space="0" w:color="CBD5E0"/>
@@ -12505,127 +11533,7 @@
               <w:rPr>
                 <w:sz w:val="17"/>
               </w:rPr>
-              <w:t>+ \</w:t>
-            </w:r>
-          </w:p>
-        </w:tc>
-        <w:tc>
-          <w:tcPr>
-            <w:tcW w:w="585" w:type="dxa"/>
-            <w:tcBorders>
-              <w:top w:val="single" w:sz="2" w:space="0" w:color="CBD5E0"/>
-              <w:start w:val="single" w:sz="2" w:space="0" w:color="CBD5E0"/>
-              <w:bottom w:val="single" w:sz="2" w:space="0" w:color="CBD5E0"/>
-              <w:end w:val="single" w:sz="2" w:space="0" w:color="CBD5E0"/>
-            </w:tcBorders>
-            <w:vAlign w:val="center"/>
-          </w:tcPr>
-          <w:p>
-            <w:pPr>
-              <w:pStyle w:val="Contenidodelatabla"/>
-              <w:bidi w:val="0"/>
-              <w:spacing w:before="0" w:after="210"/>
-              <w:ind w:hanging="0" w:start="0" w:end="0"/>
-              <w:jc w:val="center"/>
-              <w:rPr>
-                <w:sz w:val="17"/>
-              </w:rPr>
-            </w:pPr>
-            <w:r>
-              <w:rPr>
-                <w:sz w:val="17"/>
-              </w:rPr>
-              <w:t>D_4\</w:t>
-            </w:r>
-          </w:p>
-        </w:tc>
-        <w:tc>
-          <w:tcPr>
-            <w:tcW w:w="951" w:type="dxa"/>
-            <w:tcBorders>
-              <w:top w:val="single" w:sz="2" w:space="0" w:color="CBD5E0"/>
-              <w:start w:val="single" w:sz="2" w:space="0" w:color="CBD5E0"/>
-              <w:bottom w:val="single" w:sz="2" w:space="0" w:color="CBD5E0"/>
-              <w:end w:val="single" w:sz="2" w:space="0" w:color="CBD5E0"/>
-            </w:tcBorders>
-            <w:vAlign w:val="center"/>
-          </w:tcPr>
-          <w:p>
-            <w:pPr>
-              <w:pStyle w:val="Contenidodelatabla"/>
-              <w:bidi w:val="0"/>
-              <w:spacing w:before="0" w:after="210"/>
-              <w:ind w:hanging="0" w:start="0" w:end="0"/>
-              <w:rPr>
-                <w:sz w:val="4"/>
-                <w:szCs w:val="4"/>
-              </w:rPr>
-            </w:pPr>
-            <w:r>
-              <w:rPr>
-                <w:sz w:val="4"/>
-                <w:szCs w:val="4"/>
-              </w:rPr>
-            </w:r>
-          </w:p>
-        </w:tc>
-        <w:tc>
-          <w:tcPr>
-            <w:tcW w:w="585" w:type="dxa"/>
-            <w:tcBorders>
-              <w:top w:val="single" w:sz="2" w:space="0" w:color="CBD5E0"/>
-              <w:start w:val="single" w:sz="2" w:space="0" w:color="CBD5E0"/>
-              <w:bottom w:val="single" w:sz="2" w:space="0" w:color="CBD5E0"/>
-              <w:end w:val="single" w:sz="2" w:space="0" w:color="CBD5E0"/>
-            </w:tcBorders>
-            <w:vAlign w:val="center"/>
-          </w:tcPr>
-          <w:p>
-            <w:pPr>
-              <w:pStyle w:val="Contenidodelatabla"/>
-              <w:bidi w:val="0"/>
-              <w:spacing w:before="0" w:after="210"/>
-              <w:ind w:hanging="0" w:start="0" w:end="0"/>
-              <w:jc w:val="center"/>
-              <w:rPr>
-                <w:sz w:val="17"/>
-              </w:rPr>
-            </w:pPr>
-            <w:r>
-              <w:rPr>
-                <w:sz w:val="17"/>
-              </w:rPr>
-              <w:t>[0.00, +2.00]</w:t>
-            </w:r>
-          </w:p>
-        </w:tc>
-        <w:tc>
-          <w:tcPr>
-            <w:tcW w:w="1342" w:type="dxa"/>
-            <w:tcBorders>
-              <w:top w:val="single" w:sz="2" w:space="0" w:color="CBD5E0"/>
-              <w:start w:val="single" w:sz="2" w:space="0" w:color="CBD5E0"/>
-              <w:bottom w:val="single" w:sz="2" w:space="0" w:color="CBD5E0"/>
-              <w:end w:val="single" w:sz="2" w:space="0" w:color="CBD5E0"/>
-            </w:tcBorders>
-            <w:vAlign w:val="center"/>
-          </w:tcPr>
-          <w:p>
-            <w:pPr>
-              <w:pStyle w:val="Contenidodelatabla"/>
-              <w:bidi w:val="0"/>
-              <w:spacing w:before="0" w:after="210"/>
-              <w:ind w:hanging="0" w:start="0" w:end="0"/>
-              <w:jc w:val="center"/>
-              <w:rPr>
-                <w:sz w:val="17"/>
-              </w:rPr>
-            </w:pPr>
-            <w:r>
-              <w:rPr>
-                <w:sz w:val="17"/>
-              </w:rPr>
-              <w:t>Masa bruta cognitiva: volumen de rumiación mental y carga prospectiva.</w:t>
+              <w:t>Masa bruta cognitiva: volumen de actividad cognitiva y carga prospectiva.</w:t>
             </w:r>
           </w:p>
         </w:tc>
@@ -12821,7 +11729,7 @@
         </w:tc>
         <w:tc>
           <w:tcPr>
-            <w:tcW w:w="1759" w:type="dxa"/>
+            <w:tcW w:w="1774" w:type="dxa"/>
             <w:tcBorders>
               <w:top w:val="single" w:sz="2" w:space="0" w:color="CBD5E0"/>
               <w:start w:val="single" w:sz="2" w:space="0" w:color="CBD5E0"/>
@@ -12846,38 +11754,6 @@
                 <w:sz w:val="17"/>
               </w:rPr>
               <w:t>Saldo fáctico: verdad objetiva de elecciones y rechazos reales.</w:t>
-            </w:r>
-          </w:p>
-        </w:tc>
-        <w:tc>
-          <w:tcPr>
-            <w:tcW w:w="3463" w:type="dxa"/>
-            <w:gridSpan w:val="4"/>
-            <w:tcBorders>
-              <w:start w:val="single" w:sz="2" w:space="0" w:color="808080"/>
-              <w:bottom w:val="single" w:sz="2" w:space="0" w:color="808080"/>
-              <w:end w:val="single" w:sz="6" w:space="0" w:color="808080"/>
-            </w:tcBorders>
-            <w:tcMar>
-              <w:start w:w="90" w:type="dxa"/>
-              <w:end w:w="90" w:type="dxa"/>
-            </w:tcMar>
-          </w:tcPr>
-          <w:p>
-            <w:pPr>
-              <w:pStyle w:val="Contenidodelatabla"/>
-              <w:bidi w:val="0"/>
-              <w:spacing w:before="0" w:after="210"/>
-              <w:rPr>
-                <w:sz w:val="4"/>
-                <w:szCs w:val="4"/>
-              </w:rPr>
-            </w:pPr>
-            <w:r>
-              <w:rPr>
-                <w:sz w:val="4"/>
-                <w:szCs w:val="4"/>
-              </w:rPr>
             </w:r>
           </w:p>
         </w:tc>
@@ -13003,15 +11879,53 @@
               <w:spacing w:before="0" w:after="210"/>
               <w:ind w:hanging="0" w:start="0" w:end="0"/>
               <w:jc w:val="center"/>
-              <w:rPr>
-                <w:sz w:val="17"/>
-              </w:rPr>
+              <w:rPr/>
             </w:pPr>
             <w:r>
               <w:rPr>
                 <w:sz w:val="17"/>
               </w:rPr>
-              <w:t>\</w:t>
+              <w:t xml:space="preserve">| </w:t>
+            </w:r>
+            <w:r>
+              <w:rPr>
+                <w:rStyle w:val="Emphasis"/>
+                <w:sz w:val="17"/>
+              </w:rPr>
+              <w:t>D</w:t>
+            </w:r>
+            <w:r>
+              <w:rPr>
+                <w:position w:val="-1"/>
+                <w:sz w:val="17"/>
+              </w:rPr>
+              <w:t>2</w:t>
+            </w:r>
+            <w:r>
+              <w:rPr>
+                <w:sz w:val="17"/>
+              </w:rPr>
+              <w:t xml:space="preserve"> | + | </w:t>
+            </w:r>
+            <w:r>
+              <w:rPr>
+                <w:rStyle w:val="Emphasis"/>
+                <w:sz w:val="17"/>
+              </w:rPr>
+              <w:t>D</w:t>
+            </w:r>
+            <w:r>
+              <w:rPr>
+                <w:position w:val="-1"/>
+                <w:sz w:val="17"/>
+              </w:rPr>
+              <w:t>3</w:t>
+            </w:r>
+            <w:r>
+              <w:rPr>
+                <w:sz w:val="17"/>
+              </w:rPr>
+              <w:t xml:space="preserve"> |</w:t>
             </w:r>
           </w:p>
         </w:tc>
@@ -13041,133 +11955,13 @@
               <w:rPr>
                 <w:sz w:val="17"/>
               </w:rPr>
-              <w:t>D_2\</w:t>
+              <w:t>[0.00, +2.00]</w:t>
             </w:r>
           </w:p>
         </w:tc>
         <w:tc>
           <w:tcPr>
-            <w:tcW w:w="1759" w:type="dxa"/>
-            <w:tcBorders>
-              <w:top w:val="single" w:sz="2" w:space="0" w:color="CBD5E0"/>
-              <w:start w:val="single" w:sz="2" w:space="0" w:color="CBD5E0"/>
-              <w:bottom w:val="single" w:sz="2" w:space="0" w:color="CBD5E0"/>
-              <w:end w:val="single" w:sz="2" w:space="0" w:color="CBD5E0"/>
-            </w:tcBorders>
-            <w:vAlign w:val="center"/>
-          </w:tcPr>
-          <w:p>
-            <w:pPr>
-              <w:pStyle w:val="Contenidodelatabla"/>
-              <w:bidi w:val="0"/>
-              <w:spacing w:before="0" w:after="210"/>
-              <w:ind w:hanging="0" w:start="0" w:end="0"/>
-              <w:jc w:val="center"/>
-              <w:rPr>
-                <w:sz w:val="17"/>
-              </w:rPr>
-            </w:pPr>
-            <w:r>
-              <w:rPr>
-                <w:sz w:val="17"/>
-              </w:rPr>
-              <w:t>+ \</w:t>
-            </w:r>
-          </w:p>
-        </w:tc>
-        <w:tc>
-          <w:tcPr>
-            <w:tcW w:w="585" w:type="dxa"/>
-            <w:tcBorders>
-              <w:top w:val="single" w:sz="2" w:space="0" w:color="CBD5E0"/>
-              <w:start w:val="single" w:sz="2" w:space="0" w:color="CBD5E0"/>
-              <w:bottom w:val="single" w:sz="2" w:space="0" w:color="CBD5E0"/>
-              <w:end w:val="single" w:sz="2" w:space="0" w:color="CBD5E0"/>
-            </w:tcBorders>
-            <w:vAlign w:val="center"/>
-          </w:tcPr>
-          <w:p>
-            <w:pPr>
-              <w:pStyle w:val="Contenidodelatabla"/>
-              <w:bidi w:val="0"/>
-              <w:spacing w:before="0" w:after="210"/>
-              <w:ind w:hanging="0" w:start="0" w:end="0"/>
-              <w:jc w:val="center"/>
-              <w:rPr>
-                <w:sz w:val="17"/>
-              </w:rPr>
-            </w:pPr>
-            <w:r>
-              <w:rPr>
-                <w:sz w:val="17"/>
-              </w:rPr>
-              <w:t>D_3\</w:t>
-            </w:r>
-          </w:p>
-        </w:tc>
-        <w:tc>
-          <w:tcPr>
-            <w:tcW w:w="951" w:type="dxa"/>
-            <w:tcBorders>
-              <w:top w:val="single" w:sz="2" w:space="0" w:color="CBD5E0"/>
-              <w:start w:val="single" w:sz="2" w:space="0" w:color="CBD5E0"/>
-              <w:bottom w:val="single" w:sz="2" w:space="0" w:color="CBD5E0"/>
-              <w:end w:val="single" w:sz="2" w:space="0" w:color="CBD5E0"/>
-            </w:tcBorders>
-            <w:vAlign w:val="center"/>
-          </w:tcPr>
-          <w:p>
-            <w:pPr>
-              <w:pStyle w:val="Contenidodelatabla"/>
-              <w:bidi w:val="0"/>
-              <w:spacing w:before="0" w:after="210"/>
-              <w:ind w:hanging="0" w:start="0" w:end="0"/>
-              <w:rPr>
-                <w:sz w:val="4"/>
-                <w:szCs w:val="4"/>
-              </w:rPr>
-            </w:pPr>
-            <w:r>
-              <w:rPr>
-                <w:sz w:val="4"/>
-                <w:szCs w:val="4"/>
-              </w:rPr>
-            </w:r>
-          </w:p>
-        </w:tc>
-        <w:tc>
-          <w:tcPr>
-            <w:tcW w:w="585" w:type="dxa"/>
-            <w:tcBorders>
-              <w:top w:val="single" w:sz="2" w:space="0" w:color="CBD5E0"/>
-              <w:start w:val="single" w:sz="2" w:space="0" w:color="CBD5E0"/>
-              <w:bottom w:val="single" w:sz="2" w:space="0" w:color="CBD5E0"/>
-              <w:end w:val="single" w:sz="2" w:space="0" w:color="CBD5E0"/>
-            </w:tcBorders>
-            <w:vAlign w:val="center"/>
-          </w:tcPr>
-          <w:p>
-            <w:pPr>
-              <w:pStyle w:val="Contenidodelatabla"/>
-              <w:bidi w:val="0"/>
-              <w:spacing w:before="0" w:after="210"/>
-              <w:ind w:hanging="0" w:start="0" w:end="0"/>
-              <w:jc w:val="center"/>
-              <w:rPr>
-                <w:sz w:val="17"/>
-              </w:rPr>
-            </w:pPr>
-            <w:r>
-              <w:rPr>
-                <w:sz w:val="17"/>
-              </w:rPr>
-              <w:t>[0.00, +2.00]</w:t>
-            </w:r>
-          </w:p>
-        </w:tc>
-        <w:tc>
-          <w:tcPr>
-            <w:tcW w:w="1342" w:type="dxa"/>
+            <w:tcW w:w="1774" w:type="dxa"/>
             <w:tcBorders>
               <w:top w:val="single" w:sz="2" w:space="0" w:color="CBD5E0"/>
               <w:start w:val="single" w:sz="2" w:space="0" w:color="CBD5E0"/>
@@ -13381,7 +12175,7 @@
         </w:tc>
         <w:tc>
           <w:tcPr>
-            <w:tcW w:w="1759" w:type="dxa"/>
+            <w:tcW w:w="1774" w:type="dxa"/>
             <w:tcBorders>
               <w:top w:val="single" w:sz="2" w:space="0" w:color="CBD5E0"/>
               <w:start w:val="single" w:sz="2" w:space="0" w:color="CBD5E0"/>
@@ -13406,38 +12200,6 @@
                 <w:sz w:val="17"/>
               </w:rPr>
               <w:t>Saldo de realismo: confirmación vs. desilusión (lo esperado vs. lo recibido).</w:t>
-            </w:r>
-          </w:p>
-        </w:tc>
-        <w:tc>
-          <w:tcPr>
-            <w:tcW w:w="3463" w:type="dxa"/>
-            <w:gridSpan w:val="4"/>
-            <w:tcBorders>
-              <w:start w:val="single" w:sz="2" w:space="0" w:color="808080"/>
-              <w:bottom w:val="single" w:sz="2" w:space="0" w:color="808080"/>
-              <w:end w:val="single" w:sz="6" w:space="0" w:color="808080"/>
-            </w:tcBorders>
-            <w:tcMar>
-              <w:start w:w="90" w:type="dxa"/>
-              <w:end w:w="90" w:type="dxa"/>
-            </w:tcMar>
-          </w:tcPr>
-          <w:p>
-            <w:pPr>
-              <w:pStyle w:val="Contenidodelatabla"/>
-              <w:bidi w:val="0"/>
-              <w:spacing w:before="0" w:after="210"/>
-              <w:rPr>
-                <w:sz w:val="4"/>
-                <w:szCs w:val="4"/>
-              </w:rPr>
-            </w:pPr>
-            <w:r>
-              <w:rPr>
-                <w:sz w:val="4"/>
-                <w:szCs w:val="4"/>
-              </w:rPr>
             </w:r>
           </w:p>
         </w:tc>
@@ -13557,15 +12319,53 @@
               <w:spacing w:before="0" w:after="210"/>
               <w:ind w:hanging="0" w:start="0" w:end="0"/>
               <w:jc w:val="center"/>
-              <w:rPr>
-                <w:sz w:val="17"/>
-              </w:rPr>
+              <w:rPr/>
             </w:pPr>
             <w:r>
               <w:rPr>
                 <w:sz w:val="17"/>
               </w:rPr>
-              <w:t>\</w:t>
+              <w:t xml:space="preserve">| </w:t>
+            </w:r>
+            <w:r>
+              <w:rPr>
+                <w:rStyle w:val="Emphasis"/>
+                <w:sz w:val="17"/>
+              </w:rPr>
+              <w:t>D</w:t>
+            </w:r>
+            <w:r>
+              <w:rPr>
+                <w:position w:val="-1"/>
+                <w:sz w:val="17"/>
+              </w:rPr>
+              <w:t>1</w:t>
+            </w:r>
+            <w:r>
+              <w:rPr>
+                <w:sz w:val="17"/>
+              </w:rPr>
+              <w:t xml:space="preserve"> | + | </w:t>
+            </w:r>
+            <w:r>
+              <w:rPr>
+                <w:rStyle w:val="Emphasis"/>
+                <w:sz w:val="17"/>
+              </w:rPr>
+              <w:t>D</w:t>
+            </w:r>
+            <w:r>
+              <w:rPr>
+                <w:position w:val="-1"/>
+                <w:sz w:val="17"/>
+              </w:rPr>
+              <w:t>3</w:t>
+            </w:r>
+            <w:r>
+              <w:rPr>
+                <w:sz w:val="17"/>
+              </w:rPr>
+              <w:t xml:space="preserve"> |</w:t>
             </w:r>
           </w:p>
         </w:tc>
@@ -13595,133 +12395,13 @@
               <w:rPr>
                 <w:sz w:val="17"/>
               </w:rPr>
-              <w:t>D_1\</w:t>
+              <w:t>[0.00, +2.00]</w:t>
             </w:r>
           </w:p>
         </w:tc>
         <w:tc>
           <w:tcPr>
-            <w:tcW w:w="1759" w:type="dxa"/>
-            <w:tcBorders>
-              <w:top w:val="single" w:sz="2" w:space="0" w:color="CBD5E0"/>
-              <w:start w:val="single" w:sz="2" w:space="0" w:color="CBD5E0"/>
-              <w:bottom w:val="single" w:sz="2" w:space="0" w:color="CBD5E0"/>
-              <w:end w:val="single" w:sz="2" w:space="0" w:color="CBD5E0"/>
-            </w:tcBorders>
-            <w:vAlign w:val="center"/>
-          </w:tcPr>
-          <w:p>
-            <w:pPr>
-              <w:pStyle w:val="Contenidodelatabla"/>
-              <w:bidi w:val="0"/>
-              <w:spacing w:before="0" w:after="210"/>
-              <w:ind w:hanging="0" w:start="0" w:end="0"/>
-              <w:jc w:val="center"/>
-              <w:rPr>
-                <w:sz w:val="17"/>
-              </w:rPr>
-            </w:pPr>
-            <w:r>
-              <w:rPr>
-                <w:sz w:val="17"/>
-              </w:rPr>
-              <w:t>+ \</w:t>
-            </w:r>
-          </w:p>
-        </w:tc>
-        <w:tc>
-          <w:tcPr>
-            <w:tcW w:w="585" w:type="dxa"/>
-            <w:tcBorders>
-              <w:top w:val="single" w:sz="2" w:space="0" w:color="CBD5E0"/>
-              <w:start w:val="single" w:sz="2" w:space="0" w:color="CBD5E0"/>
-              <w:bottom w:val="single" w:sz="2" w:space="0" w:color="CBD5E0"/>
-              <w:end w:val="single" w:sz="2" w:space="0" w:color="CBD5E0"/>
-            </w:tcBorders>
-            <w:vAlign w:val="center"/>
-          </w:tcPr>
-          <w:p>
-            <w:pPr>
-              <w:pStyle w:val="Contenidodelatabla"/>
-              <w:bidi w:val="0"/>
-              <w:spacing w:before="0" w:after="210"/>
-              <w:ind w:hanging="0" w:start="0" w:end="0"/>
-              <w:jc w:val="center"/>
-              <w:rPr>
-                <w:sz w:val="17"/>
-              </w:rPr>
-            </w:pPr>
-            <w:r>
-              <w:rPr>
-                <w:sz w:val="17"/>
-              </w:rPr>
-              <w:t>D_3\</w:t>
-            </w:r>
-          </w:p>
-        </w:tc>
-        <w:tc>
-          <w:tcPr>
-            <w:tcW w:w="951" w:type="dxa"/>
-            <w:tcBorders>
-              <w:top w:val="single" w:sz="2" w:space="0" w:color="CBD5E0"/>
-              <w:start w:val="single" w:sz="2" w:space="0" w:color="CBD5E0"/>
-              <w:bottom w:val="single" w:sz="2" w:space="0" w:color="CBD5E0"/>
-              <w:end w:val="single" w:sz="2" w:space="0" w:color="CBD5E0"/>
-            </w:tcBorders>
-            <w:vAlign w:val="center"/>
-          </w:tcPr>
-          <w:p>
-            <w:pPr>
-              <w:pStyle w:val="Contenidodelatabla"/>
-              <w:bidi w:val="0"/>
-              <w:spacing w:before="0" w:after="210"/>
-              <w:ind w:hanging="0" w:start="0" w:end="0"/>
-              <w:rPr>
-                <w:sz w:val="4"/>
-                <w:szCs w:val="4"/>
-              </w:rPr>
-            </w:pPr>
-            <w:r>
-              <w:rPr>
-                <w:sz w:val="4"/>
-                <w:szCs w:val="4"/>
-              </w:rPr>
-            </w:r>
-          </w:p>
-        </w:tc>
-        <w:tc>
-          <w:tcPr>
-            <w:tcW w:w="585" w:type="dxa"/>
-            <w:tcBorders>
-              <w:top w:val="single" w:sz="2" w:space="0" w:color="CBD5E0"/>
-              <w:start w:val="single" w:sz="2" w:space="0" w:color="CBD5E0"/>
-              <w:bottom w:val="single" w:sz="2" w:space="0" w:color="CBD5E0"/>
-              <w:end w:val="single" w:sz="2" w:space="0" w:color="CBD5E0"/>
-            </w:tcBorders>
-            <w:vAlign w:val="center"/>
-          </w:tcPr>
-          <w:p>
-            <w:pPr>
-              <w:pStyle w:val="Contenidodelatabla"/>
-              <w:bidi w:val="0"/>
-              <w:spacing w:before="0" w:after="210"/>
-              <w:ind w:hanging="0" w:start="0" w:end="0"/>
-              <w:jc w:val="center"/>
-              <w:rPr>
-                <w:sz w:val="17"/>
-              </w:rPr>
-            </w:pPr>
-            <w:r>
-              <w:rPr>
-                <w:sz w:val="17"/>
-              </w:rPr>
-              <w:t>[0.00, +2.00]</w:t>
-            </w:r>
-          </w:p>
-        </w:tc>
-        <w:tc>
-          <w:tcPr>
-            <w:tcW w:w="1342" w:type="dxa"/>
+            <w:tcW w:w="1774" w:type="dxa"/>
             <w:tcBorders>
               <w:top w:val="single" w:sz="2" w:space="0" w:color="CBD5E0"/>
               <w:start w:val="single" w:sz="2" w:space="0" w:color="CBD5E0"/>
@@ -13935,7 +12615,7 @@
         </w:tc>
         <w:tc>
           <w:tcPr>
-            <w:tcW w:w="1759" w:type="dxa"/>
+            <w:tcW w:w="1774" w:type="dxa"/>
             <w:tcBorders>
               <w:top w:val="single" w:sz="2" w:space="0" w:color="CBD5E0"/>
               <w:start w:val="single" w:sz="2" w:space="0" w:color="CBD5E0"/>
@@ -13960,38 +12640,6 @@
                 <w:sz w:val="17"/>
               </w:rPr>
               <w:t>Saldo de respuesta: satisfacción vs. frustración del deseo ajeno.</w:t>
-            </w:r>
-          </w:p>
-        </w:tc>
-        <w:tc>
-          <w:tcPr>
-            <w:tcW w:w="3463" w:type="dxa"/>
-            <w:gridSpan w:val="4"/>
-            <w:tcBorders>
-              <w:start w:val="single" w:sz="2" w:space="0" w:color="808080"/>
-              <w:bottom w:val="single" w:sz="2" w:space="0" w:color="808080"/>
-              <w:end w:val="single" w:sz="6" w:space="0" w:color="808080"/>
-            </w:tcBorders>
-            <w:tcMar>
-              <w:start w:w="90" w:type="dxa"/>
-              <w:end w:w="90" w:type="dxa"/>
-            </w:tcMar>
-          </w:tcPr>
-          <w:p>
-            <w:pPr>
-              <w:pStyle w:val="Contenidodelatabla"/>
-              <w:bidi w:val="0"/>
-              <w:spacing w:before="0" w:after="210"/>
-              <w:rPr>
-                <w:sz w:val="4"/>
-                <w:szCs w:val="4"/>
-              </w:rPr>
-            </w:pPr>
-            <w:r>
-              <w:rPr>
-                <w:sz w:val="4"/>
-                <w:szCs w:val="4"/>
-              </w:rPr>
             </w:r>
           </w:p>
         </w:tc>
@@ -14111,15 +12759,53 @@
               <w:spacing w:before="0" w:after="210"/>
               <w:ind w:hanging="0" w:start="0" w:end="0"/>
               <w:jc w:val="center"/>
-              <w:rPr>
-                <w:sz w:val="17"/>
-              </w:rPr>
+              <w:rPr/>
             </w:pPr>
             <w:r>
               <w:rPr>
                 <w:sz w:val="17"/>
               </w:rPr>
-              <w:t>\</w:t>
+              <w:t xml:space="preserve">| </w:t>
+            </w:r>
+            <w:r>
+              <w:rPr>
+                <w:rStyle w:val="Emphasis"/>
+                <w:sz w:val="17"/>
+              </w:rPr>
+              <w:t>D</w:t>
+            </w:r>
+            <w:r>
+              <w:rPr>
+                <w:position w:val="-1"/>
+                <w:sz w:val="17"/>
+              </w:rPr>
+              <w:t>2</w:t>
+            </w:r>
+            <w:r>
+              <w:rPr>
+                <w:sz w:val="17"/>
+              </w:rPr>
+              <w:t xml:space="preserve"> | + | </w:t>
+            </w:r>
+            <w:r>
+              <w:rPr>
+                <w:rStyle w:val="Emphasis"/>
+                <w:sz w:val="17"/>
+              </w:rPr>
+              <w:t>D</w:t>
+            </w:r>
+            <w:r>
+              <w:rPr>
+                <w:position w:val="-1"/>
+                <w:sz w:val="17"/>
+              </w:rPr>
+              <w:t>4</w:t>
+            </w:r>
+            <w:r>
+              <w:rPr>
+                <w:sz w:val="17"/>
+              </w:rPr>
+              <w:t xml:space="preserve"> |</w:t>
             </w:r>
           </w:p>
         </w:tc>
@@ -14149,133 +12835,13 @@
               <w:rPr>
                 <w:sz w:val="17"/>
               </w:rPr>
-              <w:t>D_2\</w:t>
+              <w:t>[0.00, +2.00]</w:t>
             </w:r>
           </w:p>
         </w:tc>
         <w:tc>
           <w:tcPr>
-            <w:tcW w:w="1759" w:type="dxa"/>
-            <w:tcBorders>
-              <w:top w:val="single" w:sz="2" w:space="0" w:color="CBD5E0"/>
-              <w:start w:val="single" w:sz="2" w:space="0" w:color="CBD5E0"/>
-              <w:bottom w:val="single" w:sz="2" w:space="0" w:color="CBD5E0"/>
-              <w:end w:val="single" w:sz="2" w:space="0" w:color="CBD5E0"/>
-            </w:tcBorders>
-            <w:vAlign w:val="center"/>
-          </w:tcPr>
-          <w:p>
-            <w:pPr>
-              <w:pStyle w:val="Contenidodelatabla"/>
-              <w:bidi w:val="0"/>
-              <w:spacing w:before="0" w:after="210"/>
-              <w:ind w:hanging="0" w:start="0" w:end="0"/>
-              <w:jc w:val="center"/>
-              <w:rPr>
-                <w:sz w:val="17"/>
-              </w:rPr>
-            </w:pPr>
-            <w:r>
-              <w:rPr>
-                <w:sz w:val="17"/>
-              </w:rPr>
-              <w:t>+ \</w:t>
-            </w:r>
-          </w:p>
-        </w:tc>
-        <w:tc>
-          <w:tcPr>
-            <w:tcW w:w="585" w:type="dxa"/>
-            <w:tcBorders>
-              <w:top w:val="single" w:sz="2" w:space="0" w:color="CBD5E0"/>
-              <w:start w:val="single" w:sz="2" w:space="0" w:color="CBD5E0"/>
-              <w:bottom w:val="single" w:sz="2" w:space="0" w:color="CBD5E0"/>
-              <w:end w:val="single" w:sz="2" w:space="0" w:color="CBD5E0"/>
-            </w:tcBorders>
-            <w:vAlign w:val="center"/>
-          </w:tcPr>
-          <w:p>
-            <w:pPr>
-              <w:pStyle w:val="Contenidodelatabla"/>
-              <w:bidi w:val="0"/>
-              <w:spacing w:before="0" w:after="210"/>
-              <w:ind w:hanging="0" w:start="0" w:end="0"/>
-              <w:jc w:val="center"/>
-              <w:rPr>
-                <w:sz w:val="17"/>
-              </w:rPr>
-            </w:pPr>
-            <w:r>
-              <w:rPr>
-                <w:sz w:val="17"/>
-              </w:rPr>
-              <w:t>D_4\</w:t>
-            </w:r>
-          </w:p>
-        </w:tc>
-        <w:tc>
-          <w:tcPr>
-            <w:tcW w:w="951" w:type="dxa"/>
-            <w:tcBorders>
-              <w:top w:val="single" w:sz="2" w:space="0" w:color="CBD5E0"/>
-              <w:start w:val="single" w:sz="2" w:space="0" w:color="CBD5E0"/>
-              <w:bottom w:val="single" w:sz="2" w:space="0" w:color="CBD5E0"/>
-              <w:end w:val="single" w:sz="2" w:space="0" w:color="CBD5E0"/>
-            </w:tcBorders>
-            <w:vAlign w:val="center"/>
-          </w:tcPr>
-          <w:p>
-            <w:pPr>
-              <w:pStyle w:val="Contenidodelatabla"/>
-              <w:bidi w:val="0"/>
-              <w:spacing w:before="0" w:after="210"/>
-              <w:ind w:hanging="0" w:start="0" w:end="0"/>
-              <w:rPr>
-                <w:sz w:val="4"/>
-                <w:szCs w:val="4"/>
-              </w:rPr>
-            </w:pPr>
-            <w:r>
-              <w:rPr>
-                <w:sz w:val="4"/>
-                <w:szCs w:val="4"/>
-              </w:rPr>
-            </w:r>
-          </w:p>
-        </w:tc>
-        <w:tc>
-          <w:tcPr>
-            <w:tcW w:w="585" w:type="dxa"/>
-            <w:tcBorders>
-              <w:top w:val="single" w:sz="2" w:space="0" w:color="CBD5E0"/>
-              <w:start w:val="single" w:sz="2" w:space="0" w:color="CBD5E0"/>
-              <w:bottom w:val="single" w:sz="2" w:space="0" w:color="CBD5E0"/>
-              <w:end w:val="single" w:sz="2" w:space="0" w:color="CBD5E0"/>
-            </w:tcBorders>
-            <w:vAlign w:val="center"/>
-          </w:tcPr>
-          <w:p>
-            <w:pPr>
-              <w:pStyle w:val="Contenidodelatabla"/>
-              <w:bidi w:val="0"/>
-              <w:spacing w:before="0" w:after="210"/>
-              <w:ind w:hanging="0" w:start="0" w:end="0"/>
-              <w:jc w:val="center"/>
-              <w:rPr>
-                <w:sz w:val="17"/>
-              </w:rPr>
-            </w:pPr>
-            <w:r>
-              <w:rPr>
-                <w:sz w:val="17"/>
-              </w:rPr>
-              <w:t>[0.00, +2.00]</w:t>
-            </w:r>
-          </w:p>
-        </w:tc>
-        <w:tc>
-          <w:tcPr>
-            <w:tcW w:w="1342" w:type="dxa"/>
+            <w:tcW w:w="1774" w:type="dxa"/>
             <w:tcBorders>
               <w:top w:val="single" w:sz="2" w:space="0" w:color="CBD5E0"/>
               <w:start w:val="single" w:sz="2" w:space="0" w:color="CBD5E0"/>
@@ -14490,7 +13056,7 @@
         </w:tc>
         <w:tc>
           <w:tcPr>
-            <w:tcW w:w="1759" w:type="dxa"/>
+            <w:tcW w:w="1774" w:type="dxa"/>
             <w:tcBorders>
               <w:top w:val="single" w:sz="2" w:space="0" w:color="CBD5E0"/>
               <w:start w:val="single" w:sz="2" w:space="0" w:color="CBD5E0"/>
@@ -14515,38 +13081,6 @@
                 <w:sz w:val="17"/>
               </w:rPr>
               <w:t>Saldo de Densidad Relativa total: barómetro homeostático del clima vincular.</w:t>
-            </w:r>
-          </w:p>
-        </w:tc>
-        <w:tc>
-          <w:tcPr>
-            <w:tcW w:w="3463" w:type="dxa"/>
-            <w:gridSpan w:val="4"/>
-            <w:tcBorders>
-              <w:start w:val="single" w:sz="2" w:space="0" w:color="808080"/>
-              <w:bottom w:val="single" w:sz="2" w:space="0" w:color="808080"/>
-              <w:end w:val="single" w:sz="6" w:space="0" w:color="808080"/>
-            </w:tcBorders>
-            <w:tcMar>
-              <w:start w:w="90" w:type="dxa"/>
-              <w:end w:w="90" w:type="dxa"/>
-            </w:tcMar>
-          </w:tcPr>
-          <w:p>
-            <w:pPr>
-              <w:pStyle w:val="Contenidodelatabla"/>
-              <w:bidi w:val="0"/>
-              <w:spacing w:before="0" w:after="210"/>
-              <w:rPr>
-                <w:sz w:val="4"/>
-                <w:szCs w:val="4"/>
-              </w:rPr>
-            </w:pPr>
-            <w:r>
-              <w:rPr>
-                <w:sz w:val="4"/>
-                <w:szCs w:val="4"/>
-              </w:rPr>
             </w:r>
           </w:p>
         </w:tc>
@@ -14686,7 +13220,28 @@
               <w:rPr>
                 <w:sz w:val="17"/>
               </w:rPr>
-              <w:t xml:space="preserve"> = \sum \</w:t>
+              <w:t xml:space="preserve"> = \sum | </w:t>
+            </w:r>
+            <w:r>
+              <w:rPr>
+                <w:rStyle w:val="Emphasis"/>
+                <w:sz w:val="17"/>
+              </w:rPr>
+              <w:t>D</w:t>
+            </w:r>
+            <w:r>
+              <w:rPr>
+                <w:rStyle w:val="Emphasis"/>
+                <w:position w:val="-1"/>
+                <w:sz w:val="17"/>
+              </w:rPr>
+              <w:t>k</w:t>
+            </w:r>
+            <w:r>
+              <w:rPr>
+                <w:sz w:val="17"/>
+              </w:rPr>
+              <w:t xml:space="preserve"> |</w:t>
             </w:r>
           </w:p>
         </w:tc>
@@ -14716,73 +13271,13 @@
               <w:rPr>
                 <w:sz w:val="17"/>
               </w:rPr>
-              <w:t>D_k\</w:t>
+              <w:t>[0.00, +4.00]</w:t>
             </w:r>
           </w:p>
         </w:tc>
         <w:tc>
           <w:tcPr>
-            <w:tcW w:w="1759" w:type="dxa"/>
-            <w:tcBorders>
-              <w:top w:val="single" w:sz="2" w:space="0" w:color="CBD5E0"/>
-              <w:start w:val="single" w:sz="2" w:space="0" w:color="CBD5E0"/>
-              <w:bottom w:val="single" w:sz="2" w:space="0" w:color="CBD5E0"/>
-              <w:end w:val="single" w:sz="2" w:space="0" w:color="CBD5E0"/>
-            </w:tcBorders>
-            <w:vAlign w:val="center"/>
-          </w:tcPr>
-          <w:p>
-            <w:pPr>
-              <w:pStyle w:val="Contenidodelatabla"/>
-              <w:bidi w:val="0"/>
-              <w:spacing w:before="0" w:after="210"/>
-              <w:ind w:hanging="0" w:start="0" w:end="0"/>
-              <w:rPr>
-                <w:sz w:val="4"/>
-                <w:szCs w:val="4"/>
-              </w:rPr>
-            </w:pPr>
-            <w:r>
-              <w:rPr>
-                <w:sz w:val="4"/>
-                <w:szCs w:val="4"/>
-              </w:rPr>
-            </w:r>
-          </w:p>
-        </w:tc>
-        <w:tc>
-          <w:tcPr>
-            <w:tcW w:w="585" w:type="dxa"/>
-            <w:tcBorders>
-              <w:top w:val="single" w:sz="2" w:space="0" w:color="CBD5E0"/>
-              <w:start w:val="single" w:sz="2" w:space="0" w:color="CBD5E0"/>
-              <w:bottom w:val="single" w:sz="2" w:space="0" w:color="CBD5E0"/>
-              <w:end w:val="single" w:sz="2" w:space="0" w:color="CBD5E0"/>
-            </w:tcBorders>
-            <w:vAlign w:val="center"/>
-          </w:tcPr>
-          <w:p>
-            <w:pPr>
-              <w:pStyle w:val="Contenidodelatabla"/>
-              <w:bidi w:val="0"/>
-              <w:spacing w:before="0" w:after="210"/>
-              <w:ind w:hanging="0" w:start="0" w:end="0"/>
-              <w:jc w:val="center"/>
-              <w:rPr>
-                <w:sz w:val="17"/>
-              </w:rPr>
-            </w:pPr>
-            <w:r>
-              <w:rPr>
-                <w:sz w:val="17"/>
-              </w:rPr>
-              <w:t>[0.00, +4.00]</w:t>
-            </w:r>
-          </w:p>
-        </w:tc>
-        <w:tc>
-          <w:tcPr>
-            <w:tcW w:w="951" w:type="dxa"/>
+            <w:tcW w:w="1774" w:type="dxa"/>
             <w:tcBorders>
               <w:top w:val="single" w:sz="2" w:space="0" w:color="CBD5E0"/>
               <w:start w:val="single" w:sz="2" w:space="0" w:color="CBD5E0"/>
@@ -14806,38 +13301,6 @@
                 <w:sz w:val="17"/>
               </w:rPr>
               <w:t>Densidad Bruta Relacional: capacidad calorífica y masa total del sistema.</w:t>
-            </w:r>
-          </w:p>
-        </w:tc>
-        <w:tc>
-          <w:tcPr>
-            <w:tcW w:w="1927" w:type="dxa"/>
-            <w:gridSpan w:val="2"/>
-            <w:tcBorders>
-              <w:start w:val="single" w:sz="2" w:space="0" w:color="808080"/>
-              <w:bottom w:val="single" w:sz="6" w:space="0" w:color="808080"/>
-              <w:end w:val="single" w:sz="6" w:space="0" w:color="808080"/>
-            </w:tcBorders>
-            <w:tcMar>
-              <w:start w:w="90" w:type="dxa"/>
-              <w:end w:w="90" w:type="dxa"/>
-            </w:tcMar>
-          </w:tcPr>
-          <w:p>
-            <w:pPr>
-              <w:pStyle w:val="Contenidodelatabla"/>
-              <w:bidi w:val="0"/>
-              <w:spacing w:before="0" w:after="210"/>
-              <w:rPr>
-                <w:sz w:val="4"/>
-                <w:szCs w:val="4"/>
-              </w:rPr>
-            </w:pPr>
-            <w:r>
-              <w:rPr>
-                <w:sz w:val="4"/>
-                <w:szCs w:val="4"/>
-              </w:rPr>
             </w:r>
           </w:p>
         </w:tc>
@@ -15111,7 +13574,7 @@
         <w:rPr>
           <w:shd w:fill="FFFFFF" w:val="clear"/>
         </w:rPr>
-        <w:t xml:space="preserve"> (I_{\text{desgaste}} = BDR - SDR), cuantificando la energía disipada en rumiación y fricción estéril antes de que afloren fracturas abiertas en el grupo.</w:t>
+        <w:t xml:space="preserve"> (I_{\text{desgaste}} = BDR - SDR), cuantificando la energía disipada en fricción y discrepancia estructural antes de que afloren fracturas abiertas en el grupo.</w:t>
       </w:r>
     </w:p>
     <w:p>
@@ -15226,7 +13689,7 @@
         <w:rPr>
           <w:shd w:fill="FFFFFF" w:val="clear"/>
         </w:rPr>
-        <w:t>El escenario se modela como un acuario tridimensional continuo definido sobre el volumen cartesiano \mathbf{DA} × \mathbf{RECIBE} × \mathbf{DENSIDAD}, estructurado analíticamente en tres zonas y estratos característicos:</w:t>
+        <w:t>El escenario se modela como un espacio tridimensional continuo definido sobre el volumen cartesiano \mathbf{DA} × \mathbf{RECIBE} × \mathbf{DENSIDAD}, estructurado analíticamente en tres zonas y estratos característicos:</w:t>
       </w:r>
     </w:p>
     <w:p>
@@ -15250,13 +13713,13 @@
           <w:rStyle w:val="Strong"/>
           <w:shd w:fill="FFFFFF" w:val="clear"/>
         </w:rPr>
-        <w:t>Fondo sumergido:</w:t>
-      </w:r>
-      <w:r>
-        <w:rPr>
-          <w:shd w:fill="FFFFFF" w:val="clear"/>
-        </w:rPr>
-        <w:t xml:space="preserve"> Zona de alta presión negativa, donde se concentran los estados de rechazo mutuo (</w:t>
+        <w:t>Estrato inferior:</w:t>
+      </w:r>
+      <w:r>
+        <w:rPr>
+          <w:shd w:fill="FFFFFF" w:val="clear"/>
+        </w:rPr>
+        <w:t xml:space="preserve"> Concentración de tensiones latentes, rechazo mutuo (</w:t>
       </w:r>
       <w:r>
         <w:rPr>
@@ -15269,7 +13732,7 @@
         <w:rPr>
           <w:shd w:fill="FFFFFF" w:val="clear"/>
         </w:rPr>
-        <w:t xml:space="preserve">), conflicto latente y aislamiento estructural. </w:t>
+        <w:t xml:space="preserve">) y desconexión vincular. </w:t>
       </w:r>
     </w:p>
     <w:p>
@@ -15293,13 +13756,13 @@
           <w:rStyle w:val="Strong"/>
           <w:shd w:fill="FFFFFF" w:val="clear"/>
         </w:rPr>
-        <w:t>Superficie del agua:</w:t>
-      </w:r>
-      <w:r>
-        <w:rPr>
-          <w:shd w:fill="FFFFFF" w:val="clear"/>
-        </w:rPr>
-        <w:t xml:space="preserve"> Lámina homeostática de flotabilidad basal correspondiente al centroide de indiferencia (</w:t>
+        <w:t>Plano medio / neutro:</w:t>
+      </w:r>
+      <w:r>
+        <w:rPr>
+          <w:shd w:fill="FFFFFF" w:val="clear"/>
+        </w:rPr>
+        <w:t xml:space="preserve"> Nivel basal de flotabilidad social correspondiente al umbral de indiferencia (</w:t>
       </w:r>
       <w:r>
         <w:rPr>
@@ -15312,7 +13775,7 @@
         <w:rPr>
           <w:shd w:fill="FFFFFF" w:val="clear"/>
         </w:rPr>
-        <w:t xml:space="preserve">) y equilibrio disyuntivo. </w:t>
+        <w:t xml:space="preserve">). </w:t>
       </w:r>
     </w:p>
     <w:p>
@@ -15335,13 +13798,13 @@
           <w:rStyle w:val="Strong"/>
           <w:shd w:fill="FFFFFF" w:val="clear"/>
         </w:rPr>
-        <w:t>Cielo abierto:</w:t>
-      </w:r>
-      <w:r>
-        <w:rPr>
-          <w:shd w:fill="FFFFFF" w:val="clear"/>
-        </w:rPr>
-        <w:t xml:space="preserve"> Estrato superior de alta densidad positiva y cohesión óptima, donde gravitan las figuras de resonancia armónica (</w:t>
+        <w:t>Estrato superior:</w:t>
+      </w:r>
+      <w:r>
+        <w:rPr>
+          <w:shd w:fill="FFFFFF" w:val="clear"/>
+        </w:rPr>
+        <w:t xml:space="preserve"> Región de alta densidad positiva, cohesión armónica (</w:t>
       </w:r>
       <w:r>
         <w:rPr>
@@ -15354,7 +13817,7 @@
         <w:rPr>
           <w:shd w:fill="FFFFFF" w:val="clear"/>
         </w:rPr>
-        <w:t xml:space="preserve">) y liderazgo integrador libre de fricción. </w:t>
+        <w:t xml:space="preserve">) y liderazgo integrador con baja fricción. </w:t>
       </w:r>
     </w:p>
     <w:p>
@@ -15541,7 +14004,7 @@
         <w:rPr>
           <w:shd w:fill="FFFFFF" w:val="clear"/>
         </w:rPr>
-        <w:t>La «lupa matemática» de la Sociometría Ordinal de NEXORD ha avanzado, mediante sus animaciones VISORD, en la creación de visualizaciones interactivas que facilitan una mejor comprensión de los fenómenos de interacción grupal. Como ha demostrado fehacientemente la investigación cosmológica, la progresiva matematización ha conseguido hacer ver y oír lo que resulta imperceptible a nuestros sentidos biológicos. Y esa lupa ha sido posible gracias al avance realizado en la cuantificación más precisa de los órdenes de preferencia.</w:t>
+        <w:t>La formalización matemática de la Sociometría Ordinal de NEXORD ha avanzado, mediante las herramientas del entorno VISORD, en el desarrollo de representaciones visuales e interactivas que facilitan una comprensión rigurosa de los fenómenos de interacción grupal. Como demuestra el desarrollo científico contemporáneo, la parametrización matemática permite hacer perceptibles dinámicas que escapan a la observación intuitiva directa. Este avance ha sido posible gracias a la cuantificación del orden de preferencia mediante la función inversa al rango.</w:t>
       </w:r>
     </w:p>
     <w:p>
@@ -17767,7 +16230,7 @@
         <w:rPr>
           <w:shd w:fill="FFFFFF" w:val="clear"/>
         </w:rPr>
-        <w:t>Las obras maestras de la literatura universal y del cine están repletas, directa o indirectamente, de situaciones grupales con descripciones vívidas, realizadas por observadores perspicaces, de los entresijos de las relaciones humanas. El análisis de estas interacciones desde la perspectiva sociométrica constituye una alternativa «no reactiva» valiosa de acceso al estudio de estructuras grupales complejas. NEXORD ha procesado obras maestras de la dramaturgia y la literatura (</w:t>
+        <w:t xml:space="preserve">El análisis de textos dramáticos y literarios consolidados constituye una fuente no reactiva de primer orden para la modelización psicosocial. Al transponer los guiones y obras a sociomatrices objetivas (p. ej., </w:t>
       </w:r>
       <w:r>
         <w:rPr>
@@ -17806,7 +16269,7 @@
         <w:rPr>
           <w:shd w:fill="FFFFFF" w:val="clear"/>
         </w:rPr>
-        <w:t xml:space="preserve"> de William Golding), demostrando que las leyes socio-termodinámicas identifican con precisión matemática los nudos dramáticos, las transiciones de fase y los colapsos de liderazgo sin recurrir a datos inferidos por observación.</w:t>
+        <w:t xml:space="preserve"> de William Golding), NEXORD analiza dinámicas grupales complejas, puntos de inflexión y crisis de liderazgo en sistemas cerrados sin introducir sesgos de reactividad del observador ni recurrir a datos inferidos por observación.</w:t>
       </w:r>
     </w:p>
     <w:p>
@@ -17937,7 +16400,7 @@
         <w:rPr>
           <w:shd w:fill="FFFFFF" w:val="clear"/>
         </w:rPr>
-        <w:t xml:space="preserve">Estas métricas cuantifican la precisión de lectura de campo o lucidez sistémica (Tsankova &amp; Tair, 2021) mediante la distancia euclídea entre la expectativa emitida y la realidad colectiva observada: Δ_α = \|α </w:t>
+        <w:t xml:space="preserve">Estas métricas cuantifican la precisión de lectura de campo o lucidez sistémica (Tsankova &amp; Tair, 2021) mediante la distancia euclídea entre la expectativa emitida y la realidad colectiva observada: Δ_α = ||α </w:t>
       </w:r>
       <w:r>
         <w:rPr>
@@ -17950,7 +16413,7 @@
         <w:rPr>
           <w:shd w:fill="FFFFFF" w:val="clear"/>
         </w:rPr>
-        <w:t xml:space="preserve"> - \text{Elección Real}(α)\| y Δ_ω = \|ω </w:t>
+        <w:t xml:space="preserve"> - \text{Elección Real}(α)|| y Δ_ω = ||ω </w:t>
       </w:r>
       <w:r>
         <w:rPr>
@@ -17963,7 +16426,7 @@
         <w:rPr>
           <w:shd w:fill="FFFFFF" w:val="clear"/>
         </w:rPr>
-        <w:t xml:space="preserve"> - \text{Elección Real}(ω)\|.</w:t>
+        <w:t xml:space="preserve"> - \text{Elección Real}(ω)||.</w:t>
       </w:r>
     </w:p>
     <w:p>
@@ -18356,7 +16819,7 @@
         <w:rPr>
           <w:shd w:fill="FFFFFF" w:val="clear"/>
         </w:rPr>
-        <w:t xml:space="preserve"> Redes relacionales extraídas de textos dramáticos, guiones cinematográficos u obras literarias maestras (</w:t>
+        <w:t xml:space="preserve"> Redes relacionales extraídas de textos dramáticos, guiones cinematográficos u obras literarias de referencia (</w:t>
       </w:r>
       <w:r>
         <w:rPr>
@@ -18705,7 +17168,7 @@
           <w:sz w:val="20"/>
           <w:shd w:fill="FFFFFF" w:val="clear"/>
         </w:rPr>
-        <w:t>1. El sustrato cognitivo-emocional: de Sherif y Festinger al mapa ordinal</w:t>
+        <w:t>Sustrato cognitivo-emocional e intergrupal</w:t>
       </w:r>
     </w:p>
     <w:p>
@@ -18920,7 +17383,7 @@
         <w:rPr>
           <w:shd w:fill="FFFFFF" w:val="clear"/>
         </w:rPr>
-        <w:t>: sabemos con claridad meridiana a quién colocamos en primer lugar como aliado natural, a quién situamos en la periferia de nuestra confianza y hacia quién dirigimos el rechazo.</w:t>
+        <w:t>: sabemos con precisión a quién colocamos en primer lugar como aliado natural, a quién situamos en la periferia de nuestra confianza y hacia quién dirigimos el rechazo.</w:t>
       </w:r>
     </w:p>
     <w:p>
@@ -18945,7 +17408,7 @@
           <w:sz w:val="20"/>
           <w:shd w:fill="FFFFFF" w:val="clear"/>
         </w:rPr>
-        <w:t>2. La termodinámica social como herramienta analítica</w:t>
+        <w:t>Modelado termodinámico del colectivo</w:t>
       </w:r>
     </w:p>
     <w:p>
@@ -19192,7 +17655,7 @@
           <w:sz w:val="20"/>
           <w:shd w:fill="FFFFFF" w:val="clear"/>
         </w:rPr>
-        <w:t>3. Un horizonte abierto para las nuevas generaciones</w:t>
+        <w:t>Perspectivas en sistemas complejos</w:t>
       </w:r>
     </w:p>
     <w:p>
@@ -19573,22 +18036,7 @@
         <w:rPr>
           <w:shd w:fill="FFFFFF" w:val="clear"/>
         </w:rPr>
-        <w:t>7.4. Riesgo de doble uso y declaración del creador</w:t>
-      </w:r>
-    </w:p>
-    <w:p>
-      <w:pPr>
-        <w:pStyle w:val="BodyText"/>
-        <w:bidi w:val="0"/>
-        <w:rPr>
-          <w:shd w:fill="FFFFFF" w:val="clear"/>
-        </w:rPr>
-      </w:pPr>
-      <w:r>
-        <w:rPr>
-          <w:shd w:fill="FFFFFF" w:val="clear"/>
-        </w:rPr>
-        <w:t>La potencia diagnóstica que NEXORD ha podido desarrollar a través de sus múltiples algoritmos la convierte en un potencial «arma social» si su utilización cayera en manos desaprensivas e irresponsables. La información sociométrica es de alta sensibilidad social y susceptible de provocar daños personales y colectivos de gran magnitud sin una clara y expresa exigencia de supervisión académica institucional.</w:t>
+        <w:t>7.4. Gestión del riesgo de doble uso y acreditación ética</w:t>
       </w:r>
     </w:p>
     <w:p>
@@ -19601,20 +18049,7 @@
         <w:rPr>
           <w:shd w:fill="FFFFFF" w:val="clear"/>
         </w:rPr>
-        <w:t xml:space="preserve">Como creador de NEXORD y partidario convencido de la </w:t>
-      </w:r>
-      <w:r>
-        <w:rPr>
-          <w:rStyle w:val="Emphasis"/>
-          <w:shd w:fill="FFFFFF" w:val="clear"/>
-        </w:rPr>
-        <w:t>Open Science</w:t>
-      </w:r>
-      <w:r>
-        <w:rPr>
-          <w:shd w:fill="FFFFFF" w:val="clear"/>
-        </w:rPr>
-        <w:t>, considero esencial el objetivo de total transparencia y difusión del conocimiento. Sin embargo, los graves riesgos que conllevaría una mala praxis sociométrica me impiden destinar la libre distribución de este software de investigación al público general, reservándolo para su utilización en instituciones científicas universitarias solventes. Por esa misma razón, NEXORD ha implementado rigurosos controles de seguridad por diseño (</w:t>
+        <w:t>La información sociométrica refleja dinámicas interpersonales de alta sensibilidad y no debe instrumentalizarse para prácticas de exclusión o clasificación discriminatoria. NEXORD adopta salvaguardas de seguridad por diseño (</w:t>
       </w:r>
       <w:r>
         <w:rPr>
@@ -19627,22 +18062,22 @@
         <w:rPr>
           <w:shd w:fill="FFFFFF" w:val="clear"/>
         </w:rPr>
-        <w:t>) que impedirán su funcionamiento si no se cumplen las condiciones de acreditación profesional e institucional de los Investigadores Principales (IP), así como su aceptación expresa del compromiso de hacer un uso ético y positivo, favorecedor del bienestar y la salud personal y grupal, cuando se trate de estudios reales de campo con seres humanos.</w:t>
-      </w:r>
-    </w:p>
-    <w:p>
-      <w:pPr>
-        <w:pStyle w:val="BodyText"/>
-        <w:bidi w:val="0"/>
-        <w:rPr>
-          <w:shd w:fill="FFFFFF" w:val="clear"/>
-        </w:rPr>
-      </w:pPr>
-      <w:r>
-        <w:rPr>
-          <w:shd w:fill="FFFFFF" w:val="clear"/>
-        </w:rPr>
-        <w:t>Conviene precisar el alcance de esta declaración. El presente Manifiesto es un documento puramente programático —la exposición de las características teóricas, metodológicas y pragmáticas del proyecto—: ni él, ni la Plataforma informática, ni sus algoritmos son objeto de la protección de la propiedad intelectual; el Manifiesto se difunde abiertamente bajo licencia CC BY 4.0, y el control que aquí se defiende no es un control del conocimiento, sino del acceso operativo al instrumento.</w:t>
+        <w:t>): aunque la formulación metodológica y teórica es de acceso abierto bajo licencia CC BY 4.0, el acceso operativo a la suite de investigación sobre participantes humanos requiere acreditación institucional y el compromiso formal de los investigadores de aplicar los datos con fines formativos, preventivos y no punitivos.</w:t>
+      </w:r>
+    </w:p>
+    <w:p>
+      <w:pPr>
+        <w:pStyle w:val="BodyText"/>
+        <w:bidi w:val="0"/>
+        <w:rPr>
+          <w:shd w:fill="FFFFFF" w:val="clear"/>
+        </w:rPr>
+      </w:pPr>
+      <w:r>
+        <w:rPr>
+          <w:shd w:fill="FFFFFF" w:val="clear"/>
+        </w:rPr>
+        <w:t>Conviene precisar el alcance de esta declaración. El presente Manifiesto es un documento puramente programático —la exposición de las características teóricas, metodológicas y pragmáticas del proyecto—: ni él, ni la suite computacional, ni sus algoritmos son objeto de patentes restrictivas; el Manifiesto se difunde abiertamente bajo licencia CC BY 4.0, y las salvaguardas éticas buscan regular el acceso operativo al instrumento sobre colectivos reales, no restringir la difusión del conocimiento científico.</w:t>
       </w:r>
     </w:p>
     <w:p>
@@ -19942,7 +18377,7 @@
     </w:p>
     <w:tbl>
       <w:tblPr>
-        <w:tblW w:w="8911" w:type="dxa"/>
+        <w:tblW w:w="5326" w:type="dxa"/>
         <w:jc w:val="start"/>
         <w:tblInd w:w="709" w:type="dxa"/>
         <w:shd w:fill="F8FAFC" w:val="clear"/>
@@ -19955,13 +18390,13 @@
         </w:tblCellMar>
       </w:tblPr>
       <w:tblGrid>
-        <w:gridCol w:w="8911"/>
+        <w:gridCol w:w="5326"/>
       </w:tblGrid>
       <w:tr>
         <w:trPr/>
         <w:tc>
           <w:tcPr>
-            <w:tcW w:w="8911" w:type="dxa"/>
+            <w:tcW w:w="5326" w:type="dxa"/>
             <w:tcBorders/>
             <w:shd w:fill="F8FAFC" w:val="clear"/>
             <w:vAlign w:val="center"/>
@@ -20295,7 +18730,7 @@
     </w:p>
     <w:tbl>
       <w:tblPr>
-        <w:tblW w:w="8774" w:type="dxa"/>
+        <w:tblW w:w="5326" w:type="dxa"/>
         <w:jc w:val="start"/>
         <w:tblInd w:w="709" w:type="dxa"/>
         <w:shd w:fill="F8FAFC" w:val="clear"/>
@@ -20308,13 +18743,13 @@
         </w:tblCellMar>
       </w:tblPr>
       <w:tblGrid>
-        <w:gridCol w:w="8774"/>
+        <w:gridCol w:w="5326"/>
       </w:tblGrid>
       <w:tr>
         <w:trPr/>
         <w:tc>
           <w:tcPr>
-            <w:tcW w:w="8774" w:type="dxa"/>
+            <w:tcW w:w="5326" w:type="dxa"/>
             <w:tcBorders/>
             <w:shd w:fill="F8FAFC" w:val="clear"/>
             <w:vAlign w:val="center"/>
@@ -23947,8 +22382,8 @@
   <w:abstractNum w:abstractNumId="13">
     <w:lvl w:ilvl="0">
       <w:start w:val="1"/>
-      <w:numFmt w:val="decimal"/>
-      <w:lvlText w:val="%1."/>
+      <w:numFmt w:val="bullet"/>
+      <w:lvlText w:val=""/>
       <w:lvlJc w:val="start"/>
       <w:pPr>
         <w:tabs>
@@ -23956,12 +22391,14 @@
         </w:tabs>
         <w:ind w:start="709" w:hanging="283"/>
       </w:pPr>
-      <w:rPr/>
+      <w:rPr>
+        <w:rFonts w:ascii="Symbol" w:hAnsi="Symbol" w:cs="Symbol" w:hint="default"/>
+      </w:rPr>
     </w:lvl>
     <w:lvl w:ilvl="1">
       <w:start w:val="1"/>
-      <w:numFmt w:val="decimal"/>
-      <w:lvlText w:val="%2."/>
+      <w:numFmt w:val="bullet"/>
+      <w:lvlText w:val=""/>
       <w:lvlJc w:val="start"/>
       <w:pPr>
         <w:tabs>
@@ -23969,12 +22406,14 @@
         </w:tabs>
         <w:ind w:start="1418" w:hanging="283"/>
       </w:pPr>
-      <w:rPr/>
+      <w:rPr>
+        <w:rFonts w:ascii="Symbol" w:hAnsi="Symbol" w:cs="Symbol" w:hint="default"/>
+      </w:rPr>
     </w:lvl>
     <w:lvl w:ilvl="2">
       <w:start w:val="1"/>
-      <w:numFmt w:val="decimal"/>
-      <w:lvlText w:val="%3."/>
+      <w:numFmt w:val="bullet"/>
+      <w:lvlText w:val=""/>
       <w:lvlJc w:val="start"/>
       <w:pPr>
         <w:tabs>
@@ -23982,12 +22421,14 @@
         </w:tabs>
         <w:ind w:start="2127" w:hanging="283"/>
       </w:pPr>
-      <w:rPr/>
+      <w:rPr>
+        <w:rFonts w:ascii="Symbol" w:hAnsi="Symbol" w:cs="Symbol" w:hint="default"/>
+      </w:rPr>
     </w:lvl>
     <w:lvl w:ilvl="3">
       <w:start w:val="1"/>
-      <w:numFmt w:val="decimal"/>
-      <w:lvlText w:val="%4."/>
+      <w:numFmt w:val="bullet"/>
+      <w:lvlText w:val=""/>
       <w:lvlJc w:val="start"/>
       <w:pPr>
         <w:tabs>
@@ -23995,12 +22436,14 @@
         </w:tabs>
         <w:ind w:start="2836" w:hanging="283"/>
       </w:pPr>
-      <w:rPr/>
+      <w:rPr>
+        <w:rFonts w:ascii="Symbol" w:hAnsi="Symbol" w:cs="Symbol" w:hint="default"/>
+      </w:rPr>
     </w:lvl>
     <w:lvl w:ilvl="4">
       <w:start w:val="1"/>
-      <w:numFmt w:val="decimal"/>
-      <w:lvlText w:val="%5."/>
+      <w:numFmt w:val="bullet"/>
+      <w:lvlText w:val=""/>
       <w:lvlJc w:val="start"/>
       <w:pPr>
         <w:tabs>
@@ -24008,12 +22451,14 @@
         </w:tabs>
         <w:ind w:start="3545" w:hanging="283"/>
       </w:pPr>
-      <w:rPr/>
+      <w:rPr>
+        <w:rFonts w:ascii="Symbol" w:hAnsi="Symbol" w:cs="Symbol" w:hint="default"/>
+      </w:rPr>
     </w:lvl>
     <w:lvl w:ilvl="5">
       <w:start w:val="1"/>
-      <w:numFmt w:val="decimal"/>
-      <w:lvlText w:val="%6."/>
+      <w:numFmt w:val="bullet"/>
+      <w:lvlText w:val=""/>
       <w:lvlJc w:val="start"/>
       <w:pPr>
         <w:tabs>
@@ -24021,12 +22466,14 @@
         </w:tabs>
         <w:ind w:start="4254" w:hanging="283"/>
       </w:pPr>
-      <w:rPr/>
+      <w:rPr>
+        <w:rFonts w:ascii="Symbol" w:hAnsi="Symbol" w:cs="Symbol" w:hint="default"/>
+      </w:rPr>
     </w:lvl>
     <w:lvl w:ilvl="6">
       <w:start w:val="1"/>
-      <w:numFmt w:val="decimal"/>
-      <w:lvlText w:val="%7."/>
+      <w:numFmt w:val="bullet"/>
+      <w:lvlText w:val=""/>
       <w:lvlJc w:val="start"/>
       <w:pPr>
         <w:tabs>
@@ -24034,12 +22481,14 @@
         </w:tabs>
         <w:ind w:start="4963" w:hanging="283"/>
       </w:pPr>
-      <w:rPr/>
+      <w:rPr>
+        <w:rFonts w:ascii="Symbol" w:hAnsi="Symbol" w:cs="Symbol" w:hint="default"/>
+      </w:rPr>
     </w:lvl>
     <w:lvl w:ilvl="7">
       <w:start w:val="1"/>
-      <w:numFmt w:val="decimal"/>
-      <w:lvlText w:val="%8."/>
+      <w:numFmt w:val="bullet"/>
+      <w:lvlText w:val=""/>
       <w:lvlJc w:val="start"/>
       <w:pPr>
         <w:tabs>
@@ -24047,12 +22496,14 @@
         </w:tabs>
         <w:ind w:start="5672" w:hanging="283"/>
       </w:pPr>
-      <w:rPr/>
+      <w:rPr>
+        <w:rFonts w:ascii="Symbol" w:hAnsi="Symbol" w:cs="Symbol" w:hint="default"/>
+      </w:rPr>
     </w:lvl>
     <w:lvl w:ilvl="8">
       <w:start w:val="1"/>
-      <w:numFmt w:val="decimal"/>
-      <w:lvlText w:val="%9."/>
+      <w:numFmt w:val="bullet"/>
+      <w:lvlText w:val=""/>
       <w:lvlJc w:val="start"/>
       <w:pPr>
         <w:tabs>
@@ -24060,7 +22511,9 @@
         </w:tabs>
         <w:ind w:start="6381" w:hanging="283"/>
       </w:pPr>
-      <w:rPr/>
+      <w:rPr>
+        <w:rFonts w:ascii="Symbol" w:hAnsi="Symbol" w:cs="Symbol" w:hint="default"/>
+      </w:rPr>
     </w:lvl>
   </w:abstractNum>
   <w:abstractNum w:abstractNumId="14">

</xml_diff>

<commit_message>
feat(manifesto): sync updated 18D graphic and chained figures catalog
</commit_message>
<xml_diff>
--- a/assets/MANIFIESTO_CIENTIFICO_NEXORD_ZENODO_2026.docx
+++ b/assets/MANIFIESTO_CIENTIFICO_NEXORD_ZENODO_2026.docx
@@ -9285,7 +9285,7 @@
         </w:rPr>
         <w:drawing>
           <wp:inline distT="0" distB="0" distL="0" distR="0">
-            <wp:extent cx="720090" cy="29718000"/>
+            <wp:extent cx="720090" cy="34004250"/>
             <wp:effectExtent l="0" t="0" r="0" b="0"/>
             <wp:docPr id="3" name="Imagen3" title="Figura 3: Arquitectura del Espacio Relacional 18D y los 3 Prismas Duales"/>
             <wp:cNvGraphicFramePr>
@@ -9309,7 +9309,7 @@
                   <pic:spPr bwMode="auto">
                     <a:xfrm>
                       <a:off x="0" y="0"/>
-                      <a:ext cx="720090" cy="29718000"/>
+                      <a:ext cx="720090" cy="34004250"/>
                     </a:xfrm>
                     <a:prstGeom prst="rect">
                       <a:avLst/>

</xml_diff>